<commit_message>
feat: add false implementation
</commit_message>
<xml_diff>
--- a/Lab8/Звіт до лаби 8 ТМ.docx
+++ b/Lab8/Звіт до лаби 8 ТМ.docx
@@ -2621,17 +2621,16 @@
           <w:lang w:val="uk-UA" w:eastAsia="uk-UA"/>
         </w:rPr>
         <w:br/>
-        <w:t xml:space="preserve">        MouseLeftButtonDown="Window_MouseLeftButtonDown"</w:t>
-      </w:r>
-      <w:r>
-        <w:rPr>
-          <w:rFonts w:ascii="Courier New" w:eastAsia="Times New Roman" w:hAnsi="Courier New" w:cs="Courier New"/>
-          <w:sz w:val="20"/>
-          <w:szCs w:val="20"/>
-          <w:lang w:val="uk-UA" w:eastAsia="uk-UA"/>
-        </w:rPr>
-        <w:br/>
-        <w:t xml:space="preserve">        Loaded="Window_Loaded"&gt;</w:t>
+        <w:t xml:space="preserve">        MouseLeftButtonDown="Window_MouseLeftButtonDown"&gt;</w:t>
+      </w:r>
+      <w:r>
+        <w:rPr>
+          <w:rFonts w:ascii="Courier New" w:eastAsia="Times New Roman" w:hAnsi="Courier New" w:cs="Courier New"/>
+          <w:sz w:val="20"/>
+          <w:szCs w:val="20"/>
+          <w:lang w:val="uk-UA" w:eastAsia="uk-UA"/>
+        </w:rPr>
+        <w:br/>
       </w:r>
       <w:r>
         <w:rPr>
@@ -2642,6 +2641,2809 @@
         </w:rPr>
         <w:br/>
         <w:t xml:space="preserve">    &lt;Canvas Name="canvas" Background="Transparent"&gt;</w:t>
+      </w:r>
+      <w:r>
+        <w:rPr>
+          <w:rFonts w:ascii="Courier New" w:eastAsia="Times New Roman" w:hAnsi="Courier New" w:cs="Courier New"/>
+          <w:sz w:val="20"/>
+          <w:szCs w:val="20"/>
+          <w:lang w:val="uk-UA" w:eastAsia="uk-UA"/>
+        </w:rPr>
+        <w:br/>
+        <w:t xml:space="preserve">        </w:t>
+      </w:r>
+      <w:r>
+        <w:rPr>
+          <w:rFonts w:ascii="Courier New" w:eastAsia="Times New Roman" w:hAnsi="Courier New" w:cs="Courier New"/>
+          <w:i/>
+          <w:iCs/>
+          <w:sz w:val="20"/>
+          <w:szCs w:val="20"/>
+          <w:lang w:val="uk-UA" w:eastAsia="uk-UA"/>
+        </w:rPr>
+        <w:t>&lt;!-- Кулька 1 - Червона (великі повільні кола) --&gt;</w:t>
+      </w:r>
+      <w:r>
+        <w:rPr>
+          <w:rFonts w:ascii="Courier New" w:eastAsia="Times New Roman" w:hAnsi="Courier New" w:cs="Courier New"/>
+          <w:i/>
+          <w:iCs/>
+          <w:sz w:val="20"/>
+          <w:szCs w:val="20"/>
+          <w:lang w:val="uk-UA" w:eastAsia="uk-UA"/>
+        </w:rPr>
+        <w:br/>
+        <w:t xml:space="preserve">        </w:t>
+      </w:r>
+      <w:r>
+        <w:rPr>
+          <w:rFonts w:ascii="Courier New" w:eastAsia="Times New Roman" w:hAnsi="Courier New" w:cs="Courier New"/>
+          <w:sz w:val="20"/>
+          <w:szCs w:val="20"/>
+          <w:lang w:val="uk-UA" w:eastAsia="uk-UA"/>
+        </w:rPr>
+        <w:t xml:space="preserve">&lt;Ellipse x:Name="Ball1" </w:t>
+      </w:r>
+      <w:r>
+        <w:rPr>
+          <w:rFonts w:ascii="Courier New" w:eastAsia="Times New Roman" w:hAnsi="Courier New" w:cs="Courier New"/>
+          <w:sz w:val="20"/>
+          <w:szCs w:val="20"/>
+          <w:lang w:val="uk-UA" w:eastAsia="uk-UA"/>
+        </w:rPr>
+        <w:br/>
+        <w:t xml:space="preserve">                 Width="100" Height="100"</w:t>
+      </w:r>
+      <w:r>
+        <w:rPr>
+          <w:rFonts w:ascii="Courier New" w:eastAsia="Times New Roman" w:hAnsi="Courier New" w:cs="Courier New"/>
+          <w:sz w:val="20"/>
+          <w:szCs w:val="20"/>
+          <w:lang w:val="uk-UA" w:eastAsia="uk-UA"/>
+        </w:rPr>
+        <w:br/>
+        <w:t xml:space="preserve">                 Fill="Red" </w:t>
+      </w:r>
+      <w:r>
+        <w:rPr>
+          <w:rFonts w:ascii="Courier New" w:eastAsia="Times New Roman" w:hAnsi="Courier New" w:cs="Courier New"/>
+          <w:sz w:val="20"/>
+          <w:szCs w:val="20"/>
+          <w:lang w:val="uk-UA" w:eastAsia="uk-UA"/>
+        </w:rPr>
+        <w:br/>
+        <w:t xml:space="preserve">                 Stroke="Black" </w:t>
+      </w:r>
+      <w:r>
+        <w:rPr>
+          <w:rFonts w:ascii="Courier New" w:eastAsia="Times New Roman" w:hAnsi="Courier New" w:cs="Courier New"/>
+          <w:sz w:val="20"/>
+          <w:szCs w:val="20"/>
+          <w:lang w:val="uk-UA" w:eastAsia="uk-UA"/>
+        </w:rPr>
+        <w:br/>
+        <w:t xml:space="preserve">                 StrokeThickness="2"</w:t>
+      </w:r>
+      <w:r>
+        <w:rPr>
+          <w:rFonts w:ascii="Courier New" w:eastAsia="Times New Roman" w:hAnsi="Courier New" w:cs="Courier New"/>
+          <w:sz w:val="20"/>
+          <w:szCs w:val="20"/>
+          <w:lang w:val="uk-UA" w:eastAsia="uk-UA"/>
+        </w:rPr>
+        <w:br/>
+        <w:t xml:space="preserve">                 Canvas.Left="960" </w:t>
+      </w:r>
+      <w:r>
+        <w:rPr>
+          <w:rFonts w:ascii="Courier New" w:eastAsia="Times New Roman" w:hAnsi="Courier New" w:cs="Courier New"/>
+          <w:sz w:val="20"/>
+          <w:szCs w:val="20"/>
+          <w:lang w:val="uk-UA" w:eastAsia="uk-UA"/>
+        </w:rPr>
+        <w:br/>
+        <w:t xml:space="preserve">                 Canvas.Top="240"</w:t>
+      </w:r>
+      <w:r>
+        <w:rPr>
+          <w:rFonts w:ascii="Courier New" w:eastAsia="Times New Roman" w:hAnsi="Courier New" w:cs="Courier New"/>
+          <w:sz w:val="20"/>
+          <w:szCs w:val="20"/>
+          <w:lang w:val="uk-UA" w:eastAsia="uk-UA"/>
+        </w:rPr>
+        <w:br/>
+        <w:t xml:space="preserve">                 MouseEnter="Ellipse_MouseEnter"</w:t>
+      </w:r>
+      <w:r>
+        <w:rPr>
+          <w:rFonts w:ascii="Courier New" w:eastAsia="Times New Roman" w:hAnsi="Courier New" w:cs="Courier New"/>
+          <w:sz w:val="20"/>
+          <w:szCs w:val="20"/>
+          <w:lang w:val="uk-UA" w:eastAsia="uk-UA"/>
+        </w:rPr>
+        <w:br/>
+        <w:t xml:space="preserve">                 MouseLeave="Ellipse_MouseLeave"</w:t>
+      </w:r>
+      <w:r>
+        <w:rPr>
+          <w:rFonts w:ascii="Courier New" w:eastAsia="Times New Roman" w:hAnsi="Courier New" w:cs="Courier New"/>
+          <w:sz w:val="20"/>
+          <w:szCs w:val="20"/>
+          <w:lang w:val="uk-UA" w:eastAsia="uk-UA"/>
+        </w:rPr>
+        <w:br/>
+        <w:t xml:space="preserve">                 MouseLeftButtonDown="Ellipse_MouseLeftButtonDown"&gt;</w:t>
+      </w:r>
+      <w:r>
+        <w:rPr>
+          <w:rFonts w:ascii="Courier New" w:eastAsia="Times New Roman" w:hAnsi="Courier New" w:cs="Courier New"/>
+          <w:sz w:val="20"/>
+          <w:szCs w:val="20"/>
+          <w:lang w:val="uk-UA" w:eastAsia="uk-UA"/>
+        </w:rPr>
+        <w:br/>
+        <w:t xml:space="preserve">            &lt;Ellipse.RenderTransform&gt;</w:t>
+      </w:r>
+      <w:r>
+        <w:rPr>
+          <w:rFonts w:ascii="Courier New" w:eastAsia="Times New Roman" w:hAnsi="Courier New" w:cs="Courier New"/>
+          <w:sz w:val="20"/>
+          <w:szCs w:val="20"/>
+          <w:lang w:val="uk-UA" w:eastAsia="uk-UA"/>
+        </w:rPr>
+        <w:br/>
+        <w:t xml:space="preserve">                &lt;TransformGroup&gt;</w:t>
+      </w:r>
+      <w:r>
+        <w:rPr>
+          <w:rFonts w:ascii="Courier New" w:eastAsia="Times New Roman" w:hAnsi="Courier New" w:cs="Courier New"/>
+          <w:sz w:val="20"/>
+          <w:szCs w:val="20"/>
+          <w:lang w:val="uk-UA" w:eastAsia="uk-UA"/>
+        </w:rPr>
+        <w:br/>
+        <w:t xml:space="preserve">                    &lt;TranslateTransform x:Name="Ball1Translate"/&gt;</w:t>
+      </w:r>
+      <w:r>
+        <w:rPr>
+          <w:rFonts w:ascii="Courier New" w:eastAsia="Times New Roman" w:hAnsi="Courier New" w:cs="Courier New"/>
+          <w:sz w:val="20"/>
+          <w:szCs w:val="20"/>
+          <w:lang w:val="uk-UA" w:eastAsia="uk-UA"/>
+        </w:rPr>
+        <w:br/>
+        <w:t xml:space="preserve">                &lt;/TransformGroup&gt;</w:t>
+      </w:r>
+      <w:r>
+        <w:rPr>
+          <w:rFonts w:ascii="Courier New" w:eastAsia="Times New Roman" w:hAnsi="Courier New" w:cs="Courier New"/>
+          <w:sz w:val="20"/>
+          <w:szCs w:val="20"/>
+          <w:lang w:val="uk-UA" w:eastAsia="uk-UA"/>
+        </w:rPr>
+        <w:br/>
+        <w:t xml:space="preserve">            &lt;/Ellipse.RenderTransform&gt;</w:t>
+      </w:r>
+      <w:r>
+        <w:rPr>
+          <w:rFonts w:ascii="Courier New" w:eastAsia="Times New Roman" w:hAnsi="Courier New" w:cs="Courier New"/>
+          <w:sz w:val="20"/>
+          <w:szCs w:val="20"/>
+          <w:lang w:val="uk-UA" w:eastAsia="uk-UA"/>
+        </w:rPr>
+        <w:br/>
+        <w:t xml:space="preserve">            &lt;Ellipse.Triggers&gt;</w:t>
+      </w:r>
+      <w:r>
+        <w:rPr>
+          <w:rFonts w:ascii="Courier New" w:eastAsia="Times New Roman" w:hAnsi="Courier New" w:cs="Courier New"/>
+          <w:sz w:val="20"/>
+          <w:szCs w:val="20"/>
+          <w:lang w:val="uk-UA" w:eastAsia="uk-UA"/>
+        </w:rPr>
+        <w:br/>
+        <w:t xml:space="preserve">                &lt;EventTrigger RoutedEvent="Ellipse.Loaded"&gt;</w:t>
+      </w:r>
+      <w:r>
+        <w:rPr>
+          <w:rFonts w:ascii="Courier New" w:eastAsia="Times New Roman" w:hAnsi="Courier New" w:cs="Courier New"/>
+          <w:sz w:val="20"/>
+          <w:szCs w:val="20"/>
+          <w:lang w:val="uk-UA" w:eastAsia="uk-UA"/>
+        </w:rPr>
+        <w:br/>
+        <w:t xml:space="preserve">                    &lt;BeginStoryboard x:Name="Ball1Storyboard"&gt;</w:t>
+      </w:r>
+      <w:r>
+        <w:rPr>
+          <w:rFonts w:ascii="Courier New" w:eastAsia="Times New Roman" w:hAnsi="Courier New" w:cs="Courier New"/>
+          <w:sz w:val="20"/>
+          <w:szCs w:val="20"/>
+          <w:lang w:val="uk-UA" w:eastAsia="uk-UA"/>
+        </w:rPr>
+        <w:br/>
+        <w:t xml:space="preserve">                        &lt;Storyboard x:Name="Ball1Animation" RepeatBehavior="Forever"&gt;</w:t>
+      </w:r>
+      <w:r>
+        <w:rPr>
+          <w:rFonts w:ascii="Courier New" w:eastAsia="Times New Roman" w:hAnsi="Courier New" w:cs="Courier New"/>
+          <w:sz w:val="20"/>
+          <w:szCs w:val="20"/>
+          <w:lang w:val="uk-UA" w:eastAsia="uk-UA"/>
+        </w:rPr>
+        <w:br/>
+        <w:t xml:space="preserve">                            &lt;DoubleAnimationUsingKeyFrames Storyboard.TargetName="Ball1Translate"</w:t>
+      </w:r>
+      <w:r>
+        <w:rPr>
+          <w:rFonts w:ascii="Courier New" w:eastAsia="Times New Roman" w:hAnsi="Courier New" w:cs="Courier New"/>
+          <w:sz w:val="20"/>
+          <w:szCs w:val="20"/>
+          <w:lang w:val="uk-UA" w:eastAsia="uk-UA"/>
+        </w:rPr>
+        <w:br/>
+        <w:t xml:space="preserve">                                                          Storyboard.TargetProperty="X"</w:t>
+      </w:r>
+      <w:r>
+        <w:rPr>
+          <w:rFonts w:ascii="Courier New" w:eastAsia="Times New Roman" w:hAnsi="Courier New" w:cs="Courier New"/>
+          <w:sz w:val="20"/>
+          <w:szCs w:val="20"/>
+          <w:lang w:val="uk-UA" w:eastAsia="uk-UA"/>
+        </w:rPr>
+        <w:br/>
+        <w:t xml:space="preserve">                                                          Duration="0:0:8"&gt;</w:t>
+      </w:r>
+      <w:r>
+        <w:rPr>
+          <w:rFonts w:ascii="Courier New" w:eastAsia="Times New Roman" w:hAnsi="Courier New" w:cs="Courier New"/>
+          <w:sz w:val="20"/>
+          <w:szCs w:val="20"/>
+          <w:lang w:val="uk-UA" w:eastAsia="uk-UA"/>
+        </w:rPr>
+        <w:br/>
+        <w:t xml:space="preserve">                                &lt;LinearDoubleKeyFrame Value="0" KeyTime="0:0:0"/&gt;</w:t>
+      </w:r>
+      <w:r>
+        <w:rPr>
+          <w:rFonts w:ascii="Courier New" w:eastAsia="Times New Roman" w:hAnsi="Courier New" w:cs="Courier New"/>
+          <w:sz w:val="20"/>
+          <w:szCs w:val="20"/>
+          <w:lang w:val="uk-UA" w:eastAsia="uk-UA"/>
+        </w:rPr>
+        <w:br/>
+        <w:t xml:space="preserve">                                &lt;LinearDoubleKeyFrame Value="300" KeyTime="0:0:2"/&gt;</w:t>
+      </w:r>
+      <w:r>
+        <w:rPr>
+          <w:rFonts w:ascii="Courier New" w:eastAsia="Times New Roman" w:hAnsi="Courier New" w:cs="Courier New"/>
+          <w:sz w:val="20"/>
+          <w:szCs w:val="20"/>
+          <w:lang w:val="uk-UA" w:eastAsia="uk-UA"/>
+        </w:rPr>
+        <w:br/>
+        <w:t xml:space="preserve">                                &lt;LinearDoubleKeyFrame Value="0" KeyTime="0:0:4"/&gt;</w:t>
+      </w:r>
+      <w:r>
+        <w:rPr>
+          <w:rFonts w:ascii="Courier New" w:eastAsia="Times New Roman" w:hAnsi="Courier New" w:cs="Courier New"/>
+          <w:sz w:val="20"/>
+          <w:szCs w:val="20"/>
+          <w:lang w:val="uk-UA" w:eastAsia="uk-UA"/>
+        </w:rPr>
+        <w:br/>
+        <w:t xml:space="preserve">                                &lt;LinearDoubleKeyFrame Value="-300" KeyTime="0:0:6"/&gt;</w:t>
+      </w:r>
+      <w:r>
+        <w:rPr>
+          <w:rFonts w:ascii="Courier New" w:eastAsia="Times New Roman" w:hAnsi="Courier New" w:cs="Courier New"/>
+          <w:sz w:val="20"/>
+          <w:szCs w:val="20"/>
+          <w:lang w:val="uk-UA" w:eastAsia="uk-UA"/>
+        </w:rPr>
+        <w:br/>
+        <w:t xml:space="preserve">                                &lt;LinearDoubleKeyFrame Value="0" KeyTime="0:0:8"/&gt;</w:t>
+      </w:r>
+      <w:r>
+        <w:rPr>
+          <w:rFonts w:ascii="Courier New" w:eastAsia="Times New Roman" w:hAnsi="Courier New" w:cs="Courier New"/>
+          <w:sz w:val="20"/>
+          <w:szCs w:val="20"/>
+          <w:lang w:val="uk-UA" w:eastAsia="uk-UA"/>
+        </w:rPr>
+        <w:br/>
+        <w:t xml:space="preserve">                            &lt;/DoubleAnimationUsingKeyFrames&gt;</w:t>
+      </w:r>
+      <w:r>
+        <w:rPr>
+          <w:rFonts w:ascii="Courier New" w:eastAsia="Times New Roman" w:hAnsi="Courier New" w:cs="Courier New"/>
+          <w:sz w:val="20"/>
+          <w:szCs w:val="20"/>
+          <w:lang w:val="uk-UA" w:eastAsia="uk-UA"/>
+        </w:rPr>
+        <w:br/>
+        <w:t xml:space="preserve">                            &lt;DoubleAnimationUsingKeyFrames Storyboard.TargetName="Ball1Translate"</w:t>
+      </w:r>
+      <w:r>
+        <w:rPr>
+          <w:rFonts w:ascii="Courier New" w:eastAsia="Times New Roman" w:hAnsi="Courier New" w:cs="Courier New"/>
+          <w:sz w:val="20"/>
+          <w:szCs w:val="20"/>
+          <w:lang w:val="uk-UA" w:eastAsia="uk-UA"/>
+        </w:rPr>
+        <w:br/>
+        <w:t xml:space="preserve">                                                          Storyboard.TargetProperty="Y"</w:t>
+      </w:r>
+      <w:r>
+        <w:rPr>
+          <w:rFonts w:ascii="Courier New" w:eastAsia="Times New Roman" w:hAnsi="Courier New" w:cs="Courier New"/>
+          <w:sz w:val="20"/>
+          <w:szCs w:val="20"/>
+          <w:lang w:val="uk-UA" w:eastAsia="uk-UA"/>
+        </w:rPr>
+        <w:br/>
+        <w:t xml:space="preserve">                                                          Duration="0:0:8"&gt;</w:t>
+      </w:r>
+      <w:r>
+        <w:rPr>
+          <w:rFonts w:ascii="Courier New" w:eastAsia="Times New Roman" w:hAnsi="Courier New" w:cs="Courier New"/>
+          <w:sz w:val="20"/>
+          <w:szCs w:val="20"/>
+          <w:lang w:val="uk-UA" w:eastAsia="uk-UA"/>
+        </w:rPr>
+        <w:br/>
+        <w:t xml:space="preserve">                                &lt;LinearDoubleKeyFrame Value="0" KeyTime="0:0:0"/&gt;</w:t>
+      </w:r>
+      <w:r>
+        <w:rPr>
+          <w:rFonts w:ascii="Courier New" w:eastAsia="Times New Roman" w:hAnsi="Courier New" w:cs="Courier New"/>
+          <w:sz w:val="20"/>
+          <w:szCs w:val="20"/>
+          <w:lang w:val="uk-UA" w:eastAsia="uk-UA"/>
+        </w:rPr>
+        <w:br/>
+      </w:r>
+      <w:r>
+        <w:rPr>
+          <w:rFonts w:ascii="Courier New" w:eastAsia="Times New Roman" w:hAnsi="Courier New" w:cs="Courier New"/>
+          <w:sz w:val="20"/>
+          <w:szCs w:val="20"/>
+          <w:lang w:val="uk-UA" w:eastAsia="uk-UA"/>
+        </w:rPr>
+        <w:lastRenderedPageBreak/>
+        <w:t xml:space="preserve">                                &lt;LinearDoubleKeyFrame Value="300" KeyTime="0:0:2"/&gt;</w:t>
+      </w:r>
+      <w:r>
+        <w:rPr>
+          <w:rFonts w:ascii="Courier New" w:eastAsia="Times New Roman" w:hAnsi="Courier New" w:cs="Courier New"/>
+          <w:sz w:val="20"/>
+          <w:szCs w:val="20"/>
+          <w:lang w:val="uk-UA" w:eastAsia="uk-UA"/>
+        </w:rPr>
+        <w:br/>
+        <w:t xml:space="preserve">                                &lt;LinearDoubleKeyFrame Value="600" KeyTime="0:0:4"/&gt;</w:t>
+      </w:r>
+      <w:r>
+        <w:rPr>
+          <w:rFonts w:ascii="Courier New" w:eastAsia="Times New Roman" w:hAnsi="Courier New" w:cs="Courier New"/>
+          <w:sz w:val="20"/>
+          <w:szCs w:val="20"/>
+          <w:lang w:val="uk-UA" w:eastAsia="uk-UA"/>
+        </w:rPr>
+        <w:br/>
+        <w:t xml:space="preserve">                                &lt;LinearDoubleKeyFrame Value="300" KeyTime="0:0:6"/&gt;</w:t>
+      </w:r>
+      <w:r>
+        <w:rPr>
+          <w:rFonts w:ascii="Courier New" w:eastAsia="Times New Roman" w:hAnsi="Courier New" w:cs="Courier New"/>
+          <w:sz w:val="20"/>
+          <w:szCs w:val="20"/>
+          <w:lang w:val="uk-UA" w:eastAsia="uk-UA"/>
+        </w:rPr>
+        <w:br/>
+        <w:t xml:space="preserve">                                &lt;LinearDoubleKeyFrame Value="0" KeyTime="0:0:8"/&gt;</w:t>
+      </w:r>
+      <w:r>
+        <w:rPr>
+          <w:rFonts w:ascii="Courier New" w:eastAsia="Times New Roman" w:hAnsi="Courier New" w:cs="Courier New"/>
+          <w:sz w:val="20"/>
+          <w:szCs w:val="20"/>
+          <w:lang w:val="uk-UA" w:eastAsia="uk-UA"/>
+        </w:rPr>
+        <w:br/>
+        <w:t xml:space="preserve">                            &lt;/DoubleAnimationUsingKeyFrames&gt;</w:t>
+      </w:r>
+      <w:r>
+        <w:rPr>
+          <w:rFonts w:ascii="Courier New" w:eastAsia="Times New Roman" w:hAnsi="Courier New" w:cs="Courier New"/>
+          <w:sz w:val="20"/>
+          <w:szCs w:val="20"/>
+          <w:lang w:val="uk-UA" w:eastAsia="uk-UA"/>
+        </w:rPr>
+        <w:br/>
+        <w:t xml:space="preserve">                        &lt;/Storyboard&gt;</w:t>
+      </w:r>
+      <w:r>
+        <w:rPr>
+          <w:rFonts w:ascii="Courier New" w:eastAsia="Times New Roman" w:hAnsi="Courier New" w:cs="Courier New"/>
+          <w:sz w:val="20"/>
+          <w:szCs w:val="20"/>
+          <w:lang w:val="uk-UA" w:eastAsia="uk-UA"/>
+        </w:rPr>
+        <w:br/>
+        <w:t xml:space="preserve">                    &lt;/BeginStoryboard&gt;</w:t>
+      </w:r>
+      <w:r>
+        <w:rPr>
+          <w:rFonts w:ascii="Courier New" w:eastAsia="Times New Roman" w:hAnsi="Courier New" w:cs="Courier New"/>
+          <w:sz w:val="20"/>
+          <w:szCs w:val="20"/>
+          <w:lang w:val="uk-UA" w:eastAsia="uk-UA"/>
+        </w:rPr>
+        <w:br/>
+        <w:t xml:space="preserve">                &lt;/EventTrigger&gt;</w:t>
+      </w:r>
+      <w:r>
+        <w:rPr>
+          <w:rFonts w:ascii="Courier New" w:eastAsia="Times New Roman" w:hAnsi="Courier New" w:cs="Courier New"/>
+          <w:sz w:val="20"/>
+          <w:szCs w:val="20"/>
+          <w:lang w:val="uk-UA" w:eastAsia="uk-UA"/>
+        </w:rPr>
+        <w:br/>
+        <w:t xml:space="preserve">            &lt;/Ellipse.Triggers&gt;</w:t>
+      </w:r>
+      <w:r>
+        <w:rPr>
+          <w:rFonts w:ascii="Courier New" w:eastAsia="Times New Roman" w:hAnsi="Courier New" w:cs="Courier New"/>
+          <w:sz w:val="20"/>
+          <w:szCs w:val="20"/>
+          <w:lang w:val="uk-UA" w:eastAsia="uk-UA"/>
+        </w:rPr>
+        <w:br/>
+        <w:t xml:space="preserve">        &lt;/Ellipse&gt;</w:t>
+      </w:r>
+      <w:r>
+        <w:rPr>
+          <w:rFonts w:ascii="Courier New" w:eastAsia="Times New Roman" w:hAnsi="Courier New" w:cs="Courier New"/>
+          <w:sz w:val="20"/>
+          <w:szCs w:val="20"/>
+          <w:lang w:val="uk-UA" w:eastAsia="uk-UA"/>
+        </w:rPr>
+        <w:br/>
+      </w:r>
+      <w:r>
+        <w:rPr>
+          <w:rFonts w:ascii="Courier New" w:eastAsia="Times New Roman" w:hAnsi="Courier New" w:cs="Courier New"/>
+          <w:sz w:val="20"/>
+          <w:szCs w:val="20"/>
+          <w:lang w:val="uk-UA" w:eastAsia="uk-UA"/>
+        </w:rPr>
+        <w:br/>
+        <w:t xml:space="preserve">        </w:t>
+      </w:r>
+      <w:r>
+        <w:rPr>
+          <w:rFonts w:ascii="Courier New" w:eastAsia="Times New Roman" w:hAnsi="Courier New" w:cs="Courier New"/>
+          <w:i/>
+          <w:iCs/>
+          <w:sz w:val="20"/>
+          <w:szCs w:val="20"/>
+          <w:lang w:val="uk-UA" w:eastAsia="uk-UA"/>
+        </w:rPr>
+        <w:t>&lt;!-- Кулька 2 - Синя (малі швидкі кола) --&gt;</w:t>
+      </w:r>
+      <w:r>
+        <w:rPr>
+          <w:rFonts w:ascii="Courier New" w:eastAsia="Times New Roman" w:hAnsi="Courier New" w:cs="Courier New"/>
+          <w:i/>
+          <w:iCs/>
+          <w:sz w:val="20"/>
+          <w:szCs w:val="20"/>
+          <w:lang w:val="uk-UA" w:eastAsia="uk-UA"/>
+        </w:rPr>
+        <w:br/>
+        <w:t xml:space="preserve">        </w:t>
+      </w:r>
+      <w:r>
+        <w:rPr>
+          <w:rFonts w:ascii="Courier New" w:eastAsia="Times New Roman" w:hAnsi="Courier New" w:cs="Courier New"/>
+          <w:sz w:val="20"/>
+          <w:szCs w:val="20"/>
+          <w:lang w:val="uk-UA" w:eastAsia="uk-UA"/>
+        </w:rPr>
+        <w:t xml:space="preserve">&lt;Ellipse x:Name="Ball2" </w:t>
+      </w:r>
+      <w:r>
+        <w:rPr>
+          <w:rFonts w:ascii="Courier New" w:eastAsia="Times New Roman" w:hAnsi="Courier New" w:cs="Courier New"/>
+          <w:sz w:val="20"/>
+          <w:szCs w:val="20"/>
+          <w:lang w:val="uk-UA" w:eastAsia="uk-UA"/>
+        </w:rPr>
+        <w:br/>
+        <w:t xml:space="preserve">                 Width="120" Height="120"</w:t>
+      </w:r>
+      <w:r>
+        <w:rPr>
+          <w:rFonts w:ascii="Courier New" w:eastAsia="Times New Roman" w:hAnsi="Courier New" w:cs="Courier New"/>
+          <w:sz w:val="20"/>
+          <w:szCs w:val="20"/>
+          <w:lang w:val="uk-UA" w:eastAsia="uk-UA"/>
+        </w:rPr>
+        <w:br/>
+        <w:t xml:space="preserve">                 Fill="Blue" </w:t>
+      </w:r>
+      <w:r>
+        <w:rPr>
+          <w:rFonts w:ascii="Courier New" w:eastAsia="Times New Roman" w:hAnsi="Courier New" w:cs="Courier New"/>
+          <w:sz w:val="20"/>
+          <w:szCs w:val="20"/>
+          <w:lang w:val="uk-UA" w:eastAsia="uk-UA"/>
+        </w:rPr>
+        <w:br/>
+        <w:t xml:space="preserve">                 Stroke="Black" </w:t>
+      </w:r>
+      <w:r>
+        <w:rPr>
+          <w:rFonts w:ascii="Courier New" w:eastAsia="Times New Roman" w:hAnsi="Courier New" w:cs="Courier New"/>
+          <w:sz w:val="20"/>
+          <w:szCs w:val="20"/>
+          <w:lang w:val="uk-UA" w:eastAsia="uk-UA"/>
+        </w:rPr>
+        <w:br/>
+        <w:t xml:space="preserve">                 StrokeThickness="2"</w:t>
+      </w:r>
+      <w:r>
+        <w:rPr>
+          <w:rFonts w:ascii="Courier New" w:eastAsia="Times New Roman" w:hAnsi="Courier New" w:cs="Courier New"/>
+          <w:sz w:val="20"/>
+          <w:szCs w:val="20"/>
+          <w:lang w:val="uk-UA" w:eastAsia="uk-UA"/>
+        </w:rPr>
+        <w:br/>
+        <w:t xml:space="preserve">                 Canvas.Left="560" </w:t>
+      </w:r>
+      <w:r>
+        <w:rPr>
+          <w:rFonts w:ascii="Courier New" w:eastAsia="Times New Roman" w:hAnsi="Courier New" w:cs="Courier New"/>
+          <w:sz w:val="20"/>
+          <w:szCs w:val="20"/>
+          <w:lang w:val="uk-UA" w:eastAsia="uk-UA"/>
+        </w:rPr>
+        <w:br/>
+        <w:t xml:space="preserve">                 Canvas.Top="440"</w:t>
+      </w:r>
+      <w:r>
+        <w:rPr>
+          <w:rFonts w:ascii="Courier New" w:eastAsia="Times New Roman" w:hAnsi="Courier New" w:cs="Courier New"/>
+          <w:sz w:val="20"/>
+          <w:szCs w:val="20"/>
+          <w:lang w:val="uk-UA" w:eastAsia="uk-UA"/>
+        </w:rPr>
+        <w:br/>
+        <w:t xml:space="preserve">                 MouseEnter="Ellipse_MouseEnter"</w:t>
+      </w:r>
+      <w:r>
+        <w:rPr>
+          <w:rFonts w:ascii="Courier New" w:eastAsia="Times New Roman" w:hAnsi="Courier New" w:cs="Courier New"/>
+          <w:sz w:val="20"/>
+          <w:szCs w:val="20"/>
+          <w:lang w:val="uk-UA" w:eastAsia="uk-UA"/>
+        </w:rPr>
+        <w:br/>
+        <w:t xml:space="preserve">                 MouseLeave="Ellipse_MouseLeave"</w:t>
+      </w:r>
+      <w:r>
+        <w:rPr>
+          <w:rFonts w:ascii="Courier New" w:eastAsia="Times New Roman" w:hAnsi="Courier New" w:cs="Courier New"/>
+          <w:sz w:val="20"/>
+          <w:szCs w:val="20"/>
+          <w:lang w:val="uk-UA" w:eastAsia="uk-UA"/>
+        </w:rPr>
+        <w:br/>
+        <w:t xml:space="preserve">                 MouseLeftButtonDown="Ellipse_MouseLeftButtonDown"&gt;</w:t>
+      </w:r>
+      <w:r>
+        <w:rPr>
+          <w:rFonts w:ascii="Courier New" w:eastAsia="Times New Roman" w:hAnsi="Courier New" w:cs="Courier New"/>
+          <w:sz w:val="20"/>
+          <w:szCs w:val="20"/>
+          <w:lang w:val="uk-UA" w:eastAsia="uk-UA"/>
+        </w:rPr>
+        <w:br/>
+        <w:t xml:space="preserve">            &lt;Ellipse.RenderTransform&gt;</w:t>
+      </w:r>
+      <w:r>
+        <w:rPr>
+          <w:rFonts w:ascii="Courier New" w:eastAsia="Times New Roman" w:hAnsi="Courier New" w:cs="Courier New"/>
+          <w:sz w:val="20"/>
+          <w:szCs w:val="20"/>
+          <w:lang w:val="uk-UA" w:eastAsia="uk-UA"/>
+        </w:rPr>
+        <w:br/>
+        <w:t xml:space="preserve">                &lt;TransformGroup&gt;</w:t>
+      </w:r>
+      <w:r>
+        <w:rPr>
+          <w:rFonts w:ascii="Courier New" w:eastAsia="Times New Roman" w:hAnsi="Courier New" w:cs="Courier New"/>
+          <w:sz w:val="20"/>
+          <w:szCs w:val="20"/>
+          <w:lang w:val="uk-UA" w:eastAsia="uk-UA"/>
+        </w:rPr>
+        <w:br/>
+        <w:t xml:space="preserve">                    &lt;TranslateTransform x:Name="Ball2Translate"/&gt;</w:t>
+      </w:r>
+      <w:r>
+        <w:rPr>
+          <w:rFonts w:ascii="Courier New" w:eastAsia="Times New Roman" w:hAnsi="Courier New" w:cs="Courier New"/>
+          <w:sz w:val="20"/>
+          <w:szCs w:val="20"/>
+          <w:lang w:val="uk-UA" w:eastAsia="uk-UA"/>
+        </w:rPr>
+        <w:br/>
+        <w:t xml:space="preserve">                &lt;/TransformGroup&gt;</w:t>
+      </w:r>
+      <w:r>
+        <w:rPr>
+          <w:rFonts w:ascii="Courier New" w:eastAsia="Times New Roman" w:hAnsi="Courier New" w:cs="Courier New"/>
+          <w:sz w:val="20"/>
+          <w:szCs w:val="20"/>
+          <w:lang w:val="uk-UA" w:eastAsia="uk-UA"/>
+        </w:rPr>
+        <w:br/>
+        <w:t xml:space="preserve">            &lt;/Ellipse.RenderTransform&gt;</w:t>
+      </w:r>
+      <w:r>
+        <w:rPr>
+          <w:rFonts w:ascii="Courier New" w:eastAsia="Times New Roman" w:hAnsi="Courier New" w:cs="Courier New"/>
+          <w:sz w:val="20"/>
+          <w:szCs w:val="20"/>
+          <w:lang w:val="uk-UA" w:eastAsia="uk-UA"/>
+        </w:rPr>
+        <w:br/>
+        <w:t xml:space="preserve">            &lt;Ellipse.Triggers&gt;</w:t>
+      </w:r>
+      <w:r>
+        <w:rPr>
+          <w:rFonts w:ascii="Courier New" w:eastAsia="Times New Roman" w:hAnsi="Courier New" w:cs="Courier New"/>
+          <w:sz w:val="20"/>
+          <w:szCs w:val="20"/>
+          <w:lang w:val="uk-UA" w:eastAsia="uk-UA"/>
+        </w:rPr>
+        <w:br/>
+        <w:t xml:space="preserve">                &lt;EventTrigger RoutedEvent="Ellipse.Loaded"&gt;</w:t>
+      </w:r>
+      <w:r>
+        <w:rPr>
+          <w:rFonts w:ascii="Courier New" w:eastAsia="Times New Roman" w:hAnsi="Courier New" w:cs="Courier New"/>
+          <w:sz w:val="20"/>
+          <w:szCs w:val="20"/>
+          <w:lang w:val="uk-UA" w:eastAsia="uk-UA"/>
+        </w:rPr>
+        <w:br/>
+        <w:t xml:space="preserve">                    &lt;BeginStoryboard x:Name="Ball2Storyboard"&gt;</w:t>
+      </w:r>
+      <w:r>
+        <w:rPr>
+          <w:rFonts w:ascii="Courier New" w:eastAsia="Times New Roman" w:hAnsi="Courier New" w:cs="Courier New"/>
+          <w:sz w:val="20"/>
+          <w:szCs w:val="20"/>
+          <w:lang w:val="uk-UA" w:eastAsia="uk-UA"/>
+        </w:rPr>
+        <w:br/>
+        <w:t xml:space="preserve">                        &lt;Storyboard x:Name="Ball2Animation" RepeatBehavior="Forever"&gt;</w:t>
+      </w:r>
+      <w:r>
+        <w:rPr>
+          <w:rFonts w:ascii="Courier New" w:eastAsia="Times New Roman" w:hAnsi="Courier New" w:cs="Courier New"/>
+          <w:sz w:val="20"/>
+          <w:szCs w:val="20"/>
+          <w:lang w:val="uk-UA" w:eastAsia="uk-UA"/>
+        </w:rPr>
+        <w:br/>
+        <w:t xml:space="preserve">                            &lt;DoubleAnimationUsingKeyFrames Storyboard.TargetName="Ball2Translate"</w:t>
+      </w:r>
+      <w:r>
+        <w:rPr>
+          <w:rFonts w:ascii="Courier New" w:eastAsia="Times New Roman" w:hAnsi="Courier New" w:cs="Courier New"/>
+          <w:sz w:val="20"/>
+          <w:szCs w:val="20"/>
+          <w:lang w:val="uk-UA" w:eastAsia="uk-UA"/>
+        </w:rPr>
+        <w:br/>
+        <w:t xml:space="preserve">                                                          Storyboard.TargetProperty="X"</w:t>
+      </w:r>
+      <w:r>
+        <w:rPr>
+          <w:rFonts w:ascii="Courier New" w:eastAsia="Times New Roman" w:hAnsi="Courier New" w:cs="Courier New"/>
+          <w:sz w:val="20"/>
+          <w:szCs w:val="20"/>
+          <w:lang w:val="uk-UA" w:eastAsia="uk-UA"/>
+        </w:rPr>
+        <w:br/>
+        <w:t xml:space="preserve">                                                          Duration="0:0:2"&gt;</w:t>
+      </w:r>
+      <w:r>
+        <w:rPr>
+          <w:rFonts w:ascii="Courier New" w:eastAsia="Times New Roman" w:hAnsi="Courier New" w:cs="Courier New"/>
+          <w:sz w:val="20"/>
+          <w:szCs w:val="20"/>
+          <w:lang w:val="uk-UA" w:eastAsia="uk-UA"/>
+        </w:rPr>
+        <w:br/>
+        <w:t xml:space="preserve">                                &lt;LinearDoubleKeyFrame Value="0" KeyTime="0:0:0"/&gt;</w:t>
+      </w:r>
+      <w:r>
+        <w:rPr>
+          <w:rFonts w:ascii="Courier New" w:eastAsia="Times New Roman" w:hAnsi="Courier New" w:cs="Courier New"/>
+          <w:sz w:val="20"/>
+          <w:szCs w:val="20"/>
+          <w:lang w:val="uk-UA" w:eastAsia="uk-UA"/>
+        </w:rPr>
+        <w:br/>
+        <w:t xml:space="preserve">                                &lt;LinearDoubleKeyFrame Value="100" KeyTime="0:0:0.5"/&gt;</w:t>
+      </w:r>
+      <w:r>
+        <w:rPr>
+          <w:rFonts w:ascii="Courier New" w:eastAsia="Times New Roman" w:hAnsi="Courier New" w:cs="Courier New"/>
+          <w:sz w:val="20"/>
+          <w:szCs w:val="20"/>
+          <w:lang w:val="uk-UA" w:eastAsia="uk-UA"/>
+        </w:rPr>
+        <w:br/>
+        <w:t xml:space="preserve">                                &lt;LinearDoubleKeyFrame Value="0" KeyTime="0:0:1"/&gt;</w:t>
+      </w:r>
+      <w:r>
+        <w:rPr>
+          <w:rFonts w:ascii="Courier New" w:eastAsia="Times New Roman" w:hAnsi="Courier New" w:cs="Courier New"/>
+          <w:sz w:val="20"/>
+          <w:szCs w:val="20"/>
+          <w:lang w:val="uk-UA" w:eastAsia="uk-UA"/>
+        </w:rPr>
+        <w:br/>
+        <w:t xml:space="preserve">                                &lt;LinearDoubleKeyFrame Value="-100" KeyTime="0:0:1.5"/&gt;</w:t>
+      </w:r>
+      <w:r>
+        <w:rPr>
+          <w:rFonts w:ascii="Courier New" w:eastAsia="Times New Roman" w:hAnsi="Courier New" w:cs="Courier New"/>
+          <w:sz w:val="20"/>
+          <w:szCs w:val="20"/>
+          <w:lang w:val="uk-UA" w:eastAsia="uk-UA"/>
+        </w:rPr>
+        <w:br/>
+        <w:t xml:space="preserve">                                &lt;LinearDoubleKeyFrame Value="0" KeyTime="0:0:2"/&gt;</w:t>
+      </w:r>
+      <w:r>
+        <w:rPr>
+          <w:rFonts w:ascii="Courier New" w:eastAsia="Times New Roman" w:hAnsi="Courier New" w:cs="Courier New"/>
+          <w:sz w:val="20"/>
+          <w:szCs w:val="20"/>
+          <w:lang w:val="uk-UA" w:eastAsia="uk-UA"/>
+        </w:rPr>
+        <w:br/>
+        <w:t xml:space="preserve">                            &lt;/DoubleAnimationUsingKeyFrames&gt;</w:t>
+      </w:r>
+      <w:r>
+        <w:rPr>
+          <w:rFonts w:ascii="Courier New" w:eastAsia="Times New Roman" w:hAnsi="Courier New" w:cs="Courier New"/>
+          <w:sz w:val="20"/>
+          <w:szCs w:val="20"/>
+          <w:lang w:val="uk-UA" w:eastAsia="uk-UA"/>
+        </w:rPr>
+        <w:br/>
+        <w:t xml:space="preserve">                            &lt;DoubleAnimationUsingKeyFrames Storyboard.TargetName="Ball2Translate"</w:t>
+      </w:r>
+      <w:r>
+        <w:rPr>
+          <w:rFonts w:ascii="Courier New" w:eastAsia="Times New Roman" w:hAnsi="Courier New" w:cs="Courier New"/>
+          <w:sz w:val="20"/>
+          <w:szCs w:val="20"/>
+          <w:lang w:val="uk-UA" w:eastAsia="uk-UA"/>
+        </w:rPr>
+        <w:br/>
+        <w:t xml:space="preserve">                                                          Storyboard.TargetProperty="Y"</w:t>
+      </w:r>
+      <w:r>
+        <w:rPr>
+          <w:rFonts w:ascii="Courier New" w:eastAsia="Times New Roman" w:hAnsi="Courier New" w:cs="Courier New"/>
+          <w:sz w:val="20"/>
+          <w:szCs w:val="20"/>
+          <w:lang w:val="uk-UA" w:eastAsia="uk-UA"/>
+        </w:rPr>
+        <w:br/>
+        <w:t xml:space="preserve">                                                          Duration="0:0:2"&gt;</w:t>
+      </w:r>
+      <w:r>
+        <w:rPr>
+          <w:rFonts w:ascii="Courier New" w:eastAsia="Times New Roman" w:hAnsi="Courier New" w:cs="Courier New"/>
+          <w:sz w:val="20"/>
+          <w:szCs w:val="20"/>
+          <w:lang w:val="uk-UA" w:eastAsia="uk-UA"/>
+        </w:rPr>
+        <w:br/>
+        <w:t xml:space="preserve">                                &lt;LinearDoubleKeyFrame Value="0" KeyTime="0:0:0"/&gt;</w:t>
+      </w:r>
+      <w:r>
+        <w:rPr>
+          <w:rFonts w:ascii="Courier New" w:eastAsia="Times New Roman" w:hAnsi="Courier New" w:cs="Courier New"/>
+          <w:sz w:val="20"/>
+          <w:szCs w:val="20"/>
+          <w:lang w:val="uk-UA" w:eastAsia="uk-UA"/>
+        </w:rPr>
+        <w:br/>
+        <w:t xml:space="preserve">                                &lt;LinearDoubleKeyFrame Value="100" KeyTime="0:0:0.5"/&gt;</w:t>
+      </w:r>
+      <w:r>
+        <w:rPr>
+          <w:rFonts w:ascii="Courier New" w:eastAsia="Times New Roman" w:hAnsi="Courier New" w:cs="Courier New"/>
+          <w:sz w:val="20"/>
+          <w:szCs w:val="20"/>
+          <w:lang w:val="uk-UA" w:eastAsia="uk-UA"/>
+        </w:rPr>
+        <w:br/>
+        <w:t xml:space="preserve">                                &lt;LinearDoubleKeyFrame Value="200" KeyTime="0:0:1"/&gt;</w:t>
+      </w:r>
+      <w:r>
+        <w:rPr>
+          <w:rFonts w:ascii="Courier New" w:eastAsia="Times New Roman" w:hAnsi="Courier New" w:cs="Courier New"/>
+          <w:sz w:val="20"/>
+          <w:szCs w:val="20"/>
+          <w:lang w:val="uk-UA" w:eastAsia="uk-UA"/>
+        </w:rPr>
+        <w:br/>
+        <w:t xml:space="preserve">                                &lt;LinearDoubleKeyFrame Value="100" KeyTime="0:0:1.5"/&gt;</w:t>
+      </w:r>
+      <w:r>
+        <w:rPr>
+          <w:rFonts w:ascii="Courier New" w:eastAsia="Times New Roman" w:hAnsi="Courier New" w:cs="Courier New"/>
+          <w:sz w:val="20"/>
+          <w:szCs w:val="20"/>
+          <w:lang w:val="uk-UA" w:eastAsia="uk-UA"/>
+        </w:rPr>
+        <w:br/>
+        <w:t xml:space="preserve">                                &lt;LinearDoubleKeyFrame Value="0" KeyTime="0:0:2"/&gt;</w:t>
+      </w:r>
+      <w:r>
+        <w:rPr>
+          <w:rFonts w:ascii="Courier New" w:eastAsia="Times New Roman" w:hAnsi="Courier New" w:cs="Courier New"/>
+          <w:sz w:val="20"/>
+          <w:szCs w:val="20"/>
+          <w:lang w:val="uk-UA" w:eastAsia="uk-UA"/>
+        </w:rPr>
+        <w:br/>
+        <w:t xml:space="preserve">                            &lt;/DoubleAnimationUsingKeyFrames&gt;</w:t>
+      </w:r>
+      <w:r>
+        <w:rPr>
+          <w:rFonts w:ascii="Courier New" w:eastAsia="Times New Roman" w:hAnsi="Courier New" w:cs="Courier New"/>
+          <w:sz w:val="20"/>
+          <w:szCs w:val="20"/>
+          <w:lang w:val="uk-UA" w:eastAsia="uk-UA"/>
+        </w:rPr>
+        <w:br/>
+        <w:t xml:space="preserve">                        &lt;/Storyboard&gt;</w:t>
+      </w:r>
+      <w:r>
+        <w:rPr>
+          <w:rFonts w:ascii="Courier New" w:eastAsia="Times New Roman" w:hAnsi="Courier New" w:cs="Courier New"/>
+          <w:sz w:val="20"/>
+          <w:szCs w:val="20"/>
+          <w:lang w:val="uk-UA" w:eastAsia="uk-UA"/>
+        </w:rPr>
+        <w:br/>
+        <w:t xml:space="preserve">                    &lt;/BeginStoryboard&gt;</w:t>
+      </w:r>
+      <w:r>
+        <w:rPr>
+          <w:rFonts w:ascii="Courier New" w:eastAsia="Times New Roman" w:hAnsi="Courier New" w:cs="Courier New"/>
+          <w:sz w:val="20"/>
+          <w:szCs w:val="20"/>
+          <w:lang w:val="uk-UA" w:eastAsia="uk-UA"/>
+        </w:rPr>
+        <w:br/>
+      </w:r>
+      <w:r>
+        <w:rPr>
+          <w:rFonts w:ascii="Courier New" w:eastAsia="Times New Roman" w:hAnsi="Courier New" w:cs="Courier New"/>
+          <w:sz w:val="20"/>
+          <w:szCs w:val="20"/>
+          <w:lang w:val="uk-UA" w:eastAsia="uk-UA"/>
+        </w:rPr>
+        <w:lastRenderedPageBreak/>
+        <w:t xml:space="preserve">                &lt;/EventTrigger&gt;</w:t>
+      </w:r>
+      <w:r>
+        <w:rPr>
+          <w:rFonts w:ascii="Courier New" w:eastAsia="Times New Roman" w:hAnsi="Courier New" w:cs="Courier New"/>
+          <w:sz w:val="20"/>
+          <w:szCs w:val="20"/>
+          <w:lang w:val="uk-UA" w:eastAsia="uk-UA"/>
+        </w:rPr>
+        <w:br/>
+        <w:t xml:space="preserve">            &lt;/Ellipse.Triggers&gt;</w:t>
+      </w:r>
+      <w:r>
+        <w:rPr>
+          <w:rFonts w:ascii="Courier New" w:eastAsia="Times New Roman" w:hAnsi="Courier New" w:cs="Courier New"/>
+          <w:sz w:val="20"/>
+          <w:szCs w:val="20"/>
+          <w:lang w:val="uk-UA" w:eastAsia="uk-UA"/>
+        </w:rPr>
+        <w:br/>
+        <w:t xml:space="preserve">        &lt;/Ellipse&gt;</w:t>
+      </w:r>
+      <w:r>
+        <w:rPr>
+          <w:rFonts w:ascii="Courier New" w:eastAsia="Times New Roman" w:hAnsi="Courier New" w:cs="Courier New"/>
+          <w:sz w:val="20"/>
+          <w:szCs w:val="20"/>
+          <w:lang w:val="uk-UA" w:eastAsia="uk-UA"/>
+        </w:rPr>
+        <w:br/>
+      </w:r>
+      <w:r>
+        <w:rPr>
+          <w:rFonts w:ascii="Courier New" w:eastAsia="Times New Roman" w:hAnsi="Courier New" w:cs="Courier New"/>
+          <w:sz w:val="20"/>
+          <w:szCs w:val="20"/>
+          <w:lang w:val="uk-UA" w:eastAsia="uk-UA"/>
+        </w:rPr>
+        <w:br/>
+        <w:t xml:space="preserve">        </w:t>
+      </w:r>
+      <w:r>
+        <w:rPr>
+          <w:rFonts w:ascii="Courier New" w:eastAsia="Times New Roman" w:hAnsi="Courier New" w:cs="Courier New"/>
+          <w:i/>
+          <w:iCs/>
+          <w:sz w:val="20"/>
+          <w:szCs w:val="20"/>
+          <w:lang w:val="uk-UA" w:eastAsia="uk-UA"/>
+        </w:rPr>
+        <w:t>&lt;!-- Кулька 3 - Зелена (середні кола) --&gt;</w:t>
+      </w:r>
+      <w:r>
+        <w:rPr>
+          <w:rFonts w:ascii="Courier New" w:eastAsia="Times New Roman" w:hAnsi="Courier New" w:cs="Courier New"/>
+          <w:i/>
+          <w:iCs/>
+          <w:sz w:val="20"/>
+          <w:szCs w:val="20"/>
+          <w:lang w:val="uk-UA" w:eastAsia="uk-UA"/>
+        </w:rPr>
+        <w:br/>
+        <w:t xml:space="preserve">        </w:t>
+      </w:r>
+      <w:r>
+        <w:rPr>
+          <w:rFonts w:ascii="Courier New" w:eastAsia="Times New Roman" w:hAnsi="Courier New" w:cs="Courier New"/>
+          <w:sz w:val="20"/>
+          <w:szCs w:val="20"/>
+          <w:lang w:val="uk-UA" w:eastAsia="uk-UA"/>
+        </w:rPr>
+        <w:t xml:space="preserve">&lt;Ellipse x:Name="Ball3" </w:t>
+      </w:r>
+      <w:r>
+        <w:rPr>
+          <w:rFonts w:ascii="Courier New" w:eastAsia="Times New Roman" w:hAnsi="Courier New" w:cs="Courier New"/>
+          <w:sz w:val="20"/>
+          <w:szCs w:val="20"/>
+          <w:lang w:val="uk-UA" w:eastAsia="uk-UA"/>
+        </w:rPr>
+        <w:br/>
+        <w:t xml:space="preserve">                 Width="140" Height="140"</w:t>
+      </w:r>
+      <w:r>
+        <w:rPr>
+          <w:rFonts w:ascii="Courier New" w:eastAsia="Times New Roman" w:hAnsi="Courier New" w:cs="Courier New"/>
+          <w:sz w:val="20"/>
+          <w:szCs w:val="20"/>
+          <w:lang w:val="uk-UA" w:eastAsia="uk-UA"/>
+        </w:rPr>
+        <w:br/>
+        <w:t xml:space="preserve">                 Fill="Green" </w:t>
+      </w:r>
+      <w:r>
+        <w:rPr>
+          <w:rFonts w:ascii="Courier New" w:eastAsia="Times New Roman" w:hAnsi="Courier New" w:cs="Courier New"/>
+          <w:sz w:val="20"/>
+          <w:szCs w:val="20"/>
+          <w:lang w:val="uk-UA" w:eastAsia="uk-UA"/>
+        </w:rPr>
+        <w:br/>
+        <w:t xml:space="preserve">                 Stroke="Black" </w:t>
+      </w:r>
+      <w:r>
+        <w:rPr>
+          <w:rFonts w:ascii="Courier New" w:eastAsia="Times New Roman" w:hAnsi="Courier New" w:cs="Courier New"/>
+          <w:sz w:val="20"/>
+          <w:szCs w:val="20"/>
+          <w:lang w:val="uk-UA" w:eastAsia="uk-UA"/>
+        </w:rPr>
+        <w:br/>
+        <w:t xml:space="preserve">                 StrokeThickness="2"</w:t>
+      </w:r>
+      <w:r>
+        <w:rPr>
+          <w:rFonts w:ascii="Courier New" w:eastAsia="Times New Roman" w:hAnsi="Courier New" w:cs="Courier New"/>
+          <w:sz w:val="20"/>
+          <w:szCs w:val="20"/>
+          <w:lang w:val="uk-UA" w:eastAsia="uk-UA"/>
+        </w:rPr>
+        <w:br/>
+        <w:t xml:space="preserve">                 Canvas.Left="910" </w:t>
+      </w:r>
+      <w:r>
+        <w:rPr>
+          <w:rFonts w:ascii="Courier New" w:eastAsia="Times New Roman" w:hAnsi="Courier New" w:cs="Courier New"/>
+          <w:sz w:val="20"/>
+          <w:szCs w:val="20"/>
+          <w:lang w:val="uk-UA" w:eastAsia="uk-UA"/>
+        </w:rPr>
+        <w:br/>
+        <w:t xml:space="preserve">                 Canvas.Top="290"</w:t>
+      </w:r>
+      <w:r>
+        <w:rPr>
+          <w:rFonts w:ascii="Courier New" w:eastAsia="Times New Roman" w:hAnsi="Courier New" w:cs="Courier New"/>
+          <w:sz w:val="20"/>
+          <w:szCs w:val="20"/>
+          <w:lang w:val="uk-UA" w:eastAsia="uk-UA"/>
+        </w:rPr>
+        <w:br/>
+        <w:t xml:space="preserve">                 MouseEnter="Ellipse_MouseEnter"</w:t>
+      </w:r>
+      <w:r>
+        <w:rPr>
+          <w:rFonts w:ascii="Courier New" w:eastAsia="Times New Roman" w:hAnsi="Courier New" w:cs="Courier New"/>
+          <w:sz w:val="20"/>
+          <w:szCs w:val="20"/>
+          <w:lang w:val="uk-UA" w:eastAsia="uk-UA"/>
+        </w:rPr>
+        <w:br/>
+        <w:t xml:space="preserve">                 MouseLeave="Ellipse_MouseLeave"</w:t>
+      </w:r>
+      <w:r>
+        <w:rPr>
+          <w:rFonts w:ascii="Courier New" w:eastAsia="Times New Roman" w:hAnsi="Courier New" w:cs="Courier New"/>
+          <w:sz w:val="20"/>
+          <w:szCs w:val="20"/>
+          <w:lang w:val="uk-UA" w:eastAsia="uk-UA"/>
+        </w:rPr>
+        <w:br/>
+        <w:t xml:space="preserve">                 MouseLeftButtonDown="Ellipse_MouseLeftButtonDown"&gt;</w:t>
+      </w:r>
+      <w:r>
+        <w:rPr>
+          <w:rFonts w:ascii="Courier New" w:eastAsia="Times New Roman" w:hAnsi="Courier New" w:cs="Courier New"/>
+          <w:sz w:val="20"/>
+          <w:szCs w:val="20"/>
+          <w:lang w:val="uk-UA" w:eastAsia="uk-UA"/>
+        </w:rPr>
+        <w:br/>
+        <w:t xml:space="preserve">            &lt;Ellipse.RenderTransform&gt;</w:t>
+      </w:r>
+      <w:r>
+        <w:rPr>
+          <w:rFonts w:ascii="Courier New" w:eastAsia="Times New Roman" w:hAnsi="Courier New" w:cs="Courier New"/>
+          <w:sz w:val="20"/>
+          <w:szCs w:val="20"/>
+          <w:lang w:val="uk-UA" w:eastAsia="uk-UA"/>
+        </w:rPr>
+        <w:br/>
+        <w:t xml:space="preserve">                &lt;TransformGroup&gt;</w:t>
+      </w:r>
+      <w:r>
+        <w:rPr>
+          <w:rFonts w:ascii="Courier New" w:eastAsia="Times New Roman" w:hAnsi="Courier New" w:cs="Courier New"/>
+          <w:sz w:val="20"/>
+          <w:szCs w:val="20"/>
+          <w:lang w:val="uk-UA" w:eastAsia="uk-UA"/>
+        </w:rPr>
+        <w:br/>
+        <w:t xml:space="preserve">                    &lt;TranslateTransform x:Name="Ball3Translate"/&gt;</w:t>
+      </w:r>
+      <w:r>
+        <w:rPr>
+          <w:rFonts w:ascii="Courier New" w:eastAsia="Times New Roman" w:hAnsi="Courier New" w:cs="Courier New"/>
+          <w:sz w:val="20"/>
+          <w:szCs w:val="20"/>
+          <w:lang w:val="uk-UA" w:eastAsia="uk-UA"/>
+        </w:rPr>
+        <w:br/>
+        <w:t xml:space="preserve">                &lt;/TransformGroup&gt;</w:t>
+      </w:r>
+      <w:r>
+        <w:rPr>
+          <w:rFonts w:ascii="Courier New" w:eastAsia="Times New Roman" w:hAnsi="Courier New" w:cs="Courier New"/>
+          <w:sz w:val="20"/>
+          <w:szCs w:val="20"/>
+          <w:lang w:val="uk-UA" w:eastAsia="uk-UA"/>
+        </w:rPr>
+        <w:br/>
+        <w:t xml:space="preserve">            &lt;/Ellipse.RenderTransform&gt;</w:t>
+      </w:r>
+      <w:r>
+        <w:rPr>
+          <w:rFonts w:ascii="Courier New" w:eastAsia="Times New Roman" w:hAnsi="Courier New" w:cs="Courier New"/>
+          <w:sz w:val="20"/>
+          <w:szCs w:val="20"/>
+          <w:lang w:val="uk-UA" w:eastAsia="uk-UA"/>
+        </w:rPr>
+        <w:br/>
+        <w:t xml:space="preserve">            &lt;Ellipse.Triggers&gt;</w:t>
+      </w:r>
+      <w:r>
+        <w:rPr>
+          <w:rFonts w:ascii="Courier New" w:eastAsia="Times New Roman" w:hAnsi="Courier New" w:cs="Courier New"/>
+          <w:sz w:val="20"/>
+          <w:szCs w:val="20"/>
+          <w:lang w:val="uk-UA" w:eastAsia="uk-UA"/>
+        </w:rPr>
+        <w:br/>
+        <w:t xml:space="preserve">                &lt;EventTrigger RoutedEvent="Ellipse.Loaded"&gt;</w:t>
+      </w:r>
+      <w:r>
+        <w:rPr>
+          <w:rFonts w:ascii="Courier New" w:eastAsia="Times New Roman" w:hAnsi="Courier New" w:cs="Courier New"/>
+          <w:sz w:val="20"/>
+          <w:szCs w:val="20"/>
+          <w:lang w:val="uk-UA" w:eastAsia="uk-UA"/>
+        </w:rPr>
+        <w:br/>
+        <w:t xml:space="preserve">                    &lt;BeginStoryboard x:Name="Ball3Storyboard"&gt;</w:t>
+      </w:r>
+      <w:r>
+        <w:rPr>
+          <w:rFonts w:ascii="Courier New" w:eastAsia="Times New Roman" w:hAnsi="Courier New" w:cs="Courier New"/>
+          <w:sz w:val="20"/>
+          <w:szCs w:val="20"/>
+          <w:lang w:val="uk-UA" w:eastAsia="uk-UA"/>
+        </w:rPr>
+        <w:br/>
+        <w:t xml:space="preserve">                        &lt;Storyboard x:Name="Ball3Animation" RepeatBehavior="Forever"&gt;</w:t>
+      </w:r>
+      <w:r>
+        <w:rPr>
+          <w:rFonts w:ascii="Courier New" w:eastAsia="Times New Roman" w:hAnsi="Courier New" w:cs="Courier New"/>
+          <w:sz w:val="20"/>
+          <w:szCs w:val="20"/>
+          <w:lang w:val="uk-UA" w:eastAsia="uk-UA"/>
+        </w:rPr>
+        <w:br/>
+        <w:t xml:space="preserve">                            &lt;DoubleAnimationUsingKeyFrames Storyboard.TargetName="Ball3Translate"</w:t>
+      </w:r>
+      <w:r>
+        <w:rPr>
+          <w:rFonts w:ascii="Courier New" w:eastAsia="Times New Roman" w:hAnsi="Courier New" w:cs="Courier New"/>
+          <w:sz w:val="20"/>
+          <w:szCs w:val="20"/>
+          <w:lang w:val="uk-UA" w:eastAsia="uk-UA"/>
+        </w:rPr>
+        <w:br/>
+        <w:t xml:space="preserve">                                                          Storyboard.TargetProperty="X"</w:t>
+      </w:r>
+      <w:r>
+        <w:rPr>
+          <w:rFonts w:ascii="Courier New" w:eastAsia="Times New Roman" w:hAnsi="Courier New" w:cs="Courier New"/>
+          <w:sz w:val="20"/>
+          <w:szCs w:val="20"/>
+          <w:lang w:val="uk-UA" w:eastAsia="uk-UA"/>
+        </w:rPr>
+        <w:br/>
+        <w:t xml:space="preserve">                                                          Duration="0:0:4"&gt;</w:t>
+      </w:r>
+      <w:r>
+        <w:rPr>
+          <w:rFonts w:ascii="Courier New" w:eastAsia="Times New Roman" w:hAnsi="Courier New" w:cs="Courier New"/>
+          <w:sz w:val="20"/>
+          <w:szCs w:val="20"/>
+          <w:lang w:val="uk-UA" w:eastAsia="uk-UA"/>
+        </w:rPr>
+        <w:br/>
+        <w:t xml:space="preserve">                                &lt;LinearDoubleKeyFrame Value="0" KeyTime="0:0:0"/&gt;</w:t>
+      </w:r>
+      <w:r>
+        <w:rPr>
+          <w:rFonts w:ascii="Courier New" w:eastAsia="Times New Roman" w:hAnsi="Courier New" w:cs="Courier New"/>
+          <w:sz w:val="20"/>
+          <w:szCs w:val="20"/>
+          <w:lang w:val="uk-UA" w:eastAsia="uk-UA"/>
+        </w:rPr>
+        <w:br/>
+        <w:t xml:space="preserve">                                &lt;LinearDoubleKeyFrame Value="250" KeyTime="0:0:1"/&gt;</w:t>
+      </w:r>
+      <w:r>
+        <w:rPr>
+          <w:rFonts w:ascii="Courier New" w:eastAsia="Times New Roman" w:hAnsi="Courier New" w:cs="Courier New"/>
+          <w:sz w:val="20"/>
+          <w:szCs w:val="20"/>
+          <w:lang w:val="uk-UA" w:eastAsia="uk-UA"/>
+        </w:rPr>
+        <w:br/>
+        <w:t xml:space="preserve">                                &lt;LinearDoubleKeyFrame Value="0" KeyTime="0:0:2"/&gt;</w:t>
+      </w:r>
+      <w:r>
+        <w:rPr>
+          <w:rFonts w:ascii="Courier New" w:eastAsia="Times New Roman" w:hAnsi="Courier New" w:cs="Courier New"/>
+          <w:sz w:val="20"/>
+          <w:szCs w:val="20"/>
+          <w:lang w:val="uk-UA" w:eastAsia="uk-UA"/>
+        </w:rPr>
+        <w:br/>
+        <w:t xml:space="preserve">                                &lt;LinearDoubleKeyFrame Value="-250" KeyTime="0:0:3"/&gt;</w:t>
+      </w:r>
+      <w:r>
+        <w:rPr>
+          <w:rFonts w:ascii="Courier New" w:eastAsia="Times New Roman" w:hAnsi="Courier New" w:cs="Courier New"/>
+          <w:sz w:val="20"/>
+          <w:szCs w:val="20"/>
+          <w:lang w:val="uk-UA" w:eastAsia="uk-UA"/>
+        </w:rPr>
+        <w:br/>
+        <w:t xml:space="preserve">                                &lt;LinearDoubleKeyFrame Value="0" KeyTime="0:0:4"/&gt;</w:t>
+      </w:r>
+      <w:r>
+        <w:rPr>
+          <w:rFonts w:ascii="Courier New" w:eastAsia="Times New Roman" w:hAnsi="Courier New" w:cs="Courier New"/>
+          <w:sz w:val="20"/>
+          <w:szCs w:val="20"/>
+          <w:lang w:val="uk-UA" w:eastAsia="uk-UA"/>
+        </w:rPr>
+        <w:br/>
+        <w:t xml:space="preserve">                            &lt;/DoubleAnimationUsingKeyFrames&gt;</w:t>
+      </w:r>
+      <w:r>
+        <w:rPr>
+          <w:rFonts w:ascii="Courier New" w:eastAsia="Times New Roman" w:hAnsi="Courier New" w:cs="Courier New"/>
+          <w:sz w:val="20"/>
+          <w:szCs w:val="20"/>
+          <w:lang w:val="uk-UA" w:eastAsia="uk-UA"/>
+        </w:rPr>
+        <w:br/>
+        <w:t xml:space="preserve">                            &lt;DoubleAnimationUsingKeyFrames Storyboard.TargetName="Ball3Translate"</w:t>
+      </w:r>
+      <w:r>
+        <w:rPr>
+          <w:rFonts w:ascii="Courier New" w:eastAsia="Times New Roman" w:hAnsi="Courier New" w:cs="Courier New"/>
+          <w:sz w:val="20"/>
+          <w:szCs w:val="20"/>
+          <w:lang w:val="uk-UA" w:eastAsia="uk-UA"/>
+        </w:rPr>
+        <w:br/>
+        <w:t xml:space="preserve">                                                          Storyboard.TargetProperty="Y"</w:t>
+      </w:r>
+      <w:r>
+        <w:rPr>
+          <w:rFonts w:ascii="Courier New" w:eastAsia="Times New Roman" w:hAnsi="Courier New" w:cs="Courier New"/>
+          <w:sz w:val="20"/>
+          <w:szCs w:val="20"/>
+          <w:lang w:val="uk-UA" w:eastAsia="uk-UA"/>
+        </w:rPr>
+        <w:br/>
+        <w:t xml:space="preserve">                                                          Duration="0:0:4"&gt;</w:t>
+      </w:r>
+      <w:r>
+        <w:rPr>
+          <w:rFonts w:ascii="Courier New" w:eastAsia="Times New Roman" w:hAnsi="Courier New" w:cs="Courier New"/>
+          <w:sz w:val="20"/>
+          <w:szCs w:val="20"/>
+          <w:lang w:val="uk-UA" w:eastAsia="uk-UA"/>
+        </w:rPr>
+        <w:br/>
+        <w:t xml:space="preserve">                                &lt;LinearDoubleKeyFrame Value="0" KeyTime="0:0:0"/&gt;</w:t>
+      </w:r>
+      <w:r>
+        <w:rPr>
+          <w:rFonts w:ascii="Courier New" w:eastAsia="Times New Roman" w:hAnsi="Courier New" w:cs="Courier New"/>
+          <w:sz w:val="20"/>
+          <w:szCs w:val="20"/>
+          <w:lang w:val="uk-UA" w:eastAsia="uk-UA"/>
+        </w:rPr>
+        <w:br/>
+        <w:t xml:space="preserve">                                &lt;LinearDoubleKeyFrame Value="250" KeyTime="0:0:1"/&gt;</w:t>
+      </w:r>
+      <w:r>
+        <w:rPr>
+          <w:rFonts w:ascii="Courier New" w:eastAsia="Times New Roman" w:hAnsi="Courier New" w:cs="Courier New"/>
+          <w:sz w:val="20"/>
+          <w:szCs w:val="20"/>
+          <w:lang w:val="uk-UA" w:eastAsia="uk-UA"/>
+        </w:rPr>
+        <w:br/>
+        <w:t xml:space="preserve">                                &lt;LinearDoubleKeyFrame Value="500" KeyTime="0:0:2"/&gt;</w:t>
+      </w:r>
+      <w:r>
+        <w:rPr>
+          <w:rFonts w:ascii="Courier New" w:eastAsia="Times New Roman" w:hAnsi="Courier New" w:cs="Courier New"/>
+          <w:sz w:val="20"/>
+          <w:szCs w:val="20"/>
+          <w:lang w:val="uk-UA" w:eastAsia="uk-UA"/>
+        </w:rPr>
+        <w:br/>
+        <w:t xml:space="preserve">                                &lt;LinearDoubleKeyFrame Value="250" KeyTime="0:0:3"/&gt;</w:t>
+      </w:r>
+      <w:r>
+        <w:rPr>
+          <w:rFonts w:ascii="Courier New" w:eastAsia="Times New Roman" w:hAnsi="Courier New" w:cs="Courier New"/>
+          <w:sz w:val="20"/>
+          <w:szCs w:val="20"/>
+          <w:lang w:val="uk-UA" w:eastAsia="uk-UA"/>
+        </w:rPr>
+        <w:br/>
+        <w:t xml:space="preserve">                                &lt;LinearDoubleKeyFrame Value="0" KeyTime="0:0:4"/&gt;</w:t>
+      </w:r>
+      <w:r>
+        <w:rPr>
+          <w:rFonts w:ascii="Courier New" w:eastAsia="Times New Roman" w:hAnsi="Courier New" w:cs="Courier New"/>
+          <w:sz w:val="20"/>
+          <w:szCs w:val="20"/>
+          <w:lang w:val="uk-UA" w:eastAsia="uk-UA"/>
+        </w:rPr>
+        <w:br/>
+        <w:t xml:space="preserve">                            &lt;/DoubleAnimationUsingKeyFrames&gt;</w:t>
+      </w:r>
+      <w:r>
+        <w:rPr>
+          <w:rFonts w:ascii="Courier New" w:eastAsia="Times New Roman" w:hAnsi="Courier New" w:cs="Courier New"/>
+          <w:sz w:val="20"/>
+          <w:szCs w:val="20"/>
+          <w:lang w:val="uk-UA" w:eastAsia="uk-UA"/>
+        </w:rPr>
+        <w:br/>
+        <w:t xml:space="preserve">                        &lt;/Storyboard&gt;</w:t>
+      </w:r>
+      <w:r>
+        <w:rPr>
+          <w:rFonts w:ascii="Courier New" w:eastAsia="Times New Roman" w:hAnsi="Courier New" w:cs="Courier New"/>
+          <w:sz w:val="20"/>
+          <w:szCs w:val="20"/>
+          <w:lang w:val="uk-UA" w:eastAsia="uk-UA"/>
+        </w:rPr>
+        <w:br/>
+        <w:t xml:space="preserve">                    &lt;/BeginStoryboard&gt;</w:t>
+      </w:r>
+      <w:r>
+        <w:rPr>
+          <w:rFonts w:ascii="Courier New" w:eastAsia="Times New Roman" w:hAnsi="Courier New" w:cs="Courier New"/>
+          <w:sz w:val="20"/>
+          <w:szCs w:val="20"/>
+          <w:lang w:val="uk-UA" w:eastAsia="uk-UA"/>
+        </w:rPr>
+        <w:br/>
+        <w:t xml:space="preserve">                &lt;/EventTrigger&gt;</w:t>
+      </w:r>
+      <w:r>
+        <w:rPr>
+          <w:rFonts w:ascii="Courier New" w:eastAsia="Times New Roman" w:hAnsi="Courier New" w:cs="Courier New"/>
+          <w:sz w:val="20"/>
+          <w:szCs w:val="20"/>
+          <w:lang w:val="uk-UA" w:eastAsia="uk-UA"/>
+        </w:rPr>
+        <w:br/>
+        <w:t xml:space="preserve">            &lt;/Ellipse.Triggers&gt;</w:t>
+      </w:r>
+      <w:r>
+        <w:rPr>
+          <w:rFonts w:ascii="Courier New" w:eastAsia="Times New Roman" w:hAnsi="Courier New" w:cs="Courier New"/>
+          <w:sz w:val="20"/>
+          <w:szCs w:val="20"/>
+          <w:lang w:val="uk-UA" w:eastAsia="uk-UA"/>
+        </w:rPr>
+        <w:br/>
+        <w:t xml:space="preserve">        &lt;/Ellipse&gt;</w:t>
+      </w:r>
+      <w:r>
+        <w:rPr>
+          <w:rFonts w:ascii="Courier New" w:eastAsia="Times New Roman" w:hAnsi="Courier New" w:cs="Courier New"/>
+          <w:sz w:val="20"/>
+          <w:szCs w:val="20"/>
+          <w:lang w:val="uk-UA" w:eastAsia="uk-UA"/>
+        </w:rPr>
+        <w:br/>
+      </w:r>
+      <w:r>
+        <w:rPr>
+          <w:rFonts w:ascii="Courier New" w:eastAsia="Times New Roman" w:hAnsi="Courier New" w:cs="Courier New"/>
+          <w:sz w:val="20"/>
+          <w:szCs w:val="20"/>
+          <w:lang w:val="uk-UA" w:eastAsia="uk-UA"/>
+        </w:rPr>
+        <w:br/>
+        <w:t xml:space="preserve">        </w:t>
+      </w:r>
+      <w:r>
+        <w:rPr>
+          <w:rFonts w:ascii="Courier New" w:eastAsia="Times New Roman" w:hAnsi="Courier New" w:cs="Courier New"/>
+          <w:i/>
+          <w:iCs/>
+          <w:sz w:val="20"/>
+          <w:szCs w:val="20"/>
+          <w:lang w:val="uk-UA" w:eastAsia="uk-UA"/>
+        </w:rPr>
+        <w:t>&lt;!-- Кулька 4 - Жовта (великі швидкі кола) --&gt;</w:t>
+      </w:r>
+      <w:r>
+        <w:rPr>
+          <w:rFonts w:ascii="Courier New" w:eastAsia="Times New Roman" w:hAnsi="Courier New" w:cs="Courier New"/>
+          <w:i/>
+          <w:iCs/>
+          <w:sz w:val="20"/>
+          <w:szCs w:val="20"/>
+          <w:lang w:val="uk-UA" w:eastAsia="uk-UA"/>
+        </w:rPr>
+        <w:br/>
+        <w:t xml:space="preserve">        </w:t>
+      </w:r>
+      <w:r>
+        <w:rPr>
+          <w:rFonts w:ascii="Courier New" w:eastAsia="Times New Roman" w:hAnsi="Courier New" w:cs="Courier New"/>
+          <w:sz w:val="20"/>
+          <w:szCs w:val="20"/>
+          <w:lang w:val="uk-UA" w:eastAsia="uk-UA"/>
+        </w:rPr>
+        <w:t xml:space="preserve">&lt;Ellipse x:Name="Ball4" </w:t>
+      </w:r>
+      <w:r>
+        <w:rPr>
+          <w:rFonts w:ascii="Courier New" w:eastAsia="Times New Roman" w:hAnsi="Courier New" w:cs="Courier New"/>
+          <w:sz w:val="20"/>
+          <w:szCs w:val="20"/>
+          <w:lang w:val="uk-UA" w:eastAsia="uk-UA"/>
+        </w:rPr>
+        <w:br/>
+        <w:t xml:space="preserve">                 Width="110" Height="110"</w:t>
+      </w:r>
+      <w:r>
+        <w:rPr>
+          <w:rFonts w:ascii="Courier New" w:eastAsia="Times New Roman" w:hAnsi="Courier New" w:cs="Courier New"/>
+          <w:sz w:val="20"/>
+          <w:szCs w:val="20"/>
+          <w:lang w:val="uk-UA" w:eastAsia="uk-UA"/>
+        </w:rPr>
+        <w:br/>
+        <w:t xml:space="preserve">                 Fill="Yellow" </w:t>
+      </w:r>
+      <w:r>
+        <w:rPr>
+          <w:rFonts w:ascii="Courier New" w:eastAsia="Times New Roman" w:hAnsi="Courier New" w:cs="Courier New"/>
+          <w:sz w:val="20"/>
+          <w:szCs w:val="20"/>
+          <w:lang w:val="uk-UA" w:eastAsia="uk-UA"/>
+        </w:rPr>
+        <w:br/>
+        <w:t xml:space="preserve">                 Stroke="Black" </w:t>
+      </w:r>
+      <w:r>
+        <w:rPr>
+          <w:rFonts w:ascii="Courier New" w:eastAsia="Times New Roman" w:hAnsi="Courier New" w:cs="Courier New"/>
+          <w:sz w:val="20"/>
+          <w:szCs w:val="20"/>
+          <w:lang w:val="uk-UA" w:eastAsia="uk-UA"/>
+        </w:rPr>
+        <w:br/>
+        <w:t xml:space="preserve">                 StrokeThickness="2"</w:t>
+      </w:r>
+      <w:r>
+        <w:rPr>
+          <w:rFonts w:ascii="Courier New" w:eastAsia="Times New Roman" w:hAnsi="Courier New" w:cs="Courier New"/>
+          <w:sz w:val="20"/>
+          <w:szCs w:val="20"/>
+          <w:lang w:val="uk-UA" w:eastAsia="uk-UA"/>
+        </w:rPr>
+        <w:br/>
+      </w:r>
+      <w:r>
+        <w:rPr>
+          <w:rFonts w:ascii="Courier New" w:eastAsia="Times New Roman" w:hAnsi="Courier New" w:cs="Courier New"/>
+          <w:sz w:val="20"/>
+          <w:szCs w:val="20"/>
+          <w:lang w:val="uk-UA" w:eastAsia="uk-UA"/>
+        </w:rPr>
+        <w:lastRenderedPageBreak/>
+        <w:t xml:space="preserve">                 Canvas.Left="980" </w:t>
+      </w:r>
+      <w:r>
+        <w:rPr>
+          <w:rFonts w:ascii="Courier New" w:eastAsia="Times New Roman" w:hAnsi="Courier New" w:cs="Courier New"/>
+          <w:sz w:val="20"/>
+          <w:szCs w:val="20"/>
+          <w:lang w:val="uk-UA" w:eastAsia="uk-UA"/>
+        </w:rPr>
+        <w:br/>
+        <w:t xml:space="preserve">                 Canvas.Top="220"</w:t>
+      </w:r>
+      <w:r>
+        <w:rPr>
+          <w:rFonts w:ascii="Courier New" w:eastAsia="Times New Roman" w:hAnsi="Courier New" w:cs="Courier New"/>
+          <w:sz w:val="20"/>
+          <w:szCs w:val="20"/>
+          <w:lang w:val="uk-UA" w:eastAsia="uk-UA"/>
+        </w:rPr>
+        <w:br/>
+        <w:t xml:space="preserve">                 MouseEnter="Ellipse_MouseEnter"</w:t>
+      </w:r>
+      <w:r>
+        <w:rPr>
+          <w:rFonts w:ascii="Courier New" w:eastAsia="Times New Roman" w:hAnsi="Courier New" w:cs="Courier New"/>
+          <w:sz w:val="20"/>
+          <w:szCs w:val="20"/>
+          <w:lang w:val="uk-UA" w:eastAsia="uk-UA"/>
+        </w:rPr>
+        <w:br/>
+        <w:t xml:space="preserve">                 MouseLeave="Ellipse_MouseLeave"</w:t>
+      </w:r>
+      <w:r>
+        <w:rPr>
+          <w:rFonts w:ascii="Courier New" w:eastAsia="Times New Roman" w:hAnsi="Courier New" w:cs="Courier New"/>
+          <w:sz w:val="20"/>
+          <w:szCs w:val="20"/>
+          <w:lang w:val="uk-UA" w:eastAsia="uk-UA"/>
+        </w:rPr>
+        <w:br/>
+        <w:t xml:space="preserve">                 MouseLeftButtonDown="Ellipse_MouseLeftButtonDown"&gt;</w:t>
+      </w:r>
+      <w:r>
+        <w:rPr>
+          <w:rFonts w:ascii="Courier New" w:eastAsia="Times New Roman" w:hAnsi="Courier New" w:cs="Courier New"/>
+          <w:sz w:val="20"/>
+          <w:szCs w:val="20"/>
+          <w:lang w:val="uk-UA" w:eastAsia="uk-UA"/>
+        </w:rPr>
+        <w:br/>
+        <w:t xml:space="preserve">            &lt;Ellipse.RenderTransform&gt;</w:t>
+      </w:r>
+      <w:r>
+        <w:rPr>
+          <w:rFonts w:ascii="Courier New" w:eastAsia="Times New Roman" w:hAnsi="Courier New" w:cs="Courier New"/>
+          <w:sz w:val="20"/>
+          <w:szCs w:val="20"/>
+          <w:lang w:val="uk-UA" w:eastAsia="uk-UA"/>
+        </w:rPr>
+        <w:br/>
+        <w:t xml:space="preserve">                &lt;TransformGroup&gt;</w:t>
+      </w:r>
+      <w:r>
+        <w:rPr>
+          <w:rFonts w:ascii="Courier New" w:eastAsia="Times New Roman" w:hAnsi="Courier New" w:cs="Courier New"/>
+          <w:sz w:val="20"/>
+          <w:szCs w:val="20"/>
+          <w:lang w:val="uk-UA" w:eastAsia="uk-UA"/>
+        </w:rPr>
+        <w:br/>
+        <w:t xml:space="preserve">                    &lt;TranslateTransform x:Name="Ball4Translate"/&gt;</w:t>
+      </w:r>
+      <w:r>
+        <w:rPr>
+          <w:rFonts w:ascii="Courier New" w:eastAsia="Times New Roman" w:hAnsi="Courier New" w:cs="Courier New"/>
+          <w:sz w:val="20"/>
+          <w:szCs w:val="20"/>
+          <w:lang w:val="uk-UA" w:eastAsia="uk-UA"/>
+        </w:rPr>
+        <w:br/>
+        <w:t xml:space="preserve">                &lt;/TransformGroup&gt;</w:t>
+      </w:r>
+      <w:r>
+        <w:rPr>
+          <w:rFonts w:ascii="Courier New" w:eastAsia="Times New Roman" w:hAnsi="Courier New" w:cs="Courier New"/>
+          <w:sz w:val="20"/>
+          <w:szCs w:val="20"/>
+          <w:lang w:val="uk-UA" w:eastAsia="uk-UA"/>
+        </w:rPr>
+        <w:br/>
+        <w:t xml:space="preserve">            &lt;/Ellipse.RenderTransform&gt;</w:t>
+      </w:r>
+      <w:r>
+        <w:rPr>
+          <w:rFonts w:ascii="Courier New" w:eastAsia="Times New Roman" w:hAnsi="Courier New" w:cs="Courier New"/>
+          <w:sz w:val="20"/>
+          <w:szCs w:val="20"/>
+          <w:lang w:val="uk-UA" w:eastAsia="uk-UA"/>
+        </w:rPr>
+        <w:br/>
+        <w:t xml:space="preserve">            &lt;Ellipse.Triggers&gt;</w:t>
+      </w:r>
+      <w:r>
+        <w:rPr>
+          <w:rFonts w:ascii="Courier New" w:eastAsia="Times New Roman" w:hAnsi="Courier New" w:cs="Courier New"/>
+          <w:sz w:val="20"/>
+          <w:szCs w:val="20"/>
+          <w:lang w:val="uk-UA" w:eastAsia="uk-UA"/>
+        </w:rPr>
+        <w:br/>
+        <w:t xml:space="preserve">                &lt;EventTrigger RoutedEvent="Ellipse.Loaded"&gt;</w:t>
+      </w:r>
+      <w:r>
+        <w:rPr>
+          <w:rFonts w:ascii="Courier New" w:eastAsia="Times New Roman" w:hAnsi="Courier New" w:cs="Courier New"/>
+          <w:sz w:val="20"/>
+          <w:szCs w:val="20"/>
+          <w:lang w:val="uk-UA" w:eastAsia="uk-UA"/>
+        </w:rPr>
+        <w:br/>
+        <w:t xml:space="preserve">                    &lt;BeginStoryboard x:Name="Ball4Storyboard"&gt;</w:t>
+      </w:r>
+      <w:r>
+        <w:rPr>
+          <w:rFonts w:ascii="Courier New" w:eastAsia="Times New Roman" w:hAnsi="Courier New" w:cs="Courier New"/>
+          <w:sz w:val="20"/>
+          <w:szCs w:val="20"/>
+          <w:lang w:val="uk-UA" w:eastAsia="uk-UA"/>
+        </w:rPr>
+        <w:br/>
+        <w:t xml:space="preserve">                        &lt;Storyboard x:Name="Ball4Animation" RepeatBehavior="Forever"&gt;</w:t>
+      </w:r>
+      <w:r>
+        <w:rPr>
+          <w:rFonts w:ascii="Courier New" w:eastAsia="Times New Roman" w:hAnsi="Courier New" w:cs="Courier New"/>
+          <w:sz w:val="20"/>
+          <w:szCs w:val="20"/>
+          <w:lang w:val="uk-UA" w:eastAsia="uk-UA"/>
+        </w:rPr>
+        <w:br/>
+        <w:t xml:space="preserve">                            &lt;DoubleAnimationUsingKeyFrames Storyboard.TargetName="Ball4Translate"</w:t>
+      </w:r>
+      <w:r>
+        <w:rPr>
+          <w:rFonts w:ascii="Courier New" w:eastAsia="Times New Roman" w:hAnsi="Courier New" w:cs="Courier New"/>
+          <w:sz w:val="20"/>
+          <w:szCs w:val="20"/>
+          <w:lang w:val="uk-UA" w:eastAsia="uk-UA"/>
+        </w:rPr>
+        <w:br/>
+        <w:t xml:space="preserve">                                                          Storyboard.TargetProperty="X"</w:t>
+      </w:r>
+      <w:r>
+        <w:rPr>
+          <w:rFonts w:ascii="Courier New" w:eastAsia="Times New Roman" w:hAnsi="Courier New" w:cs="Courier New"/>
+          <w:sz w:val="20"/>
+          <w:szCs w:val="20"/>
+          <w:lang w:val="uk-UA" w:eastAsia="uk-UA"/>
+        </w:rPr>
+        <w:br/>
+        <w:t xml:space="preserve">                                                          Duration="0:0:3"&gt;</w:t>
+      </w:r>
+      <w:r>
+        <w:rPr>
+          <w:rFonts w:ascii="Courier New" w:eastAsia="Times New Roman" w:hAnsi="Courier New" w:cs="Courier New"/>
+          <w:sz w:val="20"/>
+          <w:szCs w:val="20"/>
+          <w:lang w:val="uk-UA" w:eastAsia="uk-UA"/>
+        </w:rPr>
+        <w:br/>
+        <w:t xml:space="preserve">                                &lt;LinearDoubleKeyFrame Value="0" KeyTime="0:0:0"/&gt;</w:t>
+      </w:r>
+      <w:r>
+        <w:rPr>
+          <w:rFonts w:ascii="Courier New" w:eastAsia="Times New Roman" w:hAnsi="Courier New" w:cs="Courier New"/>
+          <w:sz w:val="20"/>
+          <w:szCs w:val="20"/>
+          <w:lang w:val="uk-UA" w:eastAsia="uk-UA"/>
+        </w:rPr>
+        <w:br/>
+        <w:t xml:space="preserve">                                &lt;LinearDoubleKeyFrame Value="320" KeyTime="0:0:0.75"/&gt;</w:t>
+      </w:r>
+      <w:r>
+        <w:rPr>
+          <w:rFonts w:ascii="Courier New" w:eastAsia="Times New Roman" w:hAnsi="Courier New" w:cs="Courier New"/>
+          <w:sz w:val="20"/>
+          <w:szCs w:val="20"/>
+          <w:lang w:val="uk-UA" w:eastAsia="uk-UA"/>
+        </w:rPr>
+        <w:br/>
+        <w:t xml:space="preserve">                                &lt;LinearDoubleKeyFrame Value="0" KeyTime="0:0:1.5"/&gt;</w:t>
+      </w:r>
+      <w:r>
+        <w:rPr>
+          <w:rFonts w:ascii="Courier New" w:eastAsia="Times New Roman" w:hAnsi="Courier New" w:cs="Courier New"/>
+          <w:sz w:val="20"/>
+          <w:szCs w:val="20"/>
+          <w:lang w:val="uk-UA" w:eastAsia="uk-UA"/>
+        </w:rPr>
+        <w:br/>
+        <w:t xml:space="preserve">                                &lt;LinearDoubleKeyFrame Value="-320" KeyTime="0:0:2.25"/&gt;</w:t>
+      </w:r>
+      <w:r>
+        <w:rPr>
+          <w:rFonts w:ascii="Courier New" w:eastAsia="Times New Roman" w:hAnsi="Courier New" w:cs="Courier New"/>
+          <w:sz w:val="20"/>
+          <w:szCs w:val="20"/>
+          <w:lang w:val="uk-UA" w:eastAsia="uk-UA"/>
+        </w:rPr>
+        <w:br/>
+        <w:t xml:space="preserve">                                &lt;LinearDoubleKeyFrame Value="0" KeyTime="0:0:3"/&gt;</w:t>
+      </w:r>
+      <w:r>
+        <w:rPr>
+          <w:rFonts w:ascii="Courier New" w:eastAsia="Times New Roman" w:hAnsi="Courier New" w:cs="Courier New"/>
+          <w:sz w:val="20"/>
+          <w:szCs w:val="20"/>
+          <w:lang w:val="uk-UA" w:eastAsia="uk-UA"/>
+        </w:rPr>
+        <w:br/>
+        <w:t xml:space="preserve">                            &lt;/DoubleAnimationUsingKeyFrames&gt;</w:t>
+      </w:r>
+      <w:r>
+        <w:rPr>
+          <w:rFonts w:ascii="Courier New" w:eastAsia="Times New Roman" w:hAnsi="Courier New" w:cs="Courier New"/>
+          <w:sz w:val="20"/>
+          <w:szCs w:val="20"/>
+          <w:lang w:val="uk-UA" w:eastAsia="uk-UA"/>
+        </w:rPr>
+        <w:br/>
+        <w:t xml:space="preserve">                            &lt;DoubleAnimationUsingKeyFrames Storyboard.TargetName="Ball4Translate"</w:t>
+      </w:r>
+      <w:r>
+        <w:rPr>
+          <w:rFonts w:ascii="Courier New" w:eastAsia="Times New Roman" w:hAnsi="Courier New" w:cs="Courier New"/>
+          <w:sz w:val="20"/>
+          <w:szCs w:val="20"/>
+          <w:lang w:val="uk-UA" w:eastAsia="uk-UA"/>
+        </w:rPr>
+        <w:br/>
+        <w:t xml:space="preserve">                                                          Storyboard.TargetProperty="Y"</w:t>
+      </w:r>
+      <w:r>
+        <w:rPr>
+          <w:rFonts w:ascii="Courier New" w:eastAsia="Times New Roman" w:hAnsi="Courier New" w:cs="Courier New"/>
+          <w:sz w:val="20"/>
+          <w:szCs w:val="20"/>
+          <w:lang w:val="uk-UA" w:eastAsia="uk-UA"/>
+        </w:rPr>
+        <w:br/>
+        <w:t xml:space="preserve">                                                          Duration="0:0:3"&gt;</w:t>
+      </w:r>
+      <w:r>
+        <w:rPr>
+          <w:rFonts w:ascii="Courier New" w:eastAsia="Times New Roman" w:hAnsi="Courier New" w:cs="Courier New"/>
+          <w:sz w:val="20"/>
+          <w:szCs w:val="20"/>
+          <w:lang w:val="uk-UA" w:eastAsia="uk-UA"/>
+        </w:rPr>
+        <w:br/>
+        <w:t xml:space="preserve">                                &lt;LinearDoubleKeyFrame Value="0" KeyTime="0:0:0"/&gt;</w:t>
+      </w:r>
+      <w:r>
+        <w:rPr>
+          <w:rFonts w:ascii="Courier New" w:eastAsia="Times New Roman" w:hAnsi="Courier New" w:cs="Courier New"/>
+          <w:sz w:val="20"/>
+          <w:szCs w:val="20"/>
+          <w:lang w:val="uk-UA" w:eastAsia="uk-UA"/>
+        </w:rPr>
+        <w:br/>
+        <w:t xml:space="preserve">                                &lt;LinearDoubleKeyFrame Value="320" KeyTime="0:0:0.75"/&gt;</w:t>
+      </w:r>
+      <w:r>
+        <w:rPr>
+          <w:rFonts w:ascii="Courier New" w:eastAsia="Times New Roman" w:hAnsi="Courier New" w:cs="Courier New"/>
+          <w:sz w:val="20"/>
+          <w:szCs w:val="20"/>
+          <w:lang w:val="uk-UA" w:eastAsia="uk-UA"/>
+        </w:rPr>
+        <w:br/>
+        <w:t xml:space="preserve">                                &lt;LinearDoubleKeyFrame Value="640" KeyTime="0:0:1.5"/&gt;</w:t>
+      </w:r>
+      <w:r>
+        <w:rPr>
+          <w:rFonts w:ascii="Courier New" w:eastAsia="Times New Roman" w:hAnsi="Courier New" w:cs="Courier New"/>
+          <w:sz w:val="20"/>
+          <w:szCs w:val="20"/>
+          <w:lang w:val="uk-UA" w:eastAsia="uk-UA"/>
+        </w:rPr>
+        <w:br/>
+        <w:t xml:space="preserve">                                &lt;LinearDoubleKeyFrame Value="320" KeyTime="0:0:2.25"/&gt;</w:t>
+      </w:r>
+      <w:r>
+        <w:rPr>
+          <w:rFonts w:ascii="Courier New" w:eastAsia="Times New Roman" w:hAnsi="Courier New" w:cs="Courier New"/>
+          <w:sz w:val="20"/>
+          <w:szCs w:val="20"/>
+          <w:lang w:val="uk-UA" w:eastAsia="uk-UA"/>
+        </w:rPr>
+        <w:br/>
+        <w:t xml:space="preserve">                                &lt;LinearDoubleKeyFrame Value="0" KeyTime="0:0:3"/&gt;</w:t>
+      </w:r>
+      <w:r>
+        <w:rPr>
+          <w:rFonts w:ascii="Courier New" w:eastAsia="Times New Roman" w:hAnsi="Courier New" w:cs="Courier New"/>
+          <w:sz w:val="20"/>
+          <w:szCs w:val="20"/>
+          <w:lang w:val="uk-UA" w:eastAsia="uk-UA"/>
+        </w:rPr>
+        <w:br/>
+        <w:t xml:space="preserve">                            &lt;/DoubleAnimationUsingKeyFrames&gt;</w:t>
+      </w:r>
+      <w:r>
+        <w:rPr>
+          <w:rFonts w:ascii="Courier New" w:eastAsia="Times New Roman" w:hAnsi="Courier New" w:cs="Courier New"/>
+          <w:sz w:val="20"/>
+          <w:szCs w:val="20"/>
+          <w:lang w:val="uk-UA" w:eastAsia="uk-UA"/>
+        </w:rPr>
+        <w:br/>
+        <w:t xml:space="preserve">                        &lt;/Storyboard&gt;</w:t>
+      </w:r>
+      <w:r>
+        <w:rPr>
+          <w:rFonts w:ascii="Courier New" w:eastAsia="Times New Roman" w:hAnsi="Courier New" w:cs="Courier New"/>
+          <w:sz w:val="20"/>
+          <w:szCs w:val="20"/>
+          <w:lang w:val="uk-UA" w:eastAsia="uk-UA"/>
+        </w:rPr>
+        <w:br/>
+        <w:t xml:space="preserve">                    &lt;/BeginStoryboard&gt;</w:t>
+      </w:r>
+      <w:r>
+        <w:rPr>
+          <w:rFonts w:ascii="Courier New" w:eastAsia="Times New Roman" w:hAnsi="Courier New" w:cs="Courier New"/>
+          <w:sz w:val="20"/>
+          <w:szCs w:val="20"/>
+          <w:lang w:val="uk-UA" w:eastAsia="uk-UA"/>
+        </w:rPr>
+        <w:br/>
+        <w:t xml:space="preserve">                &lt;/EventTrigger&gt;</w:t>
+      </w:r>
+      <w:r>
+        <w:rPr>
+          <w:rFonts w:ascii="Courier New" w:eastAsia="Times New Roman" w:hAnsi="Courier New" w:cs="Courier New"/>
+          <w:sz w:val="20"/>
+          <w:szCs w:val="20"/>
+          <w:lang w:val="uk-UA" w:eastAsia="uk-UA"/>
+        </w:rPr>
+        <w:br/>
+        <w:t xml:space="preserve">            &lt;/Ellipse.Triggers&gt;</w:t>
+      </w:r>
+      <w:r>
+        <w:rPr>
+          <w:rFonts w:ascii="Courier New" w:eastAsia="Times New Roman" w:hAnsi="Courier New" w:cs="Courier New"/>
+          <w:sz w:val="20"/>
+          <w:szCs w:val="20"/>
+          <w:lang w:val="uk-UA" w:eastAsia="uk-UA"/>
+        </w:rPr>
+        <w:br/>
+        <w:t xml:space="preserve">        &lt;/Ellipse&gt;</w:t>
+      </w:r>
+      <w:r>
+        <w:rPr>
+          <w:rFonts w:ascii="Courier New" w:eastAsia="Times New Roman" w:hAnsi="Courier New" w:cs="Courier New"/>
+          <w:sz w:val="20"/>
+          <w:szCs w:val="20"/>
+          <w:lang w:val="uk-UA" w:eastAsia="uk-UA"/>
+        </w:rPr>
+        <w:br/>
+      </w:r>
+      <w:r>
+        <w:rPr>
+          <w:rFonts w:ascii="Courier New" w:eastAsia="Times New Roman" w:hAnsi="Courier New" w:cs="Courier New"/>
+          <w:sz w:val="20"/>
+          <w:szCs w:val="20"/>
+          <w:lang w:val="uk-UA" w:eastAsia="uk-UA"/>
+        </w:rPr>
+        <w:br/>
+        <w:t xml:space="preserve">        </w:t>
+      </w:r>
+      <w:r>
+        <w:rPr>
+          <w:rFonts w:ascii="Courier New" w:eastAsia="Times New Roman" w:hAnsi="Courier New" w:cs="Courier New"/>
+          <w:i/>
+          <w:iCs/>
+          <w:sz w:val="20"/>
+          <w:szCs w:val="20"/>
+          <w:lang w:val="uk-UA" w:eastAsia="uk-UA"/>
+        </w:rPr>
+        <w:t>&lt;!-- Кулька 5 - Пурпурна (середні швидкі кола) --&gt;</w:t>
+      </w:r>
+      <w:r>
+        <w:rPr>
+          <w:rFonts w:ascii="Courier New" w:eastAsia="Times New Roman" w:hAnsi="Courier New" w:cs="Courier New"/>
+          <w:i/>
+          <w:iCs/>
+          <w:sz w:val="20"/>
+          <w:szCs w:val="20"/>
+          <w:lang w:val="uk-UA" w:eastAsia="uk-UA"/>
+        </w:rPr>
+        <w:br/>
+        <w:t xml:space="preserve">        </w:t>
+      </w:r>
+      <w:r>
+        <w:rPr>
+          <w:rFonts w:ascii="Courier New" w:eastAsia="Times New Roman" w:hAnsi="Courier New" w:cs="Courier New"/>
+          <w:sz w:val="20"/>
+          <w:szCs w:val="20"/>
+          <w:lang w:val="uk-UA" w:eastAsia="uk-UA"/>
+        </w:rPr>
+        <w:t xml:space="preserve">&lt;Ellipse x:Name="Ball5" </w:t>
+      </w:r>
+      <w:r>
+        <w:rPr>
+          <w:rFonts w:ascii="Courier New" w:eastAsia="Times New Roman" w:hAnsi="Courier New" w:cs="Courier New"/>
+          <w:sz w:val="20"/>
+          <w:szCs w:val="20"/>
+          <w:lang w:val="uk-UA" w:eastAsia="uk-UA"/>
+        </w:rPr>
+        <w:br/>
+        <w:t xml:space="preserve">                 Width="130" Height="130"</w:t>
+      </w:r>
+      <w:r>
+        <w:rPr>
+          <w:rFonts w:ascii="Courier New" w:eastAsia="Times New Roman" w:hAnsi="Courier New" w:cs="Courier New"/>
+          <w:sz w:val="20"/>
+          <w:szCs w:val="20"/>
+          <w:lang w:val="uk-UA" w:eastAsia="uk-UA"/>
+        </w:rPr>
+        <w:br/>
+        <w:t xml:space="preserve">                 Fill="Magenta" </w:t>
+      </w:r>
+      <w:r>
+        <w:rPr>
+          <w:rFonts w:ascii="Courier New" w:eastAsia="Times New Roman" w:hAnsi="Courier New" w:cs="Courier New"/>
+          <w:sz w:val="20"/>
+          <w:szCs w:val="20"/>
+          <w:lang w:val="uk-UA" w:eastAsia="uk-UA"/>
+        </w:rPr>
+        <w:br/>
+        <w:t xml:space="preserve">                 Stroke="Black" </w:t>
+      </w:r>
+      <w:r>
+        <w:rPr>
+          <w:rFonts w:ascii="Courier New" w:eastAsia="Times New Roman" w:hAnsi="Courier New" w:cs="Courier New"/>
+          <w:sz w:val="20"/>
+          <w:szCs w:val="20"/>
+          <w:lang w:val="uk-UA" w:eastAsia="uk-UA"/>
+        </w:rPr>
+        <w:br/>
+        <w:t xml:space="preserve">                 StrokeThickness="2"</w:t>
+      </w:r>
+      <w:r>
+        <w:rPr>
+          <w:rFonts w:ascii="Courier New" w:eastAsia="Times New Roman" w:hAnsi="Courier New" w:cs="Courier New"/>
+          <w:sz w:val="20"/>
+          <w:szCs w:val="20"/>
+          <w:lang w:val="uk-UA" w:eastAsia="uk-UA"/>
+        </w:rPr>
+        <w:br/>
+        <w:t xml:space="preserve">                 Canvas.Left="940" </w:t>
+      </w:r>
+      <w:r>
+        <w:rPr>
+          <w:rFonts w:ascii="Courier New" w:eastAsia="Times New Roman" w:hAnsi="Courier New" w:cs="Courier New"/>
+          <w:sz w:val="20"/>
+          <w:szCs w:val="20"/>
+          <w:lang w:val="uk-UA" w:eastAsia="uk-UA"/>
+        </w:rPr>
+        <w:br/>
+        <w:t xml:space="preserve">                 Canvas.Top="260"</w:t>
+      </w:r>
+      <w:r>
+        <w:rPr>
+          <w:rFonts w:ascii="Courier New" w:eastAsia="Times New Roman" w:hAnsi="Courier New" w:cs="Courier New"/>
+          <w:sz w:val="20"/>
+          <w:szCs w:val="20"/>
+          <w:lang w:val="uk-UA" w:eastAsia="uk-UA"/>
+        </w:rPr>
+        <w:br/>
+        <w:t xml:space="preserve">                 MouseEnter="Ellipse_MouseEnter"</w:t>
+      </w:r>
+      <w:r>
+        <w:rPr>
+          <w:rFonts w:ascii="Courier New" w:eastAsia="Times New Roman" w:hAnsi="Courier New" w:cs="Courier New"/>
+          <w:sz w:val="20"/>
+          <w:szCs w:val="20"/>
+          <w:lang w:val="uk-UA" w:eastAsia="uk-UA"/>
+        </w:rPr>
+        <w:br/>
+        <w:t xml:space="preserve">                 MouseLeave="Ellipse_MouseLeave"</w:t>
+      </w:r>
+      <w:r>
+        <w:rPr>
+          <w:rFonts w:ascii="Courier New" w:eastAsia="Times New Roman" w:hAnsi="Courier New" w:cs="Courier New"/>
+          <w:sz w:val="20"/>
+          <w:szCs w:val="20"/>
+          <w:lang w:val="uk-UA" w:eastAsia="uk-UA"/>
+        </w:rPr>
+        <w:br/>
+        <w:t xml:space="preserve">                 MouseLeftButtonDown="Ellipse_MouseLeftButtonDown"&gt;</w:t>
+      </w:r>
+      <w:r>
+        <w:rPr>
+          <w:rFonts w:ascii="Courier New" w:eastAsia="Times New Roman" w:hAnsi="Courier New" w:cs="Courier New"/>
+          <w:sz w:val="20"/>
+          <w:szCs w:val="20"/>
+          <w:lang w:val="uk-UA" w:eastAsia="uk-UA"/>
+        </w:rPr>
+        <w:br/>
+        <w:t xml:space="preserve">            &lt;Ellipse.RenderTransform&gt;</w:t>
+      </w:r>
+      <w:r>
+        <w:rPr>
+          <w:rFonts w:ascii="Courier New" w:eastAsia="Times New Roman" w:hAnsi="Courier New" w:cs="Courier New"/>
+          <w:sz w:val="20"/>
+          <w:szCs w:val="20"/>
+          <w:lang w:val="uk-UA" w:eastAsia="uk-UA"/>
+        </w:rPr>
+        <w:br/>
+        <w:t xml:space="preserve">                &lt;TransformGroup&gt;</w:t>
+      </w:r>
+      <w:r>
+        <w:rPr>
+          <w:rFonts w:ascii="Courier New" w:eastAsia="Times New Roman" w:hAnsi="Courier New" w:cs="Courier New"/>
+          <w:sz w:val="20"/>
+          <w:szCs w:val="20"/>
+          <w:lang w:val="uk-UA" w:eastAsia="uk-UA"/>
+        </w:rPr>
+        <w:br/>
+        <w:t xml:space="preserve">                    &lt;TranslateTransform x:Name="Ball5Translate"/&gt;</w:t>
+      </w:r>
+      <w:r>
+        <w:rPr>
+          <w:rFonts w:ascii="Courier New" w:eastAsia="Times New Roman" w:hAnsi="Courier New" w:cs="Courier New"/>
+          <w:sz w:val="20"/>
+          <w:szCs w:val="20"/>
+          <w:lang w:val="uk-UA" w:eastAsia="uk-UA"/>
+        </w:rPr>
+        <w:br/>
+        <w:t xml:space="preserve">                &lt;/TransformGroup&gt;</w:t>
+      </w:r>
+      <w:r>
+        <w:rPr>
+          <w:rFonts w:ascii="Courier New" w:eastAsia="Times New Roman" w:hAnsi="Courier New" w:cs="Courier New"/>
+          <w:sz w:val="20"/>
+          <w:szCs w:val="20"/>
+          <w:lang w:val="uk-UA" w:eastAsia="uk-UA"/>
+        </w:rPr>
+        <w:br/>
+      </w:r>
+      <w:r>
+        <w:rPr>
+          <w:rFonts w:ascii="Courier New" w:eastAsia="Times New Roman" w:hAnsi="Courier New" w:cs="Courier New"/>
+          <w:sz w:val="20"/>
+          <w:szCs w:val="20"/>
+          <w:lang w:val="uk-UA" w:eastAsia="uk-UA"/>
+        </w:rPr>
+        <w:lastRenderedPageBreak/>
+        <w:t xml:space="preserve">            &lt;/Ellipse.RenderTransform&gt;</w:t>
+      </w:r>
+      <w:r>
+        <w:rPr>
+          <w:rFonts w:ascii="Courier New" w:eastAsia="Times New Roman" w:hAnsi="Courier New" w:cs="Courier New"/>
+          <w:sz w:val="20"/>
+          <w:szCs w:val="20"/>
+          <w:lang w:val="uk-UA" w:eastAsia="uk-UA"/>
+        </w:rPr>
+        <w:br/>
+        <w:t xml:space="preserve">            &lt;Ellipse.Triggers&gt;</w:t>
+      </w:r>
+      <w:r>
+        <w:rPr>
+          <w:rFonts w:ascii="Courier New" w:eastAsia="Times New Roman" w:hAnsi="Courier New" w:cs="Courier New"/>
+          <w:sz w:val="20"/>
+          <w:szCs w:val="20"/>
+          <w:lang w:val="uk-UA" w:eastAsia="uk-UA"/>
+        </w:rPr>
+        <w:br/>
+        <w:t xml:space="preserve">                &lt;EventTrigger RoutedEvent="Ellipse.Loaded"&gt;</w:t>
+      </w:r>
+      <w:r>
+        <w:rPr>
+          <w:rFonts w:ascii="Courier New" w:eastAsia="Times New Roman" w:hAnsi="Courier New" w:cs="Courier New"/>
+          <w:sz w:val="20"/>
+          <w:szCs w:val="20"/>
+          <w:lang w:val="uk-UA" w:eastAsia="uk-UA"/>
+        </w:rPr>
+        <w:br/>
+        <w:t xml:space="preserve">                    &lt;BeginStoryboard x:Name="Ball5Storyboard"&gt;</w:t>
+      </w:r>
+      <w:r>
+        <w:rPr>
+          <w:rFonts w:ascii="Courier New" w:eastAsia="Times New Roman" w:hAnsi="Courier New" w:cs="Courier New"/>
+          <w:sz w:val="20"/>
+          <w:szCs w:val="20"/>
+          <w:lang w:val="uk-UA" w:eastAsia="uk-UA"/>
+        </w:rPr>
+        <w:br/>
+        <w:t xml:space="preserve">                        &lt;Storyboard x:Name="Ball5Animation" RepeatBehavior="Forever"&gt;</w:t>
+      </w:r>
+      <w:r>
+        <w:rPr>
+          <w:rFonts w:ascii="Courier New" w:eastAsia="Times New Roman" w:hAnsi="Courier New" w:cs="Courier New"/>
+          <w:sz w:val="20"/>
+          <w:szCs w:val="20"/>
+          <w:lang w:val="uk-UA" w:eastAsia="uk-UA"/>
+        </w:rPr>
+        <w:br/>
+        <w:t xml:space="preserve">                            &lt;DoubleAnimationUsingKeyFrames Storyboard.TargetName="Ball5Translate"</w:t>
+      </w:r>
+      <w:r>
+        <w:rPr>
+          <w:rFonts w:ascii="Courier New" w:eastAsia="Times New Roman" w:hAnsi="Courier New" w:cs="Courier New"/>
+          <w:sz w:val="20"/>
+          <w:szCs w:val="20"/>
+          <w:lang w:val="uk-UA" w:eastAsia="uk-UA"/>
+        </w:rPr>
+        <w:br/>
+        <w:t xml:space="preserve">                                                          Storyboard.TargetProperty="X"</w:t>
+      </w:r>
+      <w:r>
+        <w:rPr>
+          <w:rFonts w:ascii="Courier New" w:eastAsia="Times New Roman" w:hAnsi="Courier New" w:cs="Courier New"/>
+          <w:sz w:val="20"/>
+          <w:szCs w:val="20"/>
+          <w:lang w:val="uk-UA" w:eastAsia="uk-UA"/>
+        </w:rPr>
+        <w:br/>
+        <w:t xml:space="preserve">                                                          Duration="0:0:2.5"&gt;</w:t>
+      </w:r>
+      <w:r>
+        <w:rPr>
+          <w:rFonts w:ascii="Courier New" w:eastAsia="Times New Roman" w:hAnsi="Courier New" w:cs="Courier New"/>
+          <w:sz w:val="20"/>
+          <w:szCs w:val="20"/>
+          <w:lang w:val="uk-UA" w:eastAsia="uk-UA"/>
+        </w:rPr>
+        <w:br/>
+        <w:t xml:space="preserve">                                &lt;LinearDoubleKeyFrame Value="0" KeyTime="0:0:0"/&gt;</w:t>
+      </w:r>
+      <w:r>
+        <w:rPr>
+          <w:rFonts w:ascii="Courier New" w:eastAsia="Times New Roman" w:hAnsi="Courier New" w:cs="Courier New"/>
+          <w:sz w:val="20"/>
+          <w:szCs w:val="20"/>
+          <w:lang w:val="uk-UA" w:eastAsia="uk-UA"/>
+        </w:rPr>
+        <w:br/>
+        <w:t xml:space="preserve">                                &lt;LinearDoubleKeyFrame Value="280" KeyTime="0:0:0.625"/&gt;</w:t>
+      </w:r>
+      <w:r>
+        <w:rPr>
+          <w:rFonts w:ascii="Courier New" w:eastAsia="Times New Roman" w:hAnsi="Courier New" w:cs="Courier New"/>
+          <w:sz w:val="20"/>
+          <w:szCs w:val="20"/>
+          <w:lang w:val="uk-UA" w:eastAsia="uk-UA"/>
+        </w:rPr>
+        <w:br/>
+        <w:t xml:space="preserve">                                &lt;LinearDoubleKeyFrame Value="0" KeyTime="0:0:1.25"/&gt;</w:t>
+      </w:r>
+      <w:r>
+        <w:rPr>
+          <w:rFonts w:ascii="Courier New" w:eastAsia="Times New Roman" w:hAnsi="Courier New" w:cs="Courier New"/>
+          <w:sz w:val="20"/>
+          <w:szCs w:val="20"/>
+          <w:lang w:val="uk-UA" w:eastAsia="uk-UA"/>
+        </w:rPr>
+        <w:br/>
+        <w:t xml:space="preserve">                                &lt;LinearDoubleKeyFrame Value="-280" KeyTime="0:0:1.875"/&gt;</w:t>
+      </w:r>
+      <w:r>
+        <w:rPr>
+          <w:rFonts w:ascii="Courier New" w:eastAsia="Times New Roman" w:hAnsi="Courier New" w:cs="Courier New"/>
+          <w:sz w:val="20"/>
+          <w:szCs w:val="20"/>
+          <w:lang w:val="uk-UA" w:eastAsia="uk-UA"/>
+        </w:rPr>
+        <w:br/>
+        <w:t xml:space="preserve">                                &lt;LinearDoubleKeyFrame Value="0" KeyTime="0:0:2.5"/&gt;</w:t>
+      </w:r>
+      <w:r>
+        <w:rPr>
+          <w:rFonts w:ascii="Courier New" w:eastAsia="Times New Roman" w:hAnsi="Courier New" w:cs="Courier New"/>
+          <w:sz w:val="20"/>
+          <w:szCs w:val="20"/>
+          <w:lang w:val="uk-UA" w:eastAsia="uk-UA"/>
+        </w:rPr>
+        <w:br/>
+        <w:t xml:space="preserve">                            &lt;/DoubleAnimationUsingKeyFrames&gt;</w:t>
+      </w:r>
+      <w:r>
+        <w:rPr>
+          <w:rFonts w:ascii="Courier New" w:eastAsia="Times New Roman" w:hAnsi="Courier New" w:cs="Courier New"/>
+          <w:sz w:val="20"/>
+          <w:szCs w:val="20"/>
+          <w:lang w:val="uk-UA" w:eastAsia="uk-UA"/>
+        </w:rPr>
+        <w:br/>
+        <w:t xml:space="preserve">                            &lt;DoubleAnimationUsingKeyFrames Storyboard.TargetName="Ball5Translate"</w:t>
+      </w:r>
+      <w:r>
+        <w:rPr>
+          <w:rFonts w:ascii="Courier New" w:eastAsia="Times New Roman" w:hAnsi="Courier New" w:cs="Courier New"/>
+          <w:sz w:val="20"/>
+          <w:szCs w:val="20"/>
+          <w:lang w:val="uk-UA" w:eastAsia="uk-UA"/>
+        </w:rPr>
+        <w:br/>
+        <w:t xml:space="preserve">                                                          Storyboard.TargetProperty="Y"</w:t>
+      </w:r>
+      <w:r>
+        <w:rPr>
+          <w:rFonts w:ascii="Courier New" w:eastAsia="Times New Roman" w:hAnsi="Courier New" w:cs="Courier New"/>
+          <w:sz w:val="20"/>
+          <w:szCs w:val="20"/>
+          <w:lang w:val="uk-UA" w:eastAsia="uk-UA"/>
+        </w:rPr>
+        <w:br/>
+        <w:t xml:space="preserve">                                                          Duration="0:0:2.5"&gt;</w:t>
+      </w:r>
+      <w:r>
+        <w:rPr>
+          <w:rFonts w:ascii="Courier New" w:eastAsia="Times New Roman" w:hAnsi="Courier New" w:cs="Courier New"/>
+          <w:sz w:val="20"/>
+          <w:szCs w:val="20"/>
+          <w:lang w:val="uk-UA" w:eastAsia="uk-UA"/>
+        </w:rPr>
+        <w:br/>
+        <w:t xml:space="preserve">                                &lt;LinearDoubleKeyFrame Value="0" KeyTime="0:0:0"/&gt;</w:t>
+      </w:r>
+      <w:r>
+        <w:rPr>
+          <w:rFonts w:ascii="Courier New" w:eastAsia="Times New Roman" w:hAnsi="Courier New" w:cs="Courier New"/>
+          <w:sz w:val="20"/>
+          <w:szCs w:val="20"/>
+          <w:lang w:val="uk-UA" w:eastAsia="uk-UA"/>
+        </w:rPr>
+        <w:br/>
+        <w:t xml:space="preserve">                                &lt;LinearDoubleKeyFrame Value="280" KeyTime="0:0:0.625"/&gt;</w:t>
+      </w:r>
+      <w:r>
+        <w:rPr>
+          <w:rFonts w:ascii="Courier New" w:eastAsia="Times New Roman" w:hAnsi="Courier New" w:cs="Courier New"/>
+          <w:sz w:val="20"/>
+          <w:szCs w:val="20"/>
+          <w:lang w:val="uk-UA" w:eastAsia="uk-UA"/>
+        </w:rPr>
+        <w:br/>
+        <w:t xml:space="preserve">                                &lt;LinearDoubleKeyFrame Value="560" KeyTime="0:0:1.25"/&gt;</w:t>
+      </w:r>
+      <w:r>
+        <w:rPr>
+          <w:rFonts w:ascii="Courier New" w:eastAsia="Times New Roman" w:hAnsi="Courier New" w:cs="Courier New"/>
+          <w:sz w:val="20"/>
+          <w:szCs w:val="20"/>
+          <w:lang w:val="uk-UA" w:eastAsia="uk-UA"/>
+        </w:rPr>
+        <w:br/>
+        <w:t xml:space="preserve">                                &lt;LinearDoubleKeyFrame Value="280" KeyTime="0:0:1.875"/&gt;</w:t>
+      </w:r>
+      <w:r>
+        <w:rPr>
+          <w:rFonts w:ascii="Courier New" w:eastAsia="Times New Roman" w:hAnsi="Courier New" w:cs="Courier New"/>
+          <w:sz w:val="20"/>
+          <w:szCs w:val="20"/>
+          <w:lang w:val="uk-UA" w:eastAsia="uk-UA"/>
+        </w:rPr>
+        <w:br/>
+        <w:t xml:space="preserve">                                &lt;LinearDoubleKeyFrame Value="0" KeyTime="0:0:2.5"/&gt;</w:t>
+      </w:r>
+      <w:r>
+        <w:rPr>
+          <w:rFonts w:ascii="Courier New" w:eastAsia="Times New Roman" w:hAnsi="Courier New" w:cs="Courier New"/>
+          <w:sz w:val="20"/>
+          <w:szCs w:val="20"/>
+          <w:lang w:val="uk-UA" w:eastAsia="uk-UA"/>
+        </w:rPr>
+        <w:br/>
+        <w:t xml:space="preserve">                            &lt;/DoubleAnimationUsingKeyFrames&gt;</w:t>
+      </w:r>
+      <w:r>
+        <w:rPr>
+          <w:rFonts w:ascii="Courier New" w:eastAsia="Times New Roman" w:hAnsi="Courier New" w:cs="Courier New"/>
+          <w:sz w:val="20"/>
+          <w:szCs w:val="20"/>
+          <w:lang w:val="uk-UA" w:eastAsia="uk-UA"/>
+        </w:rPr>
+        <w:br/>
+        <w:t xml:space="preserve">                        &lt;/Storyboard&gt;</w:t>
+      </w:r>
+      <w:r>
+        <w:rPr>
+          <w:rFonts w:ascii="Courier New" w:eastAsia="Times New Roman" w:hAnsi="Courier New" w:cs="Courier New"/>
+          <w:sz w:val="20"/>
+          <w:szCs w:val="20"/>
+          <w:lang w:val="uk-UA" w:eastAsia="uk-UA"/>
+        </w:rPr>
+        <w:br/>
+        <w:t xml:space="preserve">                    &lt;/BeginStoryboard&gt;</w:t>
+      </w:r>
+      <w:r>
+        <w:rPr>
+          <w:rFonts w:ascii="Courier New" w:eastAsia="Times New Roman" w:hAnsi="Courier New" w:cs="Courier New"/>
+          <w:sz w:val="20"/>
+          <w:szCs w:val="20"/>
+          <w:lang w:val="uk-UA" w:eastAsia="uk-UA"/>
+        </w:rPr>
+        <w:br/>
+        <w:t xml:space="preserve">                &lt;/EventTrigger&gt;</w:t>
+      </w:r>
+      <w:r>
+        <w:rPr>
+          <w:rFonts w:ascii="Courier New" w:eastAsia="Times New Roman" w:hAnsi="Courier New" w:cs="Courier New"/>
+          <w:sz w:val="20"/>
+          <w:szCs w:val="20"/>
+          <w:lang w:val="uk-UA" w:eastAsia="uk-UA"/>
+        </w:rPr>
+        <w:br/>
+        <w:t xml:space="preserve">            &lt;/Ellipse.Triggers&gt;</w:t>
+      </w:r>
+      <w:r>
+        <w:rPr>
+          <w:rFonts w:ascii="Courier New" w:eastAsia="Times New Roman" w:hAnsi="Courier New" w:cs="Courier New"/>
+          <w:sz w:val="20"/>
+          <w:szCs w:val="20"/>
+          <w:lang w:val="uk-UA" w:eastAsia="uk-UA"/>
+        </w:rPr>
+        <w:br/>
+        <w:t xml:space="preserve">        &lt;/Ellipse&gt;</w:t>
+      </w:r>
+      <w:r>
+        <w:rPr>
+          <w:rFonts w:ascii="Courier New" w:eastAsia="Times New Roman" w:hAnsi="Courier New" w:cs="Courier New"/>
+          <w:sz w:val="20"/>
+          <w:szCs w:val="20"/>
+          <w:lang w:val="uk-UA" w:eastAsia="uk-UA"/>
+        </w:rPr>
+        <w:br/>
+      </w:r>
+      <w:r>
+        <w:rPr>
+          <w:rFonts w:ascii="Courier New" w:eastAsia="Times New Roman" w:hAnsi="Courier New" w:cs="Courier New"/>
+          <w:sz w:val="20"/>
+          <w:szCs w:val="20"/>
+          <w:lang w:val="uk-UA" w:eastAsia="uk-UA"/>
+        </w:rPr>
+        <w:br/>
+        <w:t xml:space="preserve">        </w:t>
+      </w:r>
+      <w:r>
+        <w:rPr>
+          <w:rFonts w:ascii="Courier New" w:eastAsia="Times New Roman" w:hAnsi="Courier New" w:cs="Courier New"/>
+          <w:i/>
+          <w:iCs/>
+          <w:sz w:val="20"/>
+          <w:szCs w:val="20"/>
+          <w:lang w:val="uk-UA" w:eastAsia="uk-UA"/>
+        </w:rPr>
+        <w:t>&lt;!-- Кулька 6 - Блакитна (малі повільні кола) --&gt;</w:t>
+      </w:r>
+      <w:r>
+        <w:rPr>
+          <w:rFonts w:ascii="Courier New" w:eastAsia="Times New Roman" w:hAnsi="Courier New" w:cs="Courier New"/>
+          <w:i/>
+          <w:iCs/>
+          <w:sz w:val="20"/>
+          <w:szCs w:val="20"/>
+          <w:lang w:val="uk-UA" w:eastAsia="uk-UA"/>
+        </w:rPr>
+        <w:br/>
+        <w:t xml:space="preserve">        </w:t>
+      </w:r>
+      <w:r>
+        <w:rPr>
+          <w:rFonts w:ascii="Courier New" w:eastAsia="Times New Roman" w:hAnsi="Courier New" w:cs="Courier New"/>
+          <w:sz w:val="20"/>
+          <w:szCs w:val="20"/>
+          <w:lang w:val="uk-UA" w:eastAsia="uk-UA"/>
+        </w:rPr>
+        <w:t xml:space="preserve">&lt;Ellipse x:Name="Ball6" </w:t>
+      </w:r>
+      <w:r>
+        <w:rPr>
+          <w:rFonts w:ascii="Courier New" w:eastAsia="Times New Roman" w:hAnsi="Courier New" w:cs="Courier New"/>
+          <w:sz w:val="20"/>
+          <w:szCs w:val="20"/>
+          <w:lang w:val="uk-UA" w:eastAsia="uk-UA"/>
+        </w:rPr>
+        <w:br/>
+        <w:t xml:space="preserve">                 Width="116" Height="116"</w:t>
+      </w:r>
+      <w:r>
+        <w:rPr>
+          <w:rFonts w:ascii="Courier New" w:eastAsia="Times New Roman" w:hAnsi="Courier New" w:cs="Courier New"/>
+          <w:sz w:val="20"/>
+          <w:szCs w:val="20"/>
+          <w:lang w:val="uk-UA" w:eastAsia="uk-UA"/>
+        </w:rPr>
+        <w:br/>
+        <w:t xml:space="preserve">                 Fill="Cyan" </w:t>
+      </w:r>
+      <w:r>
+        <w:rPr>
+          <w:rFonts w:ascii="Courier New" w:eastAsia="Times New Roman" w:hAnsi="Courier New" w:cs="Courier New"/>
+          <w:sz w:val="20"/>
+          <w:szCs w:val="20"/>
+          <w:lang w:val="uk-UA" w:eastAsia="uk-UA"/>
+        </w:rPr>
+        <w:br/>
+        <w:t xml:space="preserve">                 Stroke="Black" </w:t>
+      </w:r>
+      <w:r>
+        <w:rPr>
+          <w:rFonts w:ascii="Courier New" w:eastAsia="Times New Roman" w:hAnsi="Courier New" w:cs="Courier New"/>
+          <w:sz w:val="20"/>
+          <w:szCs w:val="20"/>
+          <w:lang w:val="uk-UA" w:eastAsia="uk-UA"/>
+        </w:rPr>
+        <w:br/>
+        <w:t xml:space="preserve">                 StrokeThickness="2"</w:t>
+      </w:r>
+      <w:r>
+        <w:rPr>
+          <w:rFonts w:ascii="Courier New" w:eastAsia="Times New Roman" w:hAnsi="Courier New" w:cs="Courier New"/>
+          <w:sz w:val="20"/>
+          <w:szCs w:val="20"/>
+          <w:lang w:val="uk-UA" w:eastAsia="uk-UA"/>
+        </w:rPr>
+        <w:br/>
+        <w:t xml:space="preserve">                 Canvas.Left="542" </w:t>
+      </w:r>
+      <w:r>
+        <w:rPr>
+          <w:rFonts w:ascii="Courier New" w:eastAsia="Times New Roman" w:hAnsi="Courier New" w:cs="Courier New"/>
+          <w:sz w:val="20"/>
+          <w:szCs w:val="20"/>
+          <w:lang w:val="uk-UA" w:eastAsia="uk-UA"/>
+        </w:rPr>
+        <w:br/>
+        <w:t xml:space="preserve">                 Canvas.Top="422"</w:t>
+      </w:r>
+      <w:r>
+        <w:rPr>
+          <w:rFonts w:ascii="Courier New" w:eastAsia="Times New Roman" w:hAnsi="Courier New" w:cs="Courier New"/>
+          <w:sz w:val="20"/>
+          <w:szCs w:val="20"/>
+          <w:lang w:val="uk-UA" w:eastAsia="uk-UA"/>
+        </w:rPr>
+        <w:br/>
+        <w:t xml:space="preserve">                 MouseEnter="Ellipse_MouseEnter"</w:t>
+      </w:r>
+      <w:r>
+        <w:rPr>
+          <w:rFonts w:ascii="Courier New" w:eastAsia="Times New Roman" w:hAnsi="Courier New" w:cs="Courier New"/>
+          <w:sz w:val="20"/>
+          <w:szCs w:val="20"/>
+          <w:lang w:val="uk-UA" w:eastAsia="uk-UA"/>
+        </w:rPr>
+        <w:br/>
+        <w:t xml:space="preserve">                 MouseLeave="Ellipse_MouseLeave"</w:t>
+      </w:r>
+      <w:r>
+        <w:rPr>
+          <w:rFonts w:ascii="Courier New" w:eastAsia="Times New Roman" w:hAnsi="Courier New" w:cs="Courier New"/>
+          <w:sz w:val="20"/>
+          <w:szCs w:val="20"/>
+          <w:lang w:val="uk-UA" w:eastAsia="uk-UA"/>
+        </w:rPr>
+        <w:br/>
+        <w:t xml:space="preserve">                 MouseLeftButtonDown="Ellipse_MouseLeftButtonDown"&gt;</w:t>
+      </w:r>
+      <w:r>
+        <w:rPr>
+          <w:rFonts w:ascii="Courier New" w:eastAsia="Times New Roman" w:hAnsi="Courier New" w:cs="Courier New"/>
+          <w:sz w:val="20"/>
+          <w:szCs w:val="20"/>
+          <w:lang w:val="uk-UA" w:eastAsia="uk-UA"/>
+        </w:rPr>
+        <w:br/>
+        <w:t xml:space="preserve">            &lt;Ellipse.RenderTransform&gt;</w:t>
+      </w:r>
+      <w:r>
+        <w:rPr>
+          <w:rFonts w:ascii="Courier New" w:eastAsia="Times New Roman" w:hAnsi="Courier New" w:cs="Courier New"/>
+          <w:sz w:val="20"/>
+          <w:szCs w:val="20"/>
+          <w:lang w:val="uk-UA" w:eastAsia="uk-UA"/>
+        </w:rPr>
+        <w:br/>
+        <w:t xml:space="preserve">                &lt;TransformGroup&gt;</w:t>
+      </w:r>
+      <w:r>
+        <w:rPr>
+          <w:rFonts w:ascii="Courier New" w:eastAsia="Times New Roman" w:hAnsi="Courier New" w:cs="Courier New"/>
+          <w:sz w:val="20"/>
+          <w:szCs w:val="20"/>
+          <w:lang w:val="uk-UA" w:eastAsia="uk-UA"/>
+        </w:rPr>
+        <w:br/>
+        <w:t xml:space="preserve">                    &lt;TranslateTransform x:Name="Ball6Translate"/&gt;</w:t>
+      </w:r>
+      <w:r>
+        <w:rPr>
+          <w:rFonts w:ascii="Courier New" w:eastAsia="Times New Roman" w:hAnsi="Courier New" w:cs="Courier New"/>
+          <w:sz w:val="20"/>
+          <w:szCs w:val="20"/>
+          <w:lang w:val="uk-UA" w:eastAsia="uk-UA"/>
+        </w:rPr>
+        <w:br/>
+        <w:t xml:space="preserve">                &lt;/TransformGroup&gt;</w:t>
+      </w:r>
+      <w:r>
+        <w:rPr>
+          <w:rFonts w:ascii="Courier New" w:eastAsia="Times New Roman" w:hAnsi="Courier New" w:cs="Courier New"/>
+          <w:sz w:val="20"/>
+          <w:szCs w:val="20"/>
+          <w:lang w:val="uk-UA" w:eastAsia="uk-UA"/>
+        </w:rPr>
+        <w:br/>
+        <w:t xml:space="preserve">            &lt;/Ellipse.RenderTransform&gt;</w:t>
+      </w:r>
+      <w:r>
+        <w:rPr>
+          <w:rFonts w:ascii="Courier New" w:eastAsia="Times New Roman" w:hAnsi="Courier New" w:cs="Courier New"/>
+          <w:sz w:val="20"/>
+          <w:szCs w:val="20"/>
+          <w:lang w:val="uk-UA" w:eastAsia="uk-UA"/>
+        </w:rPr>
+        <w:br/>
+        <w:t xml:space="preserve">            &lt;Ellipse.Triggers&gt;</w:t>
+      </w:r>
+      <w:r>
+        <w:rPr>
+          <w:rFonts w:ascii="Courier New" w:eastAsia="Times New Roman" w:hAnsi="Courier New" w:cs="Courier New"/>
+          <w:sz w:val="20"/>
+          <w:szCs w:val="20"/>
+          <w:lang w:val="uk-UA" w:eastAsia="uk-UA"/>
+        </w:rPr>
+        <w:br/>
+        <w:t xml:space="preserve">                &lt;EventTrigger RoutedEvent="Ellipse.Loaded"&gt;</w:t>
+      </w:r>
+      <w:r>
+        <w:rPr>
+          <w:rFonts w:ascii="Courier New" w:eastAsia="Times New Roman" w:hAnsi="Courier New" w:cs="Courier New"/>
+          <w:sz w:val="20"/>
+          <w:szCs w:val="20"/>
+          <w:lang w:val="uk-UA" w:eastAsia="uk-UA"/>
+        </w:rPr>
+        <w:br/>
+        <w:t xml:space="preserve">                    &lt;BeginStoryboard x:Name="Ball6Storyboard"&gt;</w:t>
+      </w:r>
+      <w:r>
+        <w:rPr>
+          <w:rFonts w:ascii="Courier New" w:eastAsia="Times New Roman" w:hAnsi="Courier New" w:cs="Courier New"/>
+          <w:sz w:val="20"/>
+          <w:szCs w:val="20"/>
+          <w:lang w:val="uk-UA" w:eastAsia="uk-UA"/>
+        </w:rPr>
+        <w:br/>
+        <w:t xml:space="preserve">                        &lt;Storyboard x:Name="Ball6Animation" RepeatBehavior="Forever"&gt;</w:t>
+      </w:r>
+      <w:r>
+        <w:rPr>
+          <w:rFonts w:ascii="Courier New" w:eastAsia="Times New Roman" w:hAnsi="Courier New" w:cs="Courier New"/>
+          <w:sz w:val="20"/>
+          <w:szCs w:val="20"/>
+          <w:lang w:val="uk-UA" w:eastAsia="uk-UA"/>
+        </w:rPr>
+        <w:br/>
+        <w:t xml:space="preserve">                            &lt;DoubleAnimationUsingKeyFrames </w:t>
+      </w:r>
+      <w:r>
+        <w:rPr>
+          <w:rFonts w:ascii="Courier New" w:eastAsia="Times New Roman" w:hAnsi="Courier New" w:cs="Courier New"/>
+          <w:sz w:val="20"/>
+          <w:szCs w:val="20"/>
+          <w:lang w:val="uk-UA" w:eastAsia="uk-UA"/>
+        </w:rPr>
+        <w:lastRenderedPageBreak/>
+        <w:t>Storyboard.TargetName="Ball6Translate"</w:t>
+      </w:r>
+      <w:r>
+        <w:rPr>
+          <w:rFonts w:ascii="Courier New" w:eastAsia="Times New Roman" w:hAnsi="Courier New" w:cs="Courier New"/>
+          <w:sz w:val="20"/>
+          <w:szCs w:val="20"/>
+          <w:lang w:val="uk-UA" w:eastAsia="uk-UA"/>
+        </w:rPr>
+        <w:br/>
+        <w:t xml:space="preserve">                                                          Storyboard.TargetProperty="X"</w:t>
+      </w:r>
+      <w:r>
+        <w:rPr>
+          <w:rFonts w:ascii="Courier New" w:eastAsia="Times New Roman" w:hAnsi="Courier New" w:cs="Courier New"/>
+          <w:sz w:val="20"/>
+          <w:szCs w:val="20"/>
+          <w:lang w:val="uk-UA" w:eastAsia="uk-UA"/>
+        </w:rPr>
+        <w:br/>
+        <w:t xml:space="preserve">                                                          Duration="0:0:5"&gt;</w:t>
+      </w:r>
+      <w:r>
+        <w:rPr>
+          <w:rFonts w:ascii="Courier New" w:eastAsia="Times New Roman" w:hAnsi="Courier New" w:cs="Courier New"/>
+          <w:sz w:val="20"/>
+          <w:szCs w:val="20"/>
+          <w:lang w:val="uk-UA" w:eastAsia="uk-UA"/>
+        </w:rPr>
+        <w:br/>
+        <w:t xml:space="preserve">                                &lt;LinearDoubleKeyFrame Value="0" KeyTime="0:0:0"/&gt;</w:t>
+      </w:r>
+      <w:r>
+        <w:rPr>
+          <w:rFonts w:ascii="Courier New" w:eastAsia="Times New Roman" w:hAnsi="Courier New" w:cs="Courier New"/>
+          <w:sz w:val="20"/>
+          <w:szCs w:val="20"/>
+          <w:lang w:val="uk-UA" w:eastAsia="uk-UA"/>
+        </w:rPr>
+        <w:br/>
+        <w:t xml:space="preserve">                                &lt;LinearDoubleKeyFrame Value="120" KeyTime="0:0:1.25"/&gt;</w:t>
+      </w:r>
+      <w:r>
+        <w:rPr>
+          <w:rFonts w:ascii="Courier New" w:eastAsia="Times New Roman" w:hAnsi="Courier New" w:cs="Courier New"/>
+          <w:sz w:val="20"/>
+          <w:szCs w:val="20"/>
+          <w:lang w:val="uk-UA" w:eastAsia="uk-UA"/>
+        </w:rPr>
+        <w:br/>
+        <w:t xml:space="preserve">                                &lt;LinearDoubleKeyFrame Value="0" KeyTime="0:0:2.5"/&gt;</w:t>
+      </w:r>
+      <w:r>
+        <w:rPr>
+          <w:rFonts w:ascii="Courier New" w:eastAsia="Times New Roman" w:hAnsi="Courier New" w:cs="Courier New"/>
+          <w:sz w:val="20"/>
+          <w:szCs w:val="20"/>
+          <w:lang w:val="uk-UA" w:eastAsia="uk-UA"/>
+        </w:rPr>
+        <w:br/>
+        <w:t xml:space="preserve">                                &lt;LinearDoubleKeyFrame Value="-120" KeyTime="0:0:3.75"/&gt;</w:t>
+      </w:r>
+      <w:r>
+        <w:rPr>
+          <w:rFonts w:ascii="Courier New" w:eastAsia="Times New Roman" w:hAnsi="Courier New" w:cs="Courier New"/>
+          <w:sz w:val="20"/>
+          <w:szCs w:val="20"/>
+          <w:lang w:val="uk-UA" w:eastAsia="uk-UA"/>
+        </w:rPr>
+        <w:br/>
+        <w:t xml:space="preserve">                                &lt;LinearDoubleKeyFrame Value="0" KeyTime="0:0:5"/&gt;</w:t>
+      </w:r>
+      <w:r>
+        <w:rPr>
+          <w:rFonts w:ascii="Courier New" w:eastAsia="Times New Roman" w:hAnsi="Courier New" w:cs="Courier New"/>
+          <w:sz w:val="20"/>
+          <w:szCs w:val="20"/>
+          <w:lang w:val="uk-UA" w:eastAsia="uk-UA"/>
+        </w:rPr>
+        <w:br/>
+        <w:t xml:space="preserve">                            &lt;/DoubleAnimationUsingKeyFrames&gt;</w:t>
+      </w:r>
+      <w:r>
+        <w:rPr>
+          <w:rFonts w:ascii="Courier New" w:eastAsia="Times New Roman" w:hAnsi="Courier New" w:cs="Courier New"/>
+          <w:sz w:val="20"/>
+          <w:szCs w:val="20"/>
+          <w:lang w:val="uk-UA" w:eastAsia="uk-UA"/>
+        </w:rPr>
+        <w:br/>
+        <w:t xml:space="preserve">                            &lt;DoubleAnimationUsingKeyFrames Storyboard.TargetName="Ball6Translate"</w:t>
+      </w:r>
+      <w:r>
+        <w:rPr>
+          <w:rFonts w:ascii="Courier New" w:eastAsia="Times New Roman" w:hAnsi="Courier New" w:cs="Courier New"/>
+          <w:sz w:val="20"/>
+          <w:szCs w:val="20"/>
+          <w:lang w:val="uk-UA" w:eastAsia="uk-UA"/>
+        </w:rPr>
+        <w:br/>
+        <w:t xml:space="preserve">                                                          Storyboard.TargetProperty="Y"</w:t>
+      </w:r>
+      <w:r>
+        <w:rPr>
+          <w:rFonts w:ascii="Courier New" w:eastAsia="Times New Roman" w:hAnsi="Courier New" w:cs="Courier New"/>
+          <w:sz w:val="20"/>
+          <w:szCs w:val="20"/>
+          <w:lang w:val="uk-UA" w:eastAsia="uk-UA"/>
+        </w:rPr>
+        <w:br/>
+        <w:t xml:space="preserve">                                                          Duration="0:0:5"&gt;</w:t>
+      </w:r>
+      <w:r>
+        <w:rPr>
+          <w:rFonts w:ascii="Courier New" w:eastAsia="Times New Roman" w:hAnsi="Courier New" w:cs="Courier New"/>
+          <w:sz w:val="20"/>
+          <w:szCs w:val="20"/>
+          <w:lang w:val="uk-UA" w:eastAsia="uk-UA"/>
+        </w:rPr>
+        <w:br/>
+        <w:t xml:space="preserve">                                &lt;LinearDoubleKeyFrame Value="0" KeyTime="0:0:0"/&gt;</w:t>
+      </w:r>
+      <w:r>
+        <w:rPr>
+          <w:rFonts w:ascii="Courier New" w:eastAsia="Times New Roman" w:hAnsi="Courier New" w:cs="Courier New"/>
+          <w:sz w:val="20"/>
+          <w:szCs w:val="20"/>
+          <w:lang w:val="uk-UA" w:eastAsia="uk-UA"/>
+        </w:rPr>
+        <w:br/>
+        <w:t xml:space="preserve">                                &lt;LinearDoubleKeyFrame Value="120" KeyTime="0:0:1.25"/&gt;</w:t>
+      </w:r>
+      <w:r>
+        <w:rPr>
+          <w:rFonts w:ascii="Courier New" w:eastAsia="Times New Roman" w:hAnsi="Courier New" w:cs="Courier New"/>
+          <w:sz w:val="20"/>
+          <w:szCs w:val="20"/>
+          <w:lang w:val="uk-UA" w:eastAsia="uk-UA"/>
+        </w:rPr>
+        <w:br/>
+        <w:t xml:space="preserve">                                &lt;LinearDoubleKeyFrame Value="240" KeyTime="0:0:2.5"/&gt;</w:t>
+      </w:r>
+      <w:r>
+        <w:rPr>
+          <w:rFonts w:ascii="Courier New" w:eastAsia="Times New Roman" w:hAnsi="Courier New" w:cs="Courier New"/>
+          <w:sz w:val="20"/>
+          <w:szCs w:val="20"/>
+          <w:lang w:val="uk-UA" w:eastAsia="uk-UA"/>
+        </w:rPr>
+        <w:br/>
+        <w:t xml:space="preserve">                                &lt;LinearDoubleKeyFrame Value="120" KeyTime="0:0:3.75"/&gt;</w:t>
+      </w:r>
+      <w:r>
+        <w:rPr>
+          <w:rFonts w:ascii="Courier New" w:eastAsia="Times New Roman" w:hAnsi="Courier New" w:cs="Courier New"/>
+          <w:sz w:val="20"/>
+          <w:szCs w:val="20"/>
+          <w:lang w:val="uk-UA" w:eastAsia="uk-UA"/>
+        </w:rPr>
+        <w:br/>
+        <w:t xml:space="preserve">                                &lt;LinearDoubleKeyFrame Value="0" KeyTime="0:0:5"/&gt;</w:t>
+      </w:r>
+      <w:r>
+        <w:rPr>
+          <w:rFonts w:ascii="Courier New" w:eastAsia="Times New Roman" w:hAnsi="Courier New" w:cs="Courier New"/>
+          <w:sz w:val="20"/>
+          <w:szCs w:val="20"/>
+          <w:lang w:val="uk-UA" w:eastAsia="uk-UA"/>
+        </w:rPr>
+        <w:br/>
+        <w:t xml:space="preserve">                            &lt;/DoubleAnimationUsingKeyFrames&gt;</w:t>
+      </w:r>
+      <w:r>
+        <w:rPr>
+          <w:rFonts w:ascii="Courier New" w:eastAsia="Times New Roman" w:hAnsi="Courier New" w:cs="Courier New"/>
+          <w:sz w:val="20"/>
+          <w:szCs w:val="20"/>
+          <w:lang w:val="uk-UA" w:eastAsia="uk-UA"/>
+        </w:rPr>
+        <w:br/>
+        <w:t xml:space="preserve">                        &lt;/Storyboard&gt;</w:t>
+      </w:r>
+      <w:r>
+        <w:rPr>
+          <w:rFonts w:ascii="Courier New" w:eastAsia="Times New Roman" w:hAnsi="Courier New" w:cs="Courier New"/>
+          <w:sz w:val="20"/>
+          <w:szCs w:val="20"/>
+          <w:lang w:val="uk-UA" w:eastAsia="uk-UA"/>
+        </w:rPr>
+        <w:br/>
+        <w:t xml:space="preserve">                    &lt;/BeginStoryboard&gt;</w:t>
+      </w:r>
+      <w:r>
+        <w:rPr>
+          <w:rFonts w:ascii="Courier New" w:eastAsia="Times New Roman" w:hAnsi="Courier New" w:cs="Courier New"/>
+          <w:sz w:val="20"/>
+          <w:szCs w:val="20"/>
+          <w:lang w:val="uk-UA" w:eastAsia="uk-UA"/>
+        </w:rPr>
+        <w:br/>
+        <w:t xml:space="preserve">                &lt;/EventTrigger&gt;</w:t>
+      </w:r>
+      <w:r>
+        <w:rPr>
+          <w:rFonts w:ascii="Courier New" w:eastAsia="Times New Roman" w:hAnsi="Courier New" w:cs="Courier New"/>
+          <w:sz w:val="20"/>
+          <w:szCs w:val="20"/>
+          <w:lang w:val="uk-UA" w:eastAsia="uk-UA"/>
+        </w:rPr>
+        <w:br/>
+        <w:t xml:space="preserve">            &lt;/Ellipse.Triggers&gt;</w:t>
+      </w:r>
+      <w:r>
+        <w:rPr>
+          <w:rFonts w:ascii="Courier New" w:eastAsia="Times New Roman" w:hAnsi="Courier New" w:cs="Courier New"/>
+          <w:sz w:val="20"/>
+          <w:szCs w:val="20"/>
+          <w:lang w:val="uk-UA" w:eastAsia="uk-UA"/>
+        </w:rPr>
+        <w:br/>
+        <w:t xml:space="preserve">        &lt;/Ellipse&gt;</w:t>
       </w:r>
       <w:r>
         <w:rPr>
@@ -2695,6 +5497,35 @@
     </w:p>
     <w:p>
       <w:pPr>
+        <w:tabs>
+          <w:tab w:val="left" w:pos="916"/>
+          <w:tab w:val="left" w:pos="1832"/>
+          <w:tab w:val="left" w:pos="2748"/>
+          <w:tab w:val="left" w:pos="3664"/>
+          <w:tab w:val="left" w:pos="4580"/>
+          <w:tab w:val="left" w:pos="5496"/>
+          <w:tab w:val="left" w:pos="6412"/>
+          <w:tab w:val="left" w:pos="7328"/>
+          <w:tab w:val="left" w:pos="8244"/>
+          <w:tab w:val="left" w:pos="9160"/>
+          <w:tab w:val="left" w:pos="10076"/>
+          <w:tab w:val="left" w:pos="10992"/>
+          <w:tab w:val="left" w:pos="11908"/>
+          <w:tab w:val="left" w:pos="12824"/>
+          <w:tab w:val="left" w:pos="13740"/>
+          <w:tab w:val="left" w:pos="14656"/>
+        </w:tabs>
+        <w:spacing w:after="0" w:line="240" w:lineRule="auto"/>
+        <w:rPr>
+          <w:rFonts w:ascii="Courier New" w:eastAsia="Times New Roman" w:hAnsi="Courier New" w:cs="Courier New"/>
+          <w:sz w:val="20"/>
+          <w:szCs w:val="20"/>
+          <w:lang w:val="uk-UA" w:eastAsia="uk-UA"/>
+        </w:rPr>
+      </w:pPr>
+    </w:p>
+    <w:p>
+      <w:pPr>
         <w:spacing w:after="0" w:line="240" w:lineRule="auto"/>
         <w:ind w:firstLine="720"/>
         <w:jc w:val="both"/>
@@ -2742,23 +5573,23 @@
       </w:r>
       <w:r>
         <w:br/>
+        <w:t>using System.Windows.Input;</w:t>
+      </w:r>
+      <w:r>
+        <w:br/>
+        <w:t>using System.Windows.Media;</w:t>
+      </w:r>
+      <w:r>
+        <w:br/>
+        <w:t>using System.Windows.Shapes;</w:t>
+      </w:r>
+      <w:r>
+        <w:br/>
         <w:t>using System.Windows.Controls;</w:t>
       </w:r>
       <w:r>
         <w:br/>
-        <w:t>using System.Windows.Input;</w:t>
-      </w:r>
-      <w:r>
-        <w:br/>
-        <w:t>using System.Windows.Media;</w:t>
-      </w:r>
-      <w:r>
-        <w:br/>
-        <w:t>using System.Windows.Shapes;</w:t>
-      </w:r>
-      <w:r>
-        <w:br/>
-        <w:t>using System.Windows.Threading;</w:t>
+        <w:t>using System.Windows.Media.Animation;</w:t>
       </w:r>
       <w:r>
         <w:br/>
@@ -2781,15 +5612,19 @@
       </w:r>
       <w:r>
         <w:br/>
-        <w:t xml:space="preserve">        private DispatcherTimer animationTimer;</w:t>
-      </w:r>
-      <w:r>
-        <w:br/>
-        <w:t xml:space="preserve">        private List&lt;Ball&gt; balls = new List&lt;Ball&gt;();</w:t>
-      </w:r>
-      <w:r>
-        <w:br/>
-        <w:t xml:space="preserve">        private Ball selectedBall = null;</w:t>
+        <w:t xml:space="preserve">        private readonly Dictionary&lt;string, Storyboard&gt; storyboards = new Dictionary&lt;string, Storyboard&gt;();</w:t>
+      </w:r>
+      <w:r>
+        <w:br/>
+        <w:t xml:space="preserve">        private readonly Dictionary&lt;string, SolidColorBrush&gt; originalColors = new Dictionary&lt;string, SolidColorBrush&gt;();</w:t>
+      </w:r>
+      <w:r>
+        <w:br/>
+        <w:t xml:space="preserve">        private readonly Dictionary&lt;string, double&gt; originalSizes = new Dictionary&lt;string, double&gt;();</w:t>
+      </w:r>
+      <w:r>
+        <w:br/>
+        <w:t xml:space="preserve">        private readonly Random random = new Random();</w:t>
       </w:r>
       <w:r>
         <w:br/>
@@ -2805,25 +5640,6 @@
       <w:r>
         <w:br/>
         <w:t xml:space="preserve">            InitializeComponent();</w:t>
-      </w:r>
-      <w:r>
-        <w:br/>
-        <w:t xml:space="preserve">        }</w:t>
-      </w:r>
-      <w:r>
-        <w:br/>
-      </w:r>
-      <w:r>
-        <w:br/>
-        <w:t xml:space="preserve">        private void Window_Loaded(object sender, RoutedEventArgs e)</w:t>
-      </w:r>
-      <w:r>
-        <w:br/>
-        <w:t xml:space="preserve">        {</w:t>
-      </w:r>
-      <w:r>
-        <w:br/>
-        <w:t xml:space="preserve">            Canvas canvas = this.FindName("canvas") as Canvas;</w:t>
       </w:r>
       <w:r>
         <w:br/>
@@ -2837,7 +5653,7 @@
           <w:i/>
           <w:iCs/>
         </w:rPr>
-        <w:t>// 6 кульок з різними кольорами</w:t>
+        <w:t>// Initialize storyboards by accessing BeginStoryboard.Storyboard</w:t>
       </w:r>
       <w:r>
         <w:rPr>
@@ -2845,634 +5661,395 @@
           <w:iCs/>
         </w:rPr>
         <w:br/>
-        <w:t xml:space="preserve">            </w:t>
-      </w:r>
-      <w:r>
-        <w:t>Color[] colors = { Colors.Red, Colors.Blue, Colors.Green, Colors.Yellow, Colors.Magenta, Colors.Cyan };</w:t>
-      </w:r>
-      <w:r>
-        <w:br/>
-        <w:t xml:space="preserve">            double[] radii = { 50, 60, 70, 55, 65, 58 };</w:t>
-      </w:r>
-      <w:r>
-        <w:br/>
-        <w:t xml:space="preserve">            double[] speeds = { 0.007, 0.02, 0.012, 0.018, 0.03, 0.025 };</w:t>
-      </w:r>
-      <w:r>
-        <w:br/>
-        <w:t xml:space="preserve">            double[] orbitRadii = { 300, 100, 250, 320, 280, 120 };</w:t>
-      </w:r>
-      <w:r>
-        <w:br/>
-      </w:r>
-      <w:r>
-        <w:br/>
-        <w:t xml:space="preserve">            for (int i = 0; i &lt; 6; i++)</w:t>
-      </w:r>
-      <w:r>
-        <w:br/>
-        <w:t xml:space="preserve">            {</w:t>
-      </w:r>
-      <w:r>
-        <w:br/>
-        <w:t xml:space="preserve">                Ball ball = new Ball(25, colors[i], radii[i], speeds[i], </w:t>
-      </w:r>
-      <w:r>
-        <w:lastRenderedPageBreak/>
-        <w:t>orbitRadii[i], i);</w:t>
-      </w:r>
-      <w:r>
-        <w:br/>
-        <w:t xml:space="preserve">                balls.Add(ball);</w:t>
-      </w:r>
-      <w:r>
-        <w:br/>
-        <w:t xml:space="preserve">                canvas.Children.Add(ball.Ellipse);</w:t>
-      </w:r>
-      <w:r>
-        <w:br/>
-        <w:t xml:space="preserve">            }</w:t>
-      </w:r>
-      <w:r>
-        <w:br/>
-      </w:r>
-      <w:r>
-        <w:br/>
-        <w:t xml:space="preserve">            </w:t>
       </w:r>
       <w:r>
         <w:rPr>
           <w:i/>
           <w:iCs/>
         </w:rPr>
-        <w:t>// Налаштування таймера анімації</w:t>
+        <w:lastRenderedPageBreak/>
+        <w:t xml:space="preserve">            </w:t>
+      </w:r>
+      <w:r>
+        <w:t>storyboards.Add("Ball1", ((BeginStoryboard)FindName("Ball1Storyboard")).Storyboard);</w:t>
+      </w:r>
+      <w:r>
+        <w:br/>
+        <w:t xml:space="preserve">            storyboards.Add("Ball2", ((BeginStoryboard)FindName("Ball2Storyboard")).Storyboard);</w:t>
+      </w:r>
+      <w:r>
+        <w:br/>
+        <w:t xml:space="preserve">            storyboards.Add("Ball3", ((BeginStoryboard)FindName("Ball3Storyboard")).Storyboard);</w:t>
+      </w:r>
+      <w:r>
+        <w:br/>
+        <w:t xml:space="preserve">            storyboards.Add("Ball4", ((BeginStoryboard)FindName("Ball4Storyboard")).Storyboard);</w:t>
+      </w:r>
+      <w:r>
+        <w:br/>
+        <w:t xml:space="preserve">            storyboards.Add("Ball5", ((BeginStoryboard)FindName("Ball5Storyboard")).Storyboard);</w:t>
+      </w:r>
+      <w:r>
+        <w:br/>
+        <w:t xml:space="preserve">            storyboards.Add("Ball6", ((BeginStoryboard)FindName("Ball6Storyboard")).Storyboard);</w:t>
+      </w:r>
+      <w:r>
+        <w:br/>
+      </w:r>
+      <w:r>
+        <w:br/>
+        <w:t xml:space="preserve">            </w:t>
       </w:r>
       <w:r>
         <w:rPr>
           <w:i/>
           <w:iCs/>
         </w:rPr>
-        <w:br/>
-        <w:t xml:space="preserve">            </w:t>
-      </w:r>
-      <w:r>
-        <w:t>animationTimer = new DispatcherTimer();</w:t>
-      </w:r>
-      <w:r>
-        <w:br/>
-        <w:t xml:space="preserve">            animationTimer.Interval = TimeSpan.FromMilliseconds(16);</w:t>
-      </w:r>
-      <w:r>
-        <w:br/>
-        <w:t xml:space="preserve">            animationTimer.Tick += AnimationTimer_Tick;</w:t>
-      </w:r>
-      <w:r>
-        <w:br/>
-        <w:t xml:space="preserve">            animationTimer.Start();</w:t>
-      </w:r>
-      <w:r>
-        <w:br/>
-      </w:r>
-      <w:r>
-        <w:br/>
-        <w:t xml:space="preserve">            </w:t>
+        <w:t>// Store original colors and sizes</w:t>
       </w:r>
       <w:r>
         <w:rPr>
           <w:i/>
           <w:iCs/>
         </w:rPr>
-        <w:t>// Обробники подій мишки</w:t>
+        <w:br/>
+        <w:t xml:space="preserve">            </w:t>
+      </w:r>
+      <w:r>
+        <w:t>originalColors.Add("Ball1", new SolidColorBrush(Colors.Red));</w:t>
+      </w:r>
+      <w:r>
+        <w:br/>
+        <w:t xml:space="preserve">            originalColors.Add("Ball2", new SolidColorBrush(Colors.Blue));</w:t>
+      </w:r>
+      <w:r>
+        <w:br/>
+        <w:t xml:space="preserve">            originalColors.Add("Ball3", new SolidColorBrush(Colors.Green));</w:t>
+      </w:r>
+      <w:r>
+        <w:br/>
+        <w:t xml:space="preserve">            originalColors.Add("Ball4", new SolidColorBrush(Colors.Yellow));</w:t>
+      </w:r>
+      <w:r>
+        <w:br/>
+        <w:t xml:space="preserve">            originalColors.Add("Ball5", new SolidColorBrush(Colors.Magenta));</w:t>
+      </w:r>
+      <w:r>
+        <w:br/>
+        <w:t xml:space="preserve">            originalColors.Add("Ball6", new SolidColorBrush(Colors.Cyan));</w:t>
+      </w:r>
+      <w:r>
+        <w:br/>
+      </w:r>
+      <w:r>
+        <w:br/>
+        <w:t xml:space="preserve">            originalSizes.Add("Ball1", 100);</w:t>
+      </w:r>
+      <w:r>
+        <w:br/>
+        <w:t xml:space="preserve">            originalSizes.Add("Ball2", 120);</w:t>
+      </w:r>
+      <w:r>
+        <w:br/>
+        <w:t xml:space="preserve">            originalSizes.Add("Ball3", 140);</w:t>
+      </w:r>
+      <w:r>
+        <w:br/>
+        <w:t xml:space="preserve">            originalSizes.Add("Ball4", 110);</w:t>
+      </w:r>
+      <w:r>
+        <w:br/>
+        <w:t xml:space="preserve">            originalSizes.Add("Ball5", 130);</w:t>
+      </w:r>
+      <w:r>
+        <w:br/>
+        <w:t xml:space="preserve">            originalSizes.Add("Ball6", 116);</w:t>
+      </w:r>
+      <w:r>
+        <w:br/>
+        <w:t xml:space="preserve">        }</w:t>
+      </w:r>
+      <w:r>
+        <w:br/>
+      </w:r>
+      <w:r>
+        <w:br/>
+        <w:t xml:space="preserve">        private void Window_MouseLeftButtonDown(object sender, MouseButtonEventArgs e)</w:t>
+      </w:r>
+      <w:r>
+        <w:br/>
+        <w:t xml:space="preserve">        {</w:t>
+      </w:r>
+      <w:r>
+        <w:br/>
+        <w:t xml:space="preserve">            DragMove();</w:t>
+      </w:r>
+      <w:r>
+        <w:br/>
+        <w:t xml:space="preserve">        }</w:t>
+      </w:r>
+      <w:r>
+        <w:br/>
+      </w:r>
+      <w:r>
+        <w:br/>
+        <w:t xml:space="preserve">        private void Ellipse_MouseEnter(object sender, MouseEventArgs e)</w:t>
+      </w:r>
+      <w:r>
+        <w:br/>
+        <w:t xml:space="preserve">        {</w:t>
+      </w:r>
+      <w:r>
+        <w:br/>
+        <w:t xml:space="preserve">            if (sender is Ellipse ellipse)</w:t>
+      </w:r>
+      <w:r>
+        <w:br/>
+        <w:t xml:space="preserve">            {</w:t>
+      </w:r>
+      <w:r>
+        <w:br/>
+        <w:t xml:space="preserve">                string name = ellipse.Name;</w:t>
+      </w:r>
+      <w:r>
+        <w:br/>
+        <w:t xml:space="preserve">                if (storyboards.ContainsKey(name))</w:t>
+      </w:r>
+      <w:r>
+        <w:br/>
+        <w:t xml:space="preserve">                {</w:t>
+      </w:r>
+      <w:r>
+        <w:br/>
+        <w:t xml:space="preserve">                    storyboards[name].Pause();</w:t>
+      </w:r>
+      <w:r>
+        <w:br/>
+        <w:t xml:space="preserve">                }</w:t>
+      </w:r>
+      <w:r>
+        <w:br/>
+        <w:t xml:space="preserve">            }</w:t>
+      </w:r>
+      <w:r>
+        <w:br/>
+        <w:t xml:space="preserve">        }</w:t>
+      </w:r>
+      <w:r>
+        <w:br/>
+      </w:r>
+      <w:r>
+        <w:br/>
+        <w:t xml:space="preserve">        private void Ellipse_MouseLeave(object sender, MouseEventArgs e)</w:t>
+      </w:r>
+      <w:r>
+        <w:br/>
+        <w:t xml:space="preserve">        {</w:t>
+      </w:r>
+      <w:r>
+        <w:br/>
+        <w:t xml:space="preserve">            if (sender is Ellipse ellipse)</w:t>
+      </w:r>
+      <w:r>
+        <w:br/>
+        <w:t xml:space="preserve">            {</w:t>
+      </w:r>
+      <w:r>
+        <w:br/>
+        <w:t xml:space="preserve">                string name = ellipse.Name;</w:t>
+      </w:r>
+      <w:r>
+        <w:br/>
+        <w:t xml:space="preserve">                if (storyboards.ContainsKey(name))</w:t>
+      </w:r>
+      <w:r>
+        <w:br/>
+        <w:t xml:space="preserve">                {</w:t>
+      </w:r>
+      <w:r>
+        <w:br/>
+        <w:t xml:space="preserve">                    </w:t>
       </w:r>
       <w:r>
         <w:rPr>
           <w:i/>
           <w:iCs/>
         </w:rPr>
-        <w:br/>
-        <w:t xml:space="preserve">            </w:t>
-      </w:r>
-      <w:r>
-        <w:t>canvas.MouseDown += Canvas_MouseDown;</w:t>
-      </w:r>
-      <w:r>
-        <w:br/>
-        <w:t xml:space="preserve">            canvas.MouseUp += Canvas_MouseUp;</w:t>
-      </w:r>
-      <w:r>
-        <w:br/>
-        <w:t xml:space="preserve">            canvas.MouseMove += Canvas_MouseMove;</w:t>
-      </w:r>
-      <w:r>
-        <w:br/>
-        <w:t xml:space="preserve">        }</w:t>
-      </w:r>
-      <w:r>
-        <w:br/>
-      </w:r>
-      <w:r>
-        <w:br/>
-        <w:t xml:space="preserve">        private void AnimationTimer_Tick(object sender, EventArgs e)</w:t>
-      </w:r>
-      <w:r>
-        <w:br/>
-        <w:t xml:space="preserve">        {</w:t>
-      </w:r>
-      <w:r>
-        <w:br/>
-        <w:t xml:space="preserve">            Canvas canvas = this.FindName("canvas") as Canvas;</w:t>
-      </w:r>
-      <w:r>
-        <w:br/>
-        <w:t xml:space="preserve">            double centerX = canvas.ActualWidth / 2;</w:t>
-      </w:r>
-      <w:r>
-        <w:br/>
-        <w:t xml:space="preserve">            double centerY = canvas.ActualHeight / 2;</w:t>
-      </w:r>
-      <w:r>
-        <w:br/>
-      </w:r>
-      <w:r>
-        <w:br/>
-        <w:t xml:space="preserve">            foreach (Ball ball in balls)</w:t>
-      </w:r>
-      <w:r>
-        <w:br/>
-        <w:t xml:space="preserve">            {</w:t>
-      </w:r>
-      <w:r>
-        <w:br/>
-        <w:t xml:space="preserve">                if (!ball.IsPaused)</w:t>
-      </w:r>
-      <w:r>
-        <w:br/>
-        <w:t xml:space="preserve">                {</w:t>
-      </w:r>
-      <w:r>
-        <w:br/>
-        <w:t xml:space="preserve">                    </w:t>
+        <w:t>// Restore original color and size</w:t>
       </w:r>
       <w:r>
         <w:rPr>
           <w:i/>
           <w:iCs/>
         </w:rPr>
-        <w:t>// Рух по колоподібній траєкторії</w:t>
+        <w:br/>
+        <w:t xml:space="preserve">                    </w:t>
+      </w:r>
+      <w:r>
+        <w:t>ellipse.Fill = originalColors[name];</w:t>
+      </w:r>
+      <w:r>
+        <w:br/>
+        <w:t xml:space="preserve">                    ellipse.Width = originalSizes[name];</w:t>
+      </w:r>
+      <w:r>
+        <w:br/>
+        <w:t xml:space="preserve">                    ellipse.Height = originalSizes[name];</w:t>
+      </w:r>
+      <w:r>
+        <w:br/>
+        <w:t xml:space="preserve">                    storyboards[name].Resume();</w:t>
+      </w:r>
+      <w:r>
+        <w:br/>
+        <w:t xml:space="preserve">                }</w:t>
+      </w:r>
+      <w:r>
+        <w:br/>
+        <w:t xml:space="preserve">            }</w:t>
+      </w:r>
+      <w:r>
+        <w:br/>
+        <w:t xml:space="preserve">        }</w:t>
+      </w:r>
+      <w:r>
+        <w:br/>
+      </w:r>
+      <w:r>
+        <w:br/>
+        <w:t xml:space="preserve">        private void Ellipse_MouseLeftButtonDown(object sender, </w:t>
+      </w:r>
+      <w:r>
+        <w:lastRenderedPageBreak/>
+        <w:t>MouseButtonEventArgs e)</w:t>
+      </w:r>
+      <w:r>
+        <w:br/>
+        <w:t xml:space="preserve">        {</w:t>
+      </w:r>
+      <w:r>
+        <w:br/>
+        <w:t xml:space="preserve">            if (sender is Ellipse ellipse)</w:t>
+      </w:r>
+      <w:r>
+        <w:br/>
+        <w:t xml:space="preserve">            {</w:t>
+      </w:r>
+      <w:r>
+        <w:br/>
+        <w:t xml:space="preserve">                string name = ellipse.Name;</w:t>
+      </w:r>
+      <w:r>
+        <w:br/>
+        <w:t xml:space="preserve">                </w:t>
       </w:r>
       <w:r>
         <w:rPr>
           <w:i/>
           <w:iCs/>
         </w:rPr>
-        <w:br/>
-        <w:t xml:space="preserve">                    </w:t>
-      </w:r>
-      <w:r>
-        <w:t>ball.Angle += ball.Speed;</w:t>
-      </w:r>
-      <w:r>
-        <w:br/>
-        <w:t xml:space="preserve">                    double x = centerX + ball.OrbitRadius * Math.Cos(ball.Angle);</w:t>
-      </w:r>
-      <w:r>
-        <w:br/>
-        <w:t xml:space="preserve">                    double y = centerY + ball.OrbitRadius * Math.Sin(ball.Angle);</w:t>
-      </w:r>
-      <w:r>
-        <w:br/>
-      </w:r>
-      <w:r>
-        <w:br/>
-        <w:t xml:space="preserve">                    Canvas.SetLeft(ball.Ellipse, x - ball.Radius);</w:t>
-      </w:r>
-      <w:r>
-        <w:br/>
-        <w:t xml:space="preserve">                    Canvas.SetTop(ball.Ellipse, y - ball.Radius);</w:t>
-      </w:r>
-      <w:r>
-        <w:br/>
-        <w:t xml:space="preserve">                }</w:t>
-      </w:r>
-      <w:r>
-        <w:br/>
-        <w:t xml:space="preserve">            }</w:t>
-      </w:r>
-      <w:r>
-        <w:br/>
-        <w:t xml:space="preserve">        }</w:t>
-      </w:r>
-      <w:r>
-        <w:br/>
-      </w:r>
-      <w:r>
-        <w:br/>
-        <w:t xml:space="preserve">        private void Canvas_MouseDown(object sender, MouseButtonEventArgs e)</w:t>
-      </w:r>
-      <w:r>
-        <w:br/>
-        <w:t xml:space="preserve">        {</w:t>
-      </w:r>
-      <w:r>
-        <w:br/>
-        <w:t xml:space="preserve">            Canvas canvas = this.FindName("canvas") as Canvas;</w:t>
-      </w:r>
-      <w:r>
-        <w:br/>
-        <w:t xml:space="preserve">            Point p = e.GetPosition(canvas);</w:t>
-      </w:r>
-      <w:r>
-        <w:br/>
-      </w:r>
-      <w:r>
-        <w:br/>
-        <w:t xml:space="preserve">            foreach (Ball ball in balls)</w:t>
-      </w:r>
-      <w:r>
-        <w:br/>
-        <w:t xml:space="preserve">            {</w:t>
-      </w:r>
-      <w:r>
-        <w:br/>
-        <w:t xml:space="preserve">                double ballX = Canvas.GetLeft(ball.Ellipse) + ball.Radius;</w:t>
-      </w:r>
-      <w:r>
-        <w:br/>
-        <w:t xml:space="preserve">                double ballY = Canvas.GetTop(ball.Ellipse) + ball.Radius;</w:t>
-      </w:r>
-      <w:r>
-        <w:br/>
-        <w:t xml:space="preserve">                double distance = Math.Sqrt(Math.Pow(p.X - ballX, 2) + Math.Pow(p.Y - ballY, 2));</w:t>
-      </w:r>
-      <w:r>
-        <w:br/>
-      </w:r>
-      <w:r>
-        <w:br/>
-        <w:t xml:space="preserve">                if (distance &lt;= ball.Radius)</w:t>
-      </w:r>
-      <w:r>
-        <w:br/>
-        <w:t xml:space="preserve">                {</w:t>
-      </w:r>
-      <w:r>
-        <w:br/>
-        <w:t xml:space="preserve">                    selectedBall = ball;</w:t>
-      </w:r>
-      <w:r>
-        <w:br/>
-        <w:t xml:space="preserve">                    ball.IsPaused = !ball.IsPaused;</w:t>
-      </w:r>
-      <w:r>
-        <w:br/>
-      </w:r>
-      <w:r>
-        <w:br/>
-        <w:t xml:space="preserve">                    </w:t>
+        <w:t>// Change to a random color</w:t>
       </w:r>
       <w:r>
         <w:rPr>
           <w:i/>
           <w:iCs/>
         </w:rPr>
-        <w:t>// Зміна розміру при клацанні</w:t>
+        <w:br/>
+        <w:t xml:space="preserve">                </w:t>
+      </w:r>
+      <w:r>
+        <w:t>Color randomColor = Color.FromRgb(</w:t>
+      </w:r>
+      <w:r>
+        <w:br/>
+        <w:t xml:space="preserve">                    (byte)random.Next(256),</w:t>
+      </w:r>
+      <w:r>
+        <w:br/>
+        <w:t xml:space="preserve">                    (byte)random.Next(256),</w:t>
+      </w:r>
+      <w:r>
+        <w:br/>
+        <w:t xml:space="preserve">                    (byte)random.Next(256));</w:t>
+      </w:r>
+      <w:r>
+        <w:br/>
+        <w:t xml:space="preserve">                ellipse.Fill = new SolidColorBrush(randomColor);</w:t>
+      </w:r>
+      <w:r>
+        <w:br/>
+      </w:r>
+      <w:r>
+        <w:br/>
+        <w:t xml:space="preserve">                </w:t>
       </w:r>
       <w:r>
         <w:rPr>
           <w:i/>
           <w:iCs/>
         </w:rPr>
-        <w:br/>
-        <w:t xml:space="preserve">                    </w:t>
-      </w:r>
-      <w:r>
-        <w:t>if (ball.IsPaused)</w:t>
-      </w:r>
-      <w:r>
-        <w:br/>
-        <w:t xml:space="preserve">                    {</w:t>
-      </w:r>
-      <w:r>
-        <w:br/>
-        <w:t xml:space="preserve">                        ball.Radius *= 1.3;</w:t>
-      </w:r>
-      <w:r>
-        <w:br/>
-        <w:t xml:space="preserve">                    }</w:t>
-      </w:r>
-      <w:r>
-        <w:br/>
-        <w:t xml:space="preserve">                    else</w:t>
-      </w:r>
-      <w:r>
-        <w:br/>
-        <w:t xml:space="preserve">                    {</w:t>
-      </w:r>
-      <w:r>
-        <w:br/>
-        <w:t xml:space="preserve">                        ball.Radius /= 1.3;</w:t>
-      </w:r>
-      <w:r>
-        <w:br/>
-        <w:t xml:space="preserve">                    }</w:t>
-      </w:r>
-      <w:r>
-        <w:br/>
-      </w:r>
-      <w:r>
-        <w:lastRenderedPageBreak/>
-        <w:br/>
-        <w:t xml:space="preserve">                    </w:t>
+        <w:t>// Increase size by 20%</w:t>
       </w:r>
       <w:r>
         <w:rPr>
           <w:i/>
           <w:iCs/>
         </w:rPr>
-        <w:t>// Зміна кольору при клацанні</w:t>
+        <w:br/>
+        <w:t xml:space="preserve">                </w:t>
+      </w:r>
+      <w:r>
+        <w:t>double newSize = originalSizes[name] * 1.2;</w:t>
+      </w:r>
+      <w:r>
+        <w:br/>
+        <w:t xml:space="preserve">                ellipse.Width = newSize;</w:t>
+      </w:r>
+      <w:r>
+        <w:br/>
+        <w:t xml:space="preserve">                ellipse.Height = newSize;</w:t>
+      </w:r>
+      <w:r>
+        <w:br/>
+      </w:r>
+      <w:r>
+        <w:br/>
+        <w:t xml:space="preserve">                </w:t>
       </w:r>
       <w:r>
         <w:rPr>
           <w:i/>
           <w:iCs/>
         </w:rPr>
-        <w:br/>
-        <w:t xml:space="preserve">                    </w:t>
-      </w:r>
-      <w:r>
-        <w:t>Random rand = new Random();</w:t>
-      </w:r>
-      <w:r>
-        <w:br/>
-        <w:t xml:space="preserve">                    ball.SetColor(Color.FromRgb(</w:t>
-      </w:r>
-      <w:r>
-        <w:br/>
-        <w:t xml:space="preserve">                        (byte)rand.Next(100, 256),</w:t>
-      </w:r>
-      <w:r>
-        <w:br/>
-        <w:t xml:space="preserve">                        (byte)rand.Next(100, 256),</w:t>
-      </w:r>
-      <w:r>
-        <w:br/>
-        <w:t xml:space="preserve">                        (byte)rand.Next(100, 256)</w:t>
-      </w:r>
-      <w:r>
-        <w:br/>
-        <w:t xml:space="preserve">                    ));</w:t>
-      </w:r>
-      <w:r>
-        <w:br/>
-      </w:r>
-      <w:r>
-        <w:br/>
-        <w:t xml:space="preserve">                    ball.Ellipse.Width = ball.Radius * 2;</w:t>
-      </w:r>
-      <w:r>
-        <w:br/>
-        <w:t xml:space="preserve">                    ball.Ellipse.Height = ball.Radius * 2;</w:t>
-      </w:r>
-      <w:r>
-        <w:br/>
-      </w:r>
-      <w:r>
-        <w:br/>
-        <w:t xml:space="preserve">                    e.Handled = true;</w:t>
-      </w:r>
-      <w:r>
-        <w:br/>
-        <w:t xml:space="preserve">                    break;</w:t>
-      </w:r>
-      <w:r>
-        <w:br/>
-        <w:t xml:space="preserve">                }</w:t>
+        <w:t>// Center the ellipse to avoid shifting due to size change</w:t>
+      </w:r>
+      <w:r>
+        <w:rPr>
+          <w:i/>
+          <w:iCs/>
+        </w:rPr>
+        <w:br/>
+        <w:t xml:space="preserve">                </w:t>
+      </w:r>
+      <w:r>
+        <w:t>double oldSize = originalSizes[name];</w:t>
+      </w:r>
+      <w:r>
+        <w:br/>
+        <w:t xml:space="preserve">                double deltaSize = (newSize - oldSize) / 2;</w:t>
+      </w:r>
+      <w:r>
+        <w:br/>
+        <w:t xml:space="preserve">                Canvas.SetLeft(ellipse, Canvas.GetLeft(ellipse) - deltaSize);</w:t>
+      </w:r>
+      <w:r>
+        <w:br/>
+        <w:t xml:space="preserve">                Canvas.SetTop(ellipse, Canvas.GetTop(ellipse) - deltaSize);</w:t>
       </w:r>
       <w:r>
         <w:br/>
         <w:t xml:space="preserve">            }</w:t>
-      </w:r>
-      <w:r>
-        <w:br/>
-        <w:t xml:space="preserve">        }</w:t>
-      </w:r>
-      <w:r>
-        <w:br/>
-      </w:r>
-      <w:r>
-        <w:br/>
-        <w:t xml:space="preserve">        private void Canvas_MouseUp(object sender, MouseButtonEventArgs e)</w:t>
-      </w:r>
-      <w:r>
-        <w:br/>
-        <w:t xml:space="preserve">        {</w:t>
-      </w:r>
-      <w:r>
-        <w:br/>
-        <w:t xml:space="preserve">            selectedBall = null;</w:t>
-      </w:r>
-      <w:r>
-        <w:br/>
-        <w:t xml:space="preserve">        }</w:t>
-      </w:r>
-      <w:r>
-        <w:br/>
-      </w:r>
-      <w:r>
-        <w:br/>
-        <w:t xml:space="preserve">        private void Canvas_MouseMove(object sender, MouseEventArgs e)</w:t>
-      </w:r>
-      <w:r>
-        <w:br/>
-        <w:t xml:space="preserve">        {</w:t>
-      </w:r>
-      <w:r>
-        <w:br/>
-        <w:t xml:space="preserve">            if (selectedBall != null)</w:t>
-      </w:r>
-      <w:r>
-        <w:br/>
-        <w:t xml:space="preserve">            {</w:t>
-      </w:r>
-      <w:r>
-        <w:br/>
-        <w:t xml:space="preserve">                Canvas canvas = this.FindName("canvas") as Canvas;</w:t>
-      </w:r>
-      <w:r>
-        <w:br/>
-        <w:t xml:space="preserve">                Point p = e.GetPosition(canvas);</w:t>
-      </w:r>
-      <w:r>
-        <w:br/>
-        <w:t xml:space="preserve">                Canvas.SetLeft(selectedBall.Ellipse, p.X - selectedBall.Radius);</w:t>
-      </w:r>
-      <w:r>
-        <w:br/>
-        <w:t xml:space="preserve">                Canvas.SetTop(selectedBall.Ellipse, p.Y - selectedBall.Radius);</w:t>
-      </w:r>
-      <w:r>
-        <w:br/>
-        <w:t xml:space="preserve">            }</w:t>
-      </w:r>
-      <w:r>
-        <w:br/>
-        <w:t xml:space="preserve">        }</w:t>
-      </w:r>
-      <w:r>
-        <w:br/>
-      </w:r>
-      <w:r>
-        <w:br/>
-        <w:t xml:space="preserve">        private void Window_MouseLeftButtonDown(object sender, MouseButtonEventArgs e)</w:t>
-      </w:r>
-      <w:r>
-        <w:br/>
-        <w:t xml:space="preserve">        {</w:t>
-      </w:r>
-      <w:r>
-        <w:br/>
-        <w:t xml:space="preserve">            this.DragMove();</w:t>
-      </w:r>
-      <w:r>
-        <w:br/>
-        <w:t xml:space="preserve">        }</w:t>
-      </w:r>
-      <w:r>
-        <w:br/>
-        <w:t xml:space="preserve">    }</w:t>
-      </w:r>
-      <w:r>
-        <w:br/>
-      </w:r>
-      <w:r>
-        <w:br/>
-        <w:t xml:space="preserve">    public class Ball</w:t>
-      </w:r>
-      <w:r>
-        <w:br/>
-        <w:t xml:space="preserve">    {</w:t>
-      </w:r>
-      <w:r>
-        <w:br/>
-        <w:t xml:space="preserve">        public Ellipse Ellipse { get; set; }</w:t>
-      </w:r>
-      <w:r>
-        <w:br/>
-        <w:t xml:space="preserve">        public double Radius { get; set; }</w:t>
-      </w:r>
-      <w:r>
-        <w:br/>
-        <w:t xml:space="preserve">        public double Angle { get; set; }</w:t>
-      </w:r>
-      <w:r>
-        <w:br/>
-        <w:t xml:space="preserve">        public double Speed { get; set; }</w:t>
-      </w:r>
-      <w:r>
-        <w:br/>
-        <w:t xml:space="preserve">        public double OrbitRadius { get; set; }</w:t>
-      </w:r>
-      <w:r>
-        <w:br/>
-        <w:t xml:space="preserve">        public bool IsPaused { get; set; }</w:t>
-      </w:r>
-      <w:r>
-        <w:br/>
-      </w:r>
-      <w:r>
-        <w:br/>
-        <w:t xml:space="preserve">        public Ball(double radius, Color color, double orbitRadius, double speed, double initialOrbitRadius, int index)</w:t>
-      </w:r>
-      <w:r>
-        <w:br/>
-        <w:t xml:space="preserve">        {</w:t>
-      </w:r>
-      <w:r>
-        <w:br/>
-        <w:t xml:space="preserve">            Radius = radius;</w:t>
-      </w:r>
-      <w:r>
-        <w:br/>
-        <w:t xml:space="preserve">            Speed = speed;</w:t>
-      </w:r>
-      <w:r>
-        <w:br/>
-        <w:t xml:space="preserve">            OrbitRadius = initialOrbitRadius;</w:t>
-      </w:r>
-      <w:r>
-        <w:br/>
-        <w:t xml:space="preserve">            IsPaused = false;</w:t>
-      </w:r>
-      <w:r>
-        <w:br/>
-        <w:t xml:space="preserve">            Angle = (Math.</w:t>
-      </w:r>
-      <w:r>
-        <w:rPr>
-          <w:b/>
-          <w:bCs/>
-        </w:rPr>
-        <w:t xml:space="preserve">PI </w:t>
-      </w:r>
-      <w:r>
-        <w:t>* 2 / 4) * index;</w:t>
-      </w:r>
-      <w:r>
-        <w:br/>
-      </w:r>
-      <w:r>
-        <w:br/>
-        <w:t xml:space="preserve">            Ellipse = new Ellipse</w:t>
-      </w:r>
-      <w:r>
-        <w:br/>
-        <w:t xml:space="preserve">            {</w:t>
-      </w:r>
-      <w:r>
-        <w:br/>
-        <w:t xml:space="preserve">                Width = radius * 2,</w:t>
-      </w:r>
-      <w:r>
-        <w:br/>
-        <w:t xml:space="preserve">                Height = radius * 2,</w:t>
-      </w:r>
-      <w:r>
-        <w:br/>
-        <w:t xml:space="preserve">                Fill = new SolidColorBrush(color),</w:t>
-      </w:r>
-      <w:r>
-        <w:br/>
-      </w:r>
-      <w:r>
-        <w:lastRenderedPageBreak/>
-        <w:t xml:space="preserve">                Stroke = new SolidColorBrush(Colors.Black),</w:t>
-      </w:r>
-      <w:r>
-        <w:br/>
-        <w:t xml:space="preserve">                StrokeThickness = 2</w:t>
-      </w:r>
-      <w:r>
-        <w:br/>
-        <w:t xml:space="preserve">            };</w:t>
-      </w:r>
-      <w:r>
-        <w:br/>
-        <w:t xml:space="preserve">        }</w:t>
-      </w:r>
-      <w:r>
-        <w:br/>
-      </w:r>
-      <w:r>
-        <w:br/>
-        <w:t xml:space="preserve">        public void SetColor(Color color)</w:t>
-      </w:r>
-      <w:r>
-        <w:br/>
-        <w:t xml:space="preserve">        {</w:t>
-      </w:r>
-      <w:r>
-        <w:br/>
-        <w:t xml:space="preserve">            Ellipse.Fill = new SolidColorBrush(color);</w:t>
       </w:r>
       <w:r>
         <w:br/>
@@ -3988,6 +6565,7 @@
           <w:szCs w:val="28"/>
           <w:lang w:val="uk-UA"/>
         </w:rPr>
+        <w:lastRenderedPageBreak/>
         <w:t>OrbitRadius – радіус орбіти</w:t>
       </w:r>
     </w:p>
@@ -4191,7 +6769,6 @@
           <w:szCs w:val="28"/>
           <w:lang w:val="uk-UA"/>
         </w:rPr>
-        <w:lastRenderedPageBreak/>
         <w:t>Реалізовані три обробники подій:</w:t>
       </w:r>
     </w:p>
@@ -4300,945 +6877,6 @@
         <w:spacing w:line="240" w:lineRule="auto"/>
         <w:rPr>
           <w:rFonts w:ascii="Times New Roman" w:hAnsi="Times New Roman" w:cs="Times New Roman"/>
-          <w:noProof/>
-          <w:sz w:val="28"/>
-          <w:szCs w:val="28"/>
-          <w:lang w:val="uk-UA"/>
-        </w:rPr>
-      </w:pPr>
-      <w:r>
-        <w:rPr>
-          <w:rFonts w:ascii="Times New Roman" w:hAnsi="Times New Roman" w:cs="Times New Roman"/>
-          <w:noProof/>
-          <w:sz w:val="28"/>
-          <w:szCs w:val="28"/>
-          <w:lang w:val="uk-UA"/>
-        </w:rPr>
-        <w:t>Створено 6 кульок з такими параметрами:</w:t>
-      </w:r>
-    </w:p>
-    <w:p>
-      <w:pPr>
-        <w:spacing w:line="240" w:lineRule="auto"/>
-        <w:jc w:val="right"/>
-        <w:rPr>
-          <w:rFonts w:ascii="Times New Roman" w:hAnsi="Times New Roman" w:cs="Times New Roman"/>
-          <w:noProof/>
-          <w:sz w:val="28"/>
-          <w:szCs w:val="28"/>
-          <w:lang w:val="uk-UA"/>
-        </w:rPr>
-      </w:pPr>
-      <w:r>
-        <w:rPr>
-          <w:rFonts w:ascii="Times New Roman" w:hAnsi="Times New Roman" w:cs="Times New Roman"/>
-          <w:noProof/>
-          <w:sz w:val="28"/>
-          <w:szCs w:val="28"/>
-          <w:lang w:val="uk-UA"/>
-        </w:rPr>
-        <w:t>Таблиця 1. Параметри кульок</w:t>
-      </w:r>
-    </w:p>
-    <w:tbl>
-      <w:tblPr>
-        <w:tblW w:w="0" w:type="auto"/>
-        <w:jc w:val="center"/>
-        <w:tblCellSpacing w:w="15" w:type="dxa"/>
-        <w:tblBorders>
-          <w:top w:val="single" w:sz="4" w:space="0" w:color="auto"/>
-          <w:left w:val="single" w:sz="4" w:space="0" w:color="auto"/>
-          <w:bottom w:val="single" w:sz="4" w:space="0" w:color="auto"/>
-          <w:right w:val="single" w:sz="4" w:space="0" w:color="auto"/>
-          <w:insideH w:val="single" w:sz="6" w:space="0" w:color="auto"/>
-          <w:insideV w:val="single" w:sz="6" w:space="0" w:color="auto"/>
-        </w:tblBorders>
-        <w:tblLayout w:type="fixed"/>
-        <w:tblCellMar>
-          <w:top w:w="15" w:type="dxa"/>
-          <w:left w:w="15" w:type="dxa"/>
-          <w:bottom w:w="15" w:type="dxa"/>
-          <w:right w:w="15" w:type="dxa"/>
-        </w:tblCellMar>
-        <w:tblLook w:val="04A0" w:firstRow="1" w:lastRow="0" w:firstColumn="1" w:lastColumn="0" w:noHBand="0" w:noVBand="1"/>
-      </w:tblPr>
-      <w:tblGrid>
-        <w:gridCol w:w="1418"/>
-        <w:gridCol w:w="1843"/>
-        <w:gridCol w:w="1559"/>
-        <w:gridCol w:w="1559"/>
-      </w:tblGrid>
-      <w:tr>
-        <w:trPr>
-          <w:tblHeader/>
-          <w:tblCellSpacing w:w="15" w:type="dxa"/>
-          <w:jc w:val="center"/>
-        </w:trPr>
-        <w:tc>
-          <w:tcPr>
-            <w:tcW w:w="1373" w:type="dxa"/>
-            <w:vAlign w:val="center"/>
-            <w:hideMark/>
-          </w:tcPr>
-          <w:p>
-            <w:pPr>
-              <w:spacing w:line="240" w:lineRule="auto"/>
-              <w:rPr>
-                <w:rFonts w:ascii="Times New Roman" w:hAnsi="Times New Roman" w:cs="Times New Roman"/>
-                <w:noProof/>
-                <w:sz w:val="28"/>
-                <w:szCs w:val="28"/>
-                <w:lang w:val="uk-UA"/>
-              </w:rPr>
-            </w:pPr>
-            <w:r>
-              <w:rPr>
-                <w:rFonts w:ascii="Times New Roman" w:hAnsi="Times New Roman" w:cs="Times New Roman"/>
-                <w:noProof/>
-                <w:sz w:val="28"/>
-                <w:szCs w:val="28"/>
-                <w:lang w:val="uk-UA"/>
-              </w:rPr>
-              <w:t>Кулька</w:t>
-            </w:r>
-          </w:p>
-        </w:tc>
-        <w:tc>
-          <w:tcPr>
-            <w:tcW w:w="1813" w:type="dxa"/>
-            <w:vAlign w:val="center"/>
-            <w:hideMark/>
-          </w:tcPr>
-          <w:p>
-            <w:pPr>
-              <w:spacing w:line="240" w:lineRule="auto"/>
-              <w:rPr>
-                <w:rFonts w:ascii="Times New Roman" w:hAnsi="Times New Roman" w:cs="Times New Roman"/>
-                <w:noProof/>
-                <w:sz w:val="28"/>
-                <w:szCs w:val="28"/>
-                <w:lang w:val="uk-UA"/>
-              </w:rPr>
-            </w:pPr>
-            <w:r>
-              <w:rPr>
-                <w:rFonts w:ascii="Times New Roman" w:hAnsi="Times New Roman" w:cs="Times New Roman"/>
-                <w:noProof/>
-                <w:sz w:val="28"/>
-                <w:szCs w:val="28"/>
-                <w:lang w:val="uk-UA"/>
-              </w:rPr>
-              <w:t>Колір</w:t>
-            </w:r>
-          </w:p>
-        </w:tc>
-        <w:tc>
-          <w:tcPr>
-            <w:tcW w:w="1529" w:type="dxa"/>
-            <w:vAlign w:val="center"/>
-            <w:hideMark/>
-          </w:tcPr>
-          <w:p>
-            <w:pPr>
-              <w:spacing w:line="240" w:lineRule="auto"/>
-              <w:rPr>
-                <w:rFonts w:ascii="Times New Roman" w:hAnsi="Times New Roman" w:cs="Times New Roman"/>
-                <w:noProof/>
-                <w:sz w:val="28"/>
-                <w:szCs w:val="28"/>
-                <w:lang w:val="uk-UA"/>
-              </w:rPr>
-            </w:pPr>
-            <w:r>
-              <w:rPr>
-                <w:rFonts w:ascii="Times New Roman" w:hAnsi="Times New Roman" w:cs="Times New Roman"/>
-                <w:noProof/>
-                <w:sz w:val="28"/>
-                <w:szCs w:val="28"/>
-                <w:lang w:val="uk-UA"/>
-              </w:rPr>
-              <w:t>Радіус орбіти</w:t>
-            </w:r>
-          </w:p>
-        </w:tc>
-        <w:tc>
-          <w:tcPr>
-            <w:tcW w:w="1514" w:type="dxa"/>
-            <w:vAlign w:val="center"/>
-            <w:hideMark/>
-          </w:tcPr>
-          <w:p>
-            <w:pPr>
-              <w:spacing w:line="240" w:lineRule="auto"/>
-              <w:rPr>
-                <w:rFonts w:ascii="Times New Roman" w:hAnsi="Times New Roman" w:cs="Times New Roman"/>
-                <w:noProof/>
-                <w:sz w:val="28"/>
-                <w:szCs w:val="28"/>
-                <w:lang w:val="uk-UA"/>
-              </w:rPr>
-            </w:pPr>
-            <w:r>
-              <w:rPr>
-                <w:rFonts w:ascii="Times New Roman" w:hAnsi="Times New Roman" w:cs="Times New Roman"/>
-                <w:noProof/>
-                <w:sz w:val="28"/>
-                <w:szCs w:val="28"/>
-                <w:lang w:val="uk-UA"/>
-              </w:rPr>
-              <w:t>Швидкість</w:t>
-            </w:r>
-          </w:p>
-        </w:tc>
-      </w:tr>
-      <w:tr>
-        <w:trPr>
-          <w:tblCellSpacing w:w="15" w:type="dxa"/>
-          <w:jc w:val="center"/>
-        </w:trPr>
-        <w:tc>
-          <w:tcPr>
-            <w:tcW w:w="1373" w:type="dxa"/>
-            <w:vAlign w:val="center"/>
-            <w:hideMark/>
-          </w:tcPr>
-          <w:p>
-            <w:pPr>
-              <w:spacing w:line="240" w:lineRule="auto"/>
-              <w:rPr>
-                <w:rFonts w:ascii="Times New Roman" w:hAnsi="Times New Roman" w:cs="Times New Roman"/>
-                <w:noProof/>
-                <w:sz w:val="28"/>
-                <w:szCs w:val="28"/>
-                <w:lang w:val="uk-UA"/>
-              </w:rPr>
-            </w:pPr>
-            <w:r>
-              <w:rPr>
-                <w:rFonts w:ascii="Times New Roman" w:hAnsi="Times New Roman" w:cs="Times New Roman"/>
-                <w:noProof/>
-                <w:sz w:val="28"/>
-                <w:szCs w:val="28"/>
-                <w:lang w:val="uk-UA"/>
-              </w:rPr>
-              <w:t>1</w:t>
-            </w:r>
-          </w:p>
-        </w:tc>
-        <w:tc>
-          <w:tcPr>
-            <w:tcW w:w="1813" w:type="dxa"/>
-            <w:vAlign w:val="center"/>
-            <w:hideMark/>
-          </w:tcPr>
-          <w:p>
-            <w:pPr>
-              <w:spacing w:line="240" w:lineRule="auto"/>
-              <w:rPr>
-                <w:rFonts w:ascii="Times New Roman" w:hAnsi="Times New Roman" w:cs="Times New Roman"/>
-                <w:noProof/>
-                <w:sz w:val="28"/>
-                <w:szCs w:val="28"/>
-                <w:lang w:val="uk-UA"/>
-              </w:rPr>
-            </w:pPr>
-            <w:r>
-              <w:rPr>
-                <w:rFonts w:ascii="Times New Roman" w:hAnsi="Times New Roman" w:cs="Times New Roman"/>
-                <w:noProof/>
-                <w:sz w:val="28"/>
-                <w:szCs w:val="28"/>
-                <w:lang w:val="uk-UA"/>
-              </w:rPr>
-              <w:t>Червона</w:t>
-            </w:r>
-          </w:p>
-        </w:tc>
-        <w:tc>
-          <w:tcPr>
-            <w:tcW w:w="1529" w:type="dxa"/>
-            <w:vAlign w:val="center"/>
-            <w:hideMark/>
-          </w:tcPr>
-          <w:p>
-            <w:pPr>
-              <w:spacing w:line="240" w:lineRule="auto"/>
-              <w:rPr>
-                <w:rFonts w:ascii="Times New Roman" w:hAnsi="Times New Roman" w:cs="Times New Roman"/>
-                <w:noProof/>
-                <w:sz w:val="28"/>
-                <w:szCs w:val="28"/>
-                <w:lang w:val="uk-UA"/>
-              </w:rPr>
-            </w:pPr>
-            <w:r>
-              <w:rPr>
-                <w:rFonts w:ascii="Times New Roman" w:hAnsi="Times New Roman" w:cs="Times New Roman"/>
-                <w:noProof/>
-                <w:sz w:val="28"/>
-                <w:szCs w:val="28"/>
-                <w:lang w:val="uk-UA"/>
-              </w:rPr>
-              <w:t>300</w:t>
-            </w:r>
-          </w:p>
-        </w:tc>
-        <w:tc>
-          <w:tcPr>
-            <w:tcW w:w="1514" w:type="dxa"/>
-            <w:vAlign w:val="center"/>
-            <w:hideMark/>
-          </w:tcPr>
-          <w:p>
-            <w:pPr>
-              <w:spacing w:line="240" w:lineRule="auto"/>
-              <w:rPr>
-                <w:rFonts w:ascii="Times New Roman" w:hAnsi="Times New Roman" w:cs="Times New Roman"/>
-                <w:noProof/>
-                <w:sz w:val="28"/>
-                <w:szCs w:val="28"/>
-                <w:lang w:val="uk-UA"/>
-              </w:rPr>
-            </w:pPr>
-            <w:r>
-              <w:rPr>
-                <w:rFonts w:ascii="Times New Roman" w:hAnsi="Times New Roman" w:cs="Times New Roman"/>
-                <w:noProof/>
-                <w:sz w:val="28"/>
-                <w:szCs w:val="28"/>
-                <w:lang w:val="uk-UA"/>
-              </w:rPr>
-              <w:t>0.015</w:t>
-            </w:r>
-          </w:p>
-        </w:tc>
-      </w:tr>
-      <w:tr>
-        <w:trPr>
-          <w:tblCellSpacing w:w="15" w:type="dxa"/>
-          <w:jc w:val="center"/>
-        </w:trPr>
-        <w:tc>
-          <w:tcPr>
-            <w:tcW w:w="1373" w:type="dxa"/>
-            <w:vAlign w:val="center"/>
-            <w:hideMark/>
-          </w:tcPr>
-          <w:p>
-            <w:pPr>
-              <w:spacing w:line="240" w:lineRule="auto"/>
-              <w:rPr>
-                <w:rFonts w:ascii="Times New Roman" w:hAnsi="Times New Roman" w:cs="Times New Roman"/>
-                <w:noProof/>
-                <w:sz w:val="28"/>
-                <w:szCs w:val="28"/>
-                <w:lang w:val="uk-UA"/>
-              </w:rPr>
-            </w:pPr>
-            <w:r>
-              <w:rPr>
-                <w:rFonts w:ascii="Times New Roman" w:hAnsi="Times New Roman" w:cs="Times New Roman"/>
-                <w:noProof/>
-                <w:sz w:val="28"/>
-                <w:szCs w:val="28"/>
-                <w:lang w:val="uk-UA"/>
-              </w:rPr>
-              <w:t>2</w:t>
-            </w:r>
-          </w:p>
-        </w:tc>
-        <w:tc>
-          <w:tcPr>
-            <w:tcW w:w="1813" w:type="dxa"/>
-            <w:vAlign w:val="center"/>
-            <w:hideMark/>
-          </w:tcPr>
-          <w:p>
-            <w:pPr>
-              <w:spacing w:line="240" w:lineRule="auto"/>
-              <w:rPr>
-                <w:rFonts w:ascii="Times New Roman" w:hAnsi="Times New Roman" w:cs="Times New Roman"/>
-                <w:noProof/>
-                <w:sz w:val="28"/>
-                <w:szCs w:val="28"/>
-                <w:lang w:val="uk-UA"/>
-              </w:rPr>
-            </w:pPr>
-            <w:r>
-              <w:rPr>
-                <w:rFonts w:ascii="Times New Roman" w:hAnsi="Times New Roman" w:cs="Times New Roman"/>
-                <w:noProof/>
-                <w:sz w:val="28"/>
-                <w:szCs w:val="28"/>
-                <w:lang w:val="uk-UA"/>
-              </w:rPr>
-              <w:t>Синя</w:t>
-            </w:r>
-          </w:p>
-        </w:tc>
-        <w:tc>
-          <w:tcPr>
-            <w:tcW w:w="1529" w:type="dxa"/>
-            <w:vAlign w:val="center"/>
-            <w:hideMark/>
-          </w:tcPr>
-          <w:p>
-            <w:pPr>
-              <w:spacing w:line="240" w:lineRule="auto"/>
-              <w:rPr>
-                <w:rFonts w:ascii="Times New Roman" w:hAnsi="Times New Roman" w:cs="Times New Roman"/>
-                <w:noProof/>
-                <w:sz w:val="28"/>
-                <w:szCs w:val="28"/>
-                <w:lang w:val="uk-UA"/>
-              </w:rPr>
-            </w:pPr>
-            <w:r>
-              <w:rPr>
-                <w:rFonts w:ascii="Times New Roman" w:hAnsi="Times New Roman" w:cs="Times New Roman"/>
-                <w:noProof/>
-                <w:sz w:val="28"/>
-                <w:szCs w:val="28"/>
-                <w:lang w:val="uk-UA"/>
-              </w:rPr>
-              <w:t>350</w:t>
-            </w:r>
-          </w:p>
-        </w:tc>
-        <w:tc>
-          <w:tcPr>
-            <w:tcW w:w="1514" w:type="dxa"/>
-            <w:vAlign w:val="center"/>
-            <w:hideMark/>
-          </w:tcPr>
-          <w:p>
-            <w:pPr>
-              <w:spacing w:line="240" w:lineRule="auto"/>
-              <w:rPr>
-                <w:rFonts w:ascii="Times New Roman" w:hAnsi="Times New Roman" w:cs="Times New Roman"/>
-                <w:noProof/>
-                <w:sz w:val="28"/>
-                <w:szCs w:val="28"/>
-                <w:lang w:val="uk-UA"/>
-              </w:rPr>
-            </w:pPr>
-            <w:r>
-              <w:rPr>
-                <w:rFonts w:ascii="Times New Roman" w:hAnsi="Times New Roman" w:cs="Times New Roman"/>
-                <w:noProof/>
-                <w:sz w:val="28"/>
-                <w:szCs w:val="28"/>
-                <w:lang w:val="uk-UA"/>
-              </w:rPr>
-              <w:t>0.02</w:t>
-            </w:r>
-          </w:p>
-        </w:tc>
-      </w:tr>
-      <w:tr>
-        <w:trPr>
-          <w:tblCellSpacing w:w="15" w:type="dxa"/>
-          <w:jc w:val="center"/>
-        </w:trPr>
-        <w:tc>
-          <w:tcPr>
-            <w:tcW w:w="1373" w:type="dxa"/>
-            <w:vAlign w:val="center"/>
-            <w:hideMark/>
-          </w:tcPr>
-          <w:p>
-            <w:pPr>
-              <w:spacing w:line="240" w:lineRule="auto"/>
-              <w:rPr>
-                <w:rFonts w:ascii="Times New Roman" w:hAnsi="Times New Roman" w:cs="Times New Roman"/>
-                <w:noProof/>
-                <w:sz w:val="28"/>
-                <w:szCs w:val="28"/>
-                <w:lang w:val="uk-UA"/>
-              </w:rPr>
-            </w:pPr>
-            <w:r>
-              <w:rPr>
-                <w:rFonts w:ascii="Times New Roman" w:hAnsi="Times New Roman" w:cs="Times New Roman"/>
-                <w:noProof/>
-                <w:sz w:val="28"/>
-                <w:szCs w:val="28"/>
-                <w:lang w:val="uk-UA"/>
-              </w:rPr>
-              <w:t>3</w:t>
-            </w:r>
-          </w:p>
-        </w:tc>
-        <w:tc>
-          <w:tcPr>
-            <w:tcW w:w="1813" w:type="dxa"/>
-            <w:vAlign w:val="center"/>
-            <w:hideMark/>
-          </w:tcPr>
-          <w:p>
-            <w:pPr>
-              <w:spacing w:line="240" w:lineRule="auto"/>
-              <w:rPr>
-                <w:rFonts w:ascii="Times New Roman" w:hAnsi="Times New Roman" w:cs="Times New Roman"/>
-                <w:noProof/>
-                <w:sz w:val="28"/>
-                <w:szCs w:val="28"/>
-                <w:lang w:val="uk-UA"/>
-              </w:rPr>
-            </w:pPr>
-            <w:r>
-              <w:rPr>
-                <w:rFonts w:ascii="Times New Roman" w:hAnsi="Times New Roman" w:cs="Times New Roman"/>
-                <w:noProof/>
-                <w:sz w:val="28"/>
-                <w:szCs w:val="28"/>
-                <w:lang w:val="uk-UA"/>
-              </w:rPr>
-              <w:t>Зелена</w:t>
-            </w:r>
-          </w:p>
-        </w:tc>
-        <w:tc>
-          <w:tcPr>
-            <w:tcW w:w="1529" w:type="dxa"/>
-            <w:vAlign w:val="center"/>
-            <w:hideMark/>
-          </w:tcPr>
-          <w:p>
-            <w:pPr>
-              <w:spacing w:line="240" w:lineRule="auto"/>
-              <w:rPr>
-                <w:rFonts w:ascii="Times New Roman" w:hAnsi="Times New Roman" w:cs="Times New Roman"/>
-                <w:noProof/>
-                <w:sz w:val="28"/>
-                <w:szCs w:val="28"/>
-                <w:lang w:val="uk-UA"/>
-              </w:rPr>
-            </w:pPr>
-            <w:r>
-              <w:rPr>
-                <w:rFonts w:ascii="Times New Roman" w:hAnsi="Times New Roman" w:cs="Times New Roman"/>
-                <w:noProof/>
-                <w:sz w:val="28"/>
-                <w:szCs w:val="28"/>
-                <w:lang w:val="uk-UA"/>
-              </w:rPr>
-              <w:t>250</w:t>
-            </w:r>
-          </w:p>
-        </w:tc>
-        <w:tc>
-          <w:tcPr>
-            <w:tcW w:w="1514" w:type="dxa"/>
-            <w:vAlign w:val="center"/>
-            <w:hideMark/>
-          </w:tcPr>
-          <w:p>
-            <w:pPr>
-              <w:spacing w:line="240" w:lineRule="auto"/>
-              <w:rPr>
-                <w:rFonts w:ascii="Times New Roman" w:hAnsi="Times New Roman" w:cs="Times New Roman"/>
-                <w:noProof/>
-                <w:sz w:val="28"/>
-                <w:szCs w:val="28"/>
-                <w:lang w:val="uk-UA"/>
-              </w:rPr>
-            </w:pPr>
-            <w:r>
-              <w:rPr>
-                <w:rFonts w:ascii="Times New Roman" w:hAnsi="Times New Roman" w:cs="Times New Roman"/>
-                <w:noProof/>
-                <w:sz w:val="28"/>
-                <w:szCs w:val="28"/>
-                <w:lang w:val="uk-UA"/>
-              </w:rPr>
-              <w:t>0.012</w:t>
-            </w:r>
-          </w:p>
-        </w:tc>
-      </w:tr>
-      <w:tr>
-        <w:trPr>
-          <w:tblCellSpacing w:w="15" w:type="dxa"/>
-          <w:jc w:val="center"/>
-        </w:trPr>
-        <w:tc>
-          <w:tcPr>
-            <w:tcW w:w="1373" w:type="dxa"/>
-            <w:vAlign w:val="center"/>
-            <w:hideMark/>
-          </w:tcPr>
-          <w:p>
-            <w:pPr>
-              <w:spacing w:line="240" w:lineRule="auto"/>
-              <w:rPr>
-                <w:rFonts w:ascii="Times New Roman" w:hAnsi="Times New Roman" w:cs="Times New Roman"/>
-                <w:noProof/>
-                <w:sz w:val="28"/>
-                <w:szCs w:val="28"/>
-                <w:lang w:val="uk-UA"/>
-              </w:rPr>
-            </w:pPr>
-            <w:r>
-              <w:rPr>
-                <w:rFonts w:ascii="Times New Roman" w:hAnsi="Times New Roman" w:cs="Times New Roman"/>
-                <w:noProof/>
-                <w:sz w:val="28"/>
-                <w:szCs w:val="28"/>
-                <w:lang w:val="uk-UA"/>
-              </w:rPr>
-              <w:t>4</w:t>
-            </w:r>
-          </w:p>
-        </w:tc>
-        <w:tc>
-          <w:tcPr>
-            <w:tcW w:w="1813" w:type="dxa"/>
-            <w:vAlign w:val="center"/>
-            <w:hideMark/>
-          </w:tcPr>
-          <w:p>
-            <w:pPr>
-              <w:spacing w:line="240" w:lineRule="auto"/>
-              <w:rPr>
-                <w:rFonts w:ascii="Times New Roman" w:hAnsi="Times New Roman" w:cs="Times New Roman"/>
-                <w:noProof/>
-                <w:sz w:val="28"/>
-                <w:szCs w:val="28"/>
-                <w:lang w:val="uk-UA"/>
-              </w:rPr>
-            </w:pPr>
-            <w:r>
-              <w:rPr>
-                <w:rFonts w:ascii="Times New Roman" w:hAnsi="Times New Roman" w:cs="Times New Roman"/>
-                <w:noProof/>
-                <w:sz w:val="28"/>
-                <w:szCs w:val="28"/>
-                <w:lang w:val="uk-UA"/>
-              </w:rPr>
-              <w:t>Жовта</w:t>
-            </w:r>
-          </w:p>
-        </w:tc>
-        <w:tc>
-          <w:tcPr>
-            <w:tcW w:w="1529" w:type="dxa"/>
-            <w:vAlign w:val="center"/>
-            <w:hideMark/>
-          </w:tcPr>
-          <w:p>
-            <w:pPr>
-              <w:spacing w:line="240" w:lineRule="auto"/>
-              <w:rPr>
-                <w:rFonts w:ascii="Times New Roman" w:hAnsi="Times New Roman" w:cs="Times New Roman"/>
-                <w:noProof/>
-                <w:sz w:val="28"/>
-                <w:szCs w:val="28"/>
-                <w:lang w:val="uk-UA"/>
-              </w:rPr>
-            </w:pPr>
-            <w:r>
-              <w:rPr>
-                <w:rFonts w:ascii="Times New Roman" w:hAnsi="Times New Roman" w:cs="Times New Roman"/>
-                <w:noProof/>
-                <w:sz w:val="28"/>
-                <w:szCs w:val="28"/>
-                <w:lang w:val="uk-UA"/>
-              </w:rPr>
-              <w:t>320</w:t>
-            </w:r>
-          </w:p>
-        </w:tc>
-        <w:tc>
-          <w:tcPr>
-            <w:tcW w:w="1514" w:type="dxa"/>
-            <w:vAlign w:val="center"/>
-            <w:hideMark/>
-          </w:tcPr>
-          <w:p>
-            <w:pPr>
-              <w:spacing w:line="240" w:lineRule="auto"/>
-              <w:rPr>
-                <w:rFonts w:ascii="Times New Roman" w:hAnsi="Times New Roman" w:cs="Times New Roman"/>
-                <w:noProof/>
-                <w:sz w:val="28"/>
-                <w:szCs w:val="28"/>
-                <w:lang w:val="uk-UA"/>
-              </w:rPr>
-            </w:pPr>
-            <w:r>
-              <w:rPr>
-                <w:rFonts w:ascii="Times New Roman" w:hAnsi="Times New Roman" w:cs="Times New Roman"/>
-                <w:noProof/>
-                <w:sz w:val="28"/>
-                <w:szCs w:val="28"/>
-                <w:lang w:val="uk-UA"/>
-              </w:rPr>
-              <w:t>0.018</w:t>
-            </w:r>
-          </w:p>
-        </w:tc>
-      </w:tr>
-      <w:tr>
-        <w:trPr>
-          <w:tblCellSpacing w:w="15" w:type="dxa"/>
-          <w:jc w:val="center"/>
-        </w:trPr>
-        <w:tc>
-          <w:tcPr>
-            <w:tcW w:w="1373" w:type="dxa"/>
-            <w:vAlign w:val="center"/>
-            <w:hideMark/>
-          </w:tcPr>
-          <w:p>
-            <w:pPr>
-              <w:spacing w:line="240" w:lineRule="auto"/>
-              <w:rPr>
-                <w:rFonts w:ascii="Times New Roman" w:hAnsi="Times New Roman" w:cs="Times New Roman"/>
-                <w:noProof/>
-                <w:sz w:val="28"/>
-                <w:szCs w:val="28"/>
-                <w:lang w:val="uk-UA"/>
-              </w:rPr>
-            </w:pPr>
-            <w:r>
-              <w:rPr>
-                <w:rFonts w:ascii="Times New Roman" w:hAnsi="Times New Roman" w:cs="Times New Roman"/>
-                <w:noProof/>
-                <w:sz w:val="28"/>
-                <w:szCs w:val="28"/>
-                <w:lang w:val="uk-UA"/>
-              </w:rPr>
-              <w:t>5</w:t>
-            </w:r>
-          </w:p>
-        </w:tc>
-        <w:tc>
-          <w:tcPr>
-            <w:tcW w:w="1813" w:type="dxa"/>
-            <w:vAlign w:val="center"/>
-            <w:hideMark/>
-          </w:tcPr>
-          <w:p>
-            <w:pPr>
-              <w:spacing w:line="240" w:lineRule="auto"/>
-              <w:rPr>
-                <w:rFonts w:ascii="Times New Roman" w:hAnsi="Times New Roman" w:cs="Times New Roman"/>
-                <w:noProof/>
-                <w:sz w:val="28"/>
-                <w:szCs w:val="28"/>
-                <w:lang w:val="uk-UA"/>
-              </w:rPr>
-            </w:pPr>
-            <w:r>
-              <w:rPr>
-                <w:rFonts w:ascii="Times New Roman" w:hAnsi="Times New Roman" w:cs="Times New Roman"/>
-                <w:noProof/>
-                <w:sz w:val="28"/>
-                <w:szCs w:val="28"/>
-                <w:lang w:val="uk-UA"/>
-              </w:rPr>
-              <w:t>Фіолетова</w:t>
-            </w:r>
-          </w:p>
-        </w:tc>
-        <w:tc>
-          <w:tcPr>
-            <w:tcW w:w="1529" w:type="dxa"/>
-            <w:vAlign w:val="center"/>
-            <w:hideMark/>
-          </w:tcPr>
-          <w:p>
-            <w:pPr>
-              <w:spacing w:line="240" w:lineRule="auto"/>
-              <w:rPr>
-                <w:rFonts w:ascii="Times New Roman" w:hAnsi="Times New Roman" w:cs="Times New Roman"/>
-                <w:noProof/>
-                <w:sz w:val="28"/>
-                <w:szCs w:val="28"/>
-                <w:lang w:val="uk-UA"/>
-              </w:rPr>
-            </w:pPr>
-            <w:r>
-              <w:rPr>
-                <w:rFonts w:ascii="Times New Roman" w:hAnsi="Times New Roman" w:cs="Times New Roman"/>
-                <w:noProof/>
-                <w:sz w:val="28"/>
-                <w:szCs w:val="28"/>
-                <w:lang w:val="uk-UA"/>
-              </w:rPr>
-              <w:t>280</w:t>
-            </w:r>
-          </w:p>
-        </w:tc>
-        <w:tc>
-          <w:tcPr>
-            <w:tcW w:w="1514" w:type="dxa"/>
-            <w:vAlign w:val="center"/>
-            <w:hideMark/>
-          </w:tcPr>
-          <w:p>
-            <w:pPr>
-              <w:spacing w:line="240" w:lineRule="auto"/>
-              <w:rPr>
-                <w:rFonts w:ascii="Times New Roman" w:hAnsi="Times New Roman" w:cs="Times New Roman"/>
-                <w:noProof/>
-                <w:sz w:val="28"/>
-                <w:szCs w:val="28"/>
-                <w:lang w:val="uk-UA"/>
-              </w:rPr>
-            </w:pPr>
-            <w:r>
-              <w:rPr>
-                <w:rFonts w:ascii="Times New Roman" w:hAnsi="Times New Roman" w:cs="Times New Roman"/>
-                <w:noProof/>
-                <w:sz w:val="28"/>
-                <w:szCs w:val="28"/>
-                <w:lang w:val="uk-UA"/>
-              </w:rPr>
-              <w:t>0.016</w:t>
-            </w:r>
-          </w:p>
-        </w:tc>
-      </w:tr>
-      <w:tr>
-        <w:trPr>
-          <w:tblCellSpacing w:w="15" w:type="dxa"/>
-          <w:jc w:val="center"/>
-        </w:trPr>
-        <w:tc>
-          <w:tcPr>
-            <w:tcW w:w="1373" w:type="dxa"/>
-            <w:vAlign w:val="center"/>
-            <w:hideMark/>
-          </w:tcPr>
-          <w:p>
-            <w:pPr>
-              <w:spacing w:line="240" w:lineRule="auto"/>
-              <w:rPr>
-                <w:rFonts w:ascii="Times New Roman" w:hAnsi="Times New Roman" w:cs="Times New Roman"/>
-                <w:noProof/>
-                <w:sz w:val="28"/>
-                <w:szCs w:val="28"/>
-                <w:lang w:val="uk-UA"/>
-              </w:rPr>
-            </w:pPr>
-            <w:r>
-              <w:rPr>
-                <w:rFonts w:ascii="Times New Roman" w:hAnsi="Times New Roman" w:cs="Times New Roman"/>
-                <w:noProof/>
-                <w:sz w:val="28"/>
-                <w:szCs w:val="28"/>
-                <w:lang w:val="uk-UA"/>
-              </w:rPr>
-              <w:t>6</w:t>
-            </w:r>
-          </w:p>
-        </w:tc>
-        <w:tc>
-          <w:tcPr>
-            <w:tcW w:w="1813" w:type="dxa"/>
-            <w:vAlign w:val="center"/>
-            <w:hideMark/>
-          </w:tcPr>
-          <w:p>
-            <w:pPr>
-              <w:spacing w:line="240" w:lineRule="auto"/>
-              <w:rPr>
-                <w:rFonts w:ascii="Times New Roman" w:hAnsi="Times New Roman" w:cs="Times New Roman"/>
-                <w:noProof/>
-                <w:sz w:val="28"/>
-                <w:szCs w:val="28"/>
-                <w:lang w:val="uk-UA"/>
-              </w:rPr>
-            </w:pPr>
-            <w:r>
-              <w:rPr>
-                <w:rFonts w:ascii="Times New Roman" w:hAnsi="Times New Roman" w:cs="Times New Roman"/>
-                <w:noProof/>
-                <w:sz w:val="28"/>
-                <w:szCs w:val="28"/>
-                <w:lang w:val="uk-UA"/>
-              </w:rPr>
-              <w:t>Г</w:t>
-            </w:r>
-            <w:r>
-              <w:rPr>
-                <w:rFonts w:ascii="Times New Roman" w:hAnsi="Times New Roman" w:cs="Times New Roman"/>
-                <w:noProof/>
-                <w:sz w:val="28"/>
-                <w:szCs w:val="28"/>
-                <w:lang w:val="uk-UA"/>
-              </w:rPr>
-              <w:t>олуба</w:t>
-            </w:r>
-          </w:p>
-        </w:tc>
-        <w:tc>
-          <w:tcPr>
-            <w:tcW w:w="1529" w:type="dxa"/>
-            <w:vAlign w:val="center"/>
-            <w:hideMark/>
-          </w:tcPr>
-          <w:p>
-            <w:pPr>
-              <w:spacing w:line="240" w:lineRule="auto"/>
-              <w:rPr>
-                <w:rFonts w:ascii="Times New Roman" w:hAnsi="Times New Roman" w:cs="Times New Roman"/>
-                <w:noProof/>
-                <w:sz w:val="28"/>
-                <w:szCs w:val="28"/>
-                <w:lang w:val="uk-UA"/>
-              </w:rPr>
-            </w:pPr>
-            <w:r>
-              <w:rPr>
-                <w:rFonts w:ascii="Times New Roman" w:hAnsi="Times New Roman" w:cs="Times New Roman"/>
-                <w:noProof/>
-                <w:sz w:val="28"/>
-                <w:szCs w:val="28"/>
-                <w:lang w:val="uk-UA"/>
-              </w:rPr>
-              <w:t>310</w:t>
-            </w:r>
-          </w:p>
-        </w:tc>
-        <w:tc>
-          <w:tcPr>
-            <w:tcW w:w="1514" w:type="dxa"/>
-            <w:vAlign w:val="center"/>
-            <w:hideMark/>
-          </w:tcPr>
-          <w:p>
-            <w:pPr>
-              <w:spacing w:line="240" w:lineRule="auto"/>
-              <w:rPr>
-                <w:rFonts w:ascii="Times New Roman" w:hAnsi="Times New Roman" w:cs="Times New Roman"/>
-                <w:noProof/>
-                <w:sz w:val="28"/>
-                <w:szCs w:val="28"/>
-                <w:lang w:val="uk-UA"/>
-              </w:rPr>
-            </w:pPr>
-            <w:r>
-              <w:rPr>
-                <w:rFonts w:ascii="Times New Roman" w:hAnsi="Times New Roman" w:cs="Times New Roman"/>
-                <w:noProof/>
-                <w:sz w:val="28"/>
-                <w:szCs w:val="28"/>
-                <w:lang w:val="uk-UA"/>
-              </w:rPr>
-              <w:t>0.014</w:t>
-            </w:r>
-          </w:p>
-        </w:tc>
-      </w:tr>
-    </w:tbl>
-    <w:p>
-      <w:pPr>
-        <w:spacing w:line="240" w:lineRule="auto"/>
-        <w:rPr>
-          <w:rFonts w:ascii="Times New Roman" w:hAnsi="Times New Roman" w:cs="Times New Roman"/>
           <w:b/>
           <w:bCs/>
           <w:noProof/>
@@ -5247,6 +6885,35 @@
           <w:lang w:val="uk-UA"/>
         </w:rPr>
       </w:pPr>
+      <w:r>
+        <w:rPr>
+          <w:rFonts w:ascii="Times New Roman" w:hAnsi="Times New Roman" w:cs="Times New Roman"/>
+          <w:noProof/>
+          <w:sz w:val="28"/>
+          <w:szCs w:val="28"/>
+          <w:lang w:val="uk-UA"/>
+        </w:rPr>
+        <w:t>Створено 6 кульок</w:t>
+      </w:r>
+      <w:r>
+        <w:rPr>
+          <w:rFonts w:ascii="Times New Roman" w:hAnsi="Times New Roman" w:cs="Times New Roman"/>
+          <w:noProof/>
+          <w:sz w:val="28"/>
+          <w:szCs w:val="28"/>
+        </w:rPr>
+        <w:t xml:space="preserve"> </w:t>
+      </w:r>
+      <w:r>
+        <w:rPr>
+          <w:rFonts w:ascii="Times New Roman" w:hAnsi="Times New Roman" w:cs="Times New Roman"/>
+          <w:noProof/>
+          <w:sz w:val="28"/>
+          <w:szCs w:val="28"/>
+          <w:lang w:val="uk-UA"/>
+        </w:rPr>
+        <w:t>з різними кольорами та швидкостями.</w:t>
+      </w:r>
     </w:p>
     <w:p>
       <w:pPr>
@@ -5629,6 +7296,7 @@
       </w:pPr>
       <w:r>
         <w:rPr>
+          <w:noProof/>
           <w:lang w:val="uk-UA"/>
         </w:rPr>
         <w:lastRenderedPageBreak/>
@@ -5711,6 +7379,7 @@
       <w:r>
         <w:rPr>
           <w:rFonts w:ascii="Times New Roman" w:hAnsi="Times New Roman" w:cs="Times New Roman"/>
+          <w:noProof/>
           <w:sz w:val="28"/>
           <w:szCs w:val="28"/>
           <w:lang w:val="uk-UA"/>
@@ -5785,6 +7454,7 @@
       <w:r>
         <w:rPr>
           <w:rFonts w:ascii="Times New Roman" w:hAnsi="Times New Roman" w:cs="Times New Roman"/>
+          <w:noProof/>
           <w:sz w:val="28"/>
           <w:szCs w:val="28"/>
           <w:lang w:val="uk-UA"/>

</xml_diff>